<commit_message>
Updated plates for GPS and V4.0.9 boards
</commit_message>
<xml_diff>
--- a/Misc documents  and software/thanks for buying Zen rob.docx
+++ b/Misc documents  and software/thanks for buying Zen rob.docx
@@ -4,7 +4,7 @@
   <w:body>
     <w:p>
       <w:pPr>
-        <w:pStyle w:val="660"/>
+        <w:pStyle w:val="706"/>
         <w:pBdr/>
         <w:bidi w:val="false"/>
         <w:spacing/>
@@ -15,6 +15,12 @@
           <w:szCs w:val="12"/>
         </w:rPr>
       </w:pPr>
+      <w:r>
+        <w:rPr>
+          <w:sz w:val="12"/>
+          <w:szCs w:val="12"/>
+        </w:rPr>
+      </w:r>
       <w:r>
         <w:rPr>
           <w:sz w:val="12"/>
@@ -30,7 +36,7 @@
     </w:p>
     <w:p>
       <w:pPr>
-        <w:pStyle w:val="660"/>
+        <w:pStyle w:val="706"/>
         <w:pBdr/>
         <w:bidi w:val="false"/>
         <w:spacing/>
@@ -75,7 +81,7 @@
                       </pic:nvPicPr>
                       <pic:blipFill>
                         <a:blip r:embed="rId8"/>
-                        <a:srcRect l="0" t="0" r="0" b="2106"/>
+                        <a:srcRect l="0" t="0" r="0" b="2105"/>
                         <a:stretch/>
                       </pic:blipFill>
                       <pic:spPr bwMode="auto">
@@ -141,10 +147,19 @@
           <w:szCs w:val="15"/>
         </w:rPr>
       </w:r>
+      <w:r>
+        <w:rPr>
+          <w:rFonts w:ascii="Liberation Sans" w:hAnsi="Liberation Sans"/>
+          <w:b/>
+          <w:bCs/>
+          <w:sz w:val="15"/>
+          <w:szCs w:val="15"/>
+        </w:rPr>
+      </w:r>
     </w:p>
     <w:p>
       <w:pPr>
-        <w:pStyle w:val="660"/>
+        <w:pStyle w:val="706"/>
         <w:pBdr/>
         <w:bidi w:val="false"/>
         <w:spacing/>
@@ -177,10 +192,19 @@
           <w:szCs w:val="15"/>
         </w:rPr>
       </w:r>
+      <w:r>
+        <w:rPr>
+          <w:rFonts w:ascii="Liberation Sans" w:hAnsi="Liberation Sans"/>
+          <w:b/>
+          <w:bCs/>
+          <w:sz w:val="15"/>
+          <w:szCs w:val="15"/>
+        </w:rPr>
+      </w:r>
     </w:p>
     <w:p>
       <w:pPr>
-        <w:pStyle w:val="660"/>
+        <w:pStyle w:val="706"/>
         <w:pBdr/>
         <w:bidi w:val="false"/>
         <w:spacing/>
@@ -194,6 +218,15 @@
           <w:szCs w:val="4"/>
         </w:rPr>
       </w:pPr>
+      <w:r>
+        <w:rPr>
+          <w:rFonts w:ascii="Liberation Sans" w:hAnsi="Liberation Sans"/>
+          <w:b w:val="0"/>
+          <w:bCs w:val="0"/>
+          <w:sz w:val="4"/>
+          <w:szCs w:val="4"/>
+        </w:rPr>
+      </w:r>
       <w:r>
         <w:rPr>
           <w:rFonts w:ascii="Liberation Sans" w:hAnsi="Liberation Sans"/>
@@ -215,7 +248,7 @@
     </w:p>
     <w:p>
       <w:pPr>
-        <w:pStyle w:val="660"/>
+        <w:pStyle w:val="706"/>
         <w:pBdr/>
         <w:bidi w:val="false"/>
         <w:spacing/>
@@ -248,10 +281,19 @@
           <w:szCs w:val="15"/>
         </w:rPr>
       </w:r>
+      <w:r>
+        <w:rPr>
+          <w:rFonts w:ascii="Liberation Sans" w:hAnsi="Liberation Sans"/>
+          <w:b w:val="0"/>
+          <w:bCs w:val="0"/>
+          <w:sz w:val="15"/>
+          <w:szCs w:val="15"/>
+        </w:rPr>
+      </w:r>
     </w:p>
     <w:p>
       <w:pPr>
-        <w:pStyle w:val="660"/>
+        <w:pStyle w:val="706"/>
         <w:widowControl w:val="true"/>
         <w:pBdr/>
         <w:bidi w:val="false"/>
@@ -285,10 +327,19 @@
           <w:szCs w:val="15"/>
         </w:rPr>
       </w:r>
+      <w:r>
+        <w:rPr>
+          <w:rFonts w:ascii="Liberation Sans" w:hAnsi="Liberation Sans"/>
+          <w:b w:val="0"/>
+          <w:bCs w:val="0"/>
+          <w:sz w:val="15"/>
+          <w:szCs w:val="15"/>
+        </w:rPr>
+      </w:r>
     </w:p>
     <w:p>
       <w:pPr>
-        <w:pStyle w:val="660"/>
+        <w:pStyle w:val="706"/>
         <w:widowControl w:val="true"/>
         <w:pBdr/>
         <w:bidi w:val="false"/>
@@ -321,7 +372,7 @@
           <w:sz w:val="15"/>
           <w:szCs w:val="15"/>
         </w:rPr>
-        <w:t xml:space="preserve">10</w:t>
+        <w:t xml:space="preserve">11-22</w:t>
       </w:r>
       <w:r>
         <w:rPr>
@@ -331,17 +382,6 @@
           <w:sz w:val="15"/>
           <w:szCs w:val="15"/>
         </w:rPr>
-        <w:t xml:space="preserve">-</w:t>
-      </w:r>
-      <w:r>
-        <w:rPr>
-          <w:rFonts w:ascii="Liberation Sans" w:hAnsi="Liberation Sans"/>
-          <w:b w:val="0"/>
-          <w:bCs w:val="0"/>
-          <w:sz w:val="15"/>
-          <w:szCs w:val="15"/>
-        </w:rPr>
-        <w:t xml:space="preserve">28</w:t>
       </w:r>
       <w:r>
         <w:rPr>
@@ -375,7 +415,6 @@
         <w:ind/>
         <w:rPr/>
       </w:pPr>
-      <w:r/>
       <w:r>
         <w:separator/>
       </w:r>
@@ -390,7 +429,6 @@
         <w:ind/>
         <w:rPr/>
       </w:pPr>
-      <w:r/>
       <w:r>
         <w:continuationSeparator/>
       </w:r>
@@ -410,7 +448,6 @@
         <w:ind/>
         <w:rPr/>
       </w:pPr>
-      <w:r/>
       <w:r>
         <w:separator/>
       </w:r>
@@ -425,7 +462,6 @@
         <w:ind/>
         <w:rPr/>
       </w:pPr>
-      <w:r/>
       <w:r>
         <w:continuationSeparator/>
       </w:r>
@@ -593,10 +629,10 @@
     <w:lsdException w:name="Bibliography" w:uiPriority="37"/>
     <w:lsdException w:name="TOC Heading" w:uiPriority="39" w:qFormat="1"/>
   </w:latentStyles>
-  <w:style w:type="paragraph" w:styleId="188">
+  <w:style w:type="paragraph" w:styleId="697">
     <w:name w:val="toc 1"/>
-    <w:basedOn w:val="660"/>
-    <w:next w:val="660"/>
+    <w:basedOn w:val="706"/>
+    <w:next w:val="706"/>
     <w:uiPriority w:val="39"/>
     <w:unhideWhenUsed/>
     <w:pPr>
@@ -605,10 +641,10 @@
       <w:ind/>
     </w:pPr>
   </w:style>
-  <w:style w:type="paragraph" w:styleId="189">
+  <w:style w:type="paragraph" w:styleId="698">
     <w:name w:val="toc 2"/>
-    <w:basedOn w:val="660"/>
-    <w:next w:val="660"/>
+    <w:basedOn w:val="706"/>
+    <w:next w:val="706"/>
     <w:uiPriority w:val="39"/>
     <w:unhideWhenUsed/>
     <w:pPr>
@@ -617,10 +653,10 @@
       <w:ind w:left="220"/>
     </w:pPr>
   </w:style>
-  <w:style w:type="paragraph" w:styleId="190">
+  <w:style w:type="paragraph" w:styleId="699">
     <w:name w:val="toc 3"/>
-    <w:basedOn w:val="660"/>
-    <w:next w:val="660"/>
+    <w:basedOn w:val="706"/>
+    <w:next w:val="706"/>
     <w:uiPriority w:val="39"/>
     <w:unhideWhenUsed/>
     <w:pPr>
@@ -629,10 +665,10 @@
       <w:ind w:left="440"/>
     </w:pPr>
   </w:style>
-  <w:style w:type="paragraph" w:styleId="191">
+  <w:style w:type="paragraph" w:styleId="700">
     <w:name w:val="toc 4"/>
-    <w:basedOn w:val="660"/>
-    <w:next w:val="660"/>
+    <w:basedOn w:val="706"/>
+    <w:next w:val="706"/>
     <w:uiPriority w:val="39"/>
     <w:unhideWhenUsed/>
     <w:pPr>
@@ -641,10 +677,10 @@
       <w:ind w:left="660"/>
     </w:pPr>
   </w:style>
-  <w:style w:type="paragraph" w:styleId="192">
+  <w:style w:type="paragraph" w:styleId="701">
     <w:name w:val="toc 5"/>
-    <w:basedOn w:val="660"/>
-    <w:next w:val="660"/>
+    <w:basedOn w:val="706"/>
+    <w:next w:val="706"/>
     <w:uiPriority w:val="39"/>
     <w:unhideWhenUsed/>
     <w:pPr>
@@ -653,10 +689,10 @@
       <w:ind w:left="880"/>
     </w:pPr>
   </w:style>
-  <w:style w:type="paragraph" w:styleId="193">
+  <w:style w:type="paragraph" w:styleId="702">
     <w:name w:val="toc 6"/>
-    <w:basedOn w:val="660"/>
-    <w:next w:val="660"/>
+    <w:basedOn w:val="706"/>
+    <w:next w:val="706"/>
     <w:uiPriority w:val="39"/>
     <w:unhideWhenUsed/>
     <w:pPr>
@@ -665,10 +701,10 @@
       <w:ind w:left="1100"/>
     </w:pPr>
   </w:style>
-  <w:style w:type="paragraph" w:styleId="194">
+  <w:style w:type="paragraph" w:styleId="703">
     <w:name w:val="toc 7"/>
-    <w:basedOn w:val="660"/>
-    <w:next w:val="660"/>
+    <w:basedOn w:val="706"/>
+    <w:next w:val="706"/>
     <w:uiPriority w:val="39"/>
     <w:unhideWhenUsed/>
     <w:pPr>
@@ -677,10 +713,10 @@
       <w:ind w:left="1320"/>
     </w:pPr>
   </w:style>
-  <w:style w:type="paragraph" w:styleId="195">
+  <w:style w:type="paragraph" w:styleId="704">
     <w:name w:val="toc 8"/>
-    <w:basedOn w:val="660"/>
-    <w:next w:val="660"/>
+    <w:basedOn w:val="706"/>
+    <w:next w:val="706"/>
     <w:uiPriority w:val="39"/>
     <w:unhideWhenUsed/>
     <w:pPr>
@@ -689,10 +725,10 @@
       <w:ind w:left="1540"/>
     </w:pPr>
   </w:style>
-  <w:style w:type="paragraph" w:styleId="196">
+  <w:style w:type="paragraph" w:styleId="705">
     <w:name w:val="toc 9"/>
-    <w:basedOn w:val="660"/>
-    <w:next w:val="660"/>
+    <w:basedOn w:val="706"/>
+    <w:next w:val="706"/>
     <w:uiPriority w:val="39"/>
     <w:unhideWhenUsed/>
     <w:pPr>
@@ -701,7 +737,7 @@
       <w:ind w:left="1760"/>
     </w:pPr>
   </w:style>
-  <w:style w:type="paragraph" w:styleId="660" w:default="1">
+  <w:style w:type="paragraph" w:styleId="706" w:default="1">
     <w:name w:val="Normal"/>
     <w:qFormat/>
     <w:pPr>
@@ -720,11 +756,11 @@
       <w:lang w:val="en-US" w:eastAsia="zh-CN" w:bidi="hi-IN"/>
     </w:rPr>
   </w:style>
-  <w:style w:type="paragraph" w:styleId="661">
+  <w:style w:type="paragraph" w:styleId="707">
     <w:name w:val="Heading 1"/>
-    <w:basedOn w:val="660"/>
-    <w:next w:val="660"/>
-    <w:link w:val="671"/>
+    <w:basedOn w:val="706"/>
+    <w:next w:val="706"/>
+    <w:link w:val="717"/>
     <w:uiPriority w:val="9"/>
     <w:qFormat/>
     <w:pPr>
@@ -742,11 +778,11 @@
       <w:szCs w:val="40"/>
     </w:rPr>
   </w:style>
-  <w:style w:type="paragraph" w:styleId="662">
+  <w:style w:type="paragraph" w:styleId="708">
     <w:name w:val="Heading 2"/>
-    <w:basedOn w:val="660"/>
-    <w:next w:val="660"/>
-    <w:link w:val="672"/>
+    <w:basedOn w:val="706"/>
+    <w:next w:val="706"/>
+    <w:link w:val="718"/>
     <w:uiPriority w:val="9"/>
     <w:unhideWhenUsed/>
     <w:qFormat/>
@@ -765,11 +801,11 @@
       <w:szCs w:val="32"/>
     </w:rPr>
   </w:style>
-  <w:style w:type="paragraph" w:styleId="663">
+  <w:style w:type="paragraph" w:styleId="709">
     <w:name w:val="Heading 3"/>
-    <w:basedOn w:val="660"/>
-    <w:next w:val="660"/>
-    <w:link w:val="673"/>
+    <w:basedOn w:val="706"/>
+    <w:next w:val="706"/>
+    <w:link w:val="719"/>
     <w:uiPriority w:val="9"/>
     <w:unhideWhenUsed/>
     <w:qFormat/>
@@ -788,11 +824,11 @@
       <w:szCs w:val="28"/>
     </w:rPr>
   </w:style>
-  <w:style w:type="paragraph" w:styleId="664">
+  <w:style w:type="paragraph" w:styleId="710">
     <w:name w:val="Heading 4"/>
-    <w:basedOn w:val="660"/>
-    <w:next w:val="660"/>
-    <w:link w:val="674"/>
+    <w:basedOn w:val="706"/>
+    <w:next w:val="706"/>
+    <w:link w:val="720"/>
     <w:uiPriority w:val="9"/>
     <w:unhideWhenUsed/>
     <w:qFormat/>
@@ -811,11 +847,11 @@
       <w:color w:val="0f4761" w:themeColor="accent1" w:themeShade="BF"/>
     </w:rPr>
   </w:style>
-  <w:style w:type="paragraph" w:styleId="665">
+  <w:style w:type="paragraph" w:styleId="711">
     <w:name w:val="Heading 5"/>
-    <w:basedOn w:val="660"/>
-    <w:next w:val="660"/>
-    <w:link w:val="675"/>
+    <w:basedOn w:val="706"/>
+    <w:next w:val="706"/>
+    <w:link w:val="721"/>
     <w:uiPriority w:val="9"/>
     <w:unhideWhenUsed/>
     <w:qFormat/>
@@ -832,11 +868,11 @@
       <w:color w:val="0f4761" w:themeColor="accent1" w:themeShade="BF"/>
     </w:rPr>
   </w:style>
-  <w:style w:type="paragraph" w:styleId="666">
+  <w:style w:type="paragraph" w:styleId="712">
     <w:name w:val="Heading 6"/>
-    <w:basedOn w:val="660"/>
-    <w:next w:val="660"/>
-    <w:link w:val="676"/>
+    <w:basedOn w:val="706"/>
+    <w:next w:val="706"/>
+    <w:link w:val="722"/>
     <w:uiPriority w:val="9"/>
     <w:unhideWhenUsed/>
     <w:qFormat/>
@@ -855,11 +891,11 @@
       <w:color w:val="595959" w:themeColor="text1" w:themeTint="A6"/>
     </w:rPr>
   </w:style>
-  <w:style w:type="paragraph" w:styleId="667">
+  <w:style w:type="paragraph" w:styleId="713">
     <w:name w:val="Heading 7"/>
-    <w:basedOn w:val="660"/>
-    <w:next w:val="660"/>
-    <w:link w:val="677"/>
+    <w:basedOn w:val="706"/>
+    <w:next w:val="706"/>
+    <w:link w:val="723"/>
     <w:uiPriority w:val="9"/>
     <w:unhideWhenUsed/>
     <w:qFormat/>
@@ -876,11 +912,11 @@
       <w:color w:val="595959" w:themeColor="text1" w:themeTint="A6"/>
     </w:rPr>
   </w:style>
-  <w:style w:type="paragraph" w:styleId="668">
+  <w:style w:type="paragraph" w:styleId="714">
     <w:name w:val="Heading 8"/>
-    <w:basedOn w:val="660"/>
-    <w:next w:val="660"/>
-    <w:link w:val="678"/>
+    <w:basedOn w:val="706"/>
+    <w:next w:val="706"/>
+    <w:link w:val="724"/>
     <w:uiPriority w:val="9"/>
     <w:unhideWhenUsed/>
     <w:qFormat/>
@@ -899,11 +935,11 @@
       <w:color w:val="272727" w:themeColor="text1" w:themeTint="D8"/>
     </w:rPr>
   </w:style>
-  <w:style w:type="paragraph" w:styleId="669">
+  <w:style w:type="paragraph" w:styleId="715">
     <w:name w:val="Heading 9"/>
-    <w:basedOn w:val="660"/>
-    <w:next w:val="660"/>
-    <w:link w:val="679"/>
+    <w:basedOn w:val="706"/>
+    <w:next w:val="706"/>
+    <w:link w:val="725"/>
     <w:uiPriority w:val="9"/>
     <w:unhideWhenUsed/>
     <w:qFormat/>
@@ -922,7 +958,7 @@
       <w:color w:val="272727" w:themeColor="text1" w:themeTint="D8"/>
     </w:rPr>
   </w:style>
-  <w:style w:type="character" w:styleId="670" w:default="1">
+  <w:style w:type="character" w:styleId="716" w:default="1">
     <w:name w:val="Default Paragraph Font"/>
     <w:uiPriority w:val="1"/>
     <w:semiHidden/>
@@ -934,10 +970,10 @@
       <w:ind/>
     </w:pPr>
   </w:style>
-  <w:style w:type="character" w:styleId="671">
+  <w:style w:type="character" w:styleId="717">
     <w:name w:val="Heading 1 Char"/>
-    <w:basedOn w:val="670"/>
-    <w:link w:val="661"/>
+    <w:basedOn w:val="716"/>
+    <w:link w:val="707"/>
     <w:uiPriority w:val="9"/>
     <w:qFormat/>
     <w:pPr>
@@ -952,10 +988,10 @@
       <w:szCs w:val="40"/>
     </w:rPr>
   </w:style>
-  <w:style w:type="character" w:styleId="672">
+  <w:style w:type="character" w:styleId="718">
     <w:name w:val="Heading 2 Char"/>
-    <w:basedOn w:val="670"/>
-    <w:link w:val="662"/>
+    <w:basedOn w:val="716"/>
+    <w:link w:val="708"/>
     <w:uiPriority w:val="9"/>
     <w:qFormat/>
     <w:pPr>
@@ -970,10 +1006,10 @@
       <w:szCs w:val="32"/>
     </w:rPr>
   </w:style>
-  <w:style w:type="character" w:styleId="673">
+  <w:style w:type="character" w:styleId="719">
     <w:name w:val="Heading 3 Char"/>
-    <w:basedOn w:val="670"/>
-    <w:link w:val="663"/>
+    <w:basedOn w:val="716"/>
+    <w:link w:val="709"/>
     <w:uiPriority w:val="9"/>
     <w:qFormat/>
     <w:pPr>
@@ -988,10 +1024,10 @@
       <w:szCs w:val="28"/>
     </w:rPr>
   </w:style>
-  <w:style w:type="character" w:styleId="674">
+  <w:style w:type="character" w:styleId="720">
     <w:name w:val="Heading 4 Char"/>
-    <w:basedOn w:val="670"/>
-    <w:link w:val="664"/>
+    <w:basedOn w:val="716"/>
+    <w:link w:val="710"/>
     <w:uiPriority w:val="9"/>
     <w:qFormat/>
     <w:pPr>
@@ -1006,10 +1042,10 @@
       <w:color w:val="0f4761" w:themeColor="accent1" w:themeShade="BF"/>
     </w:rPr>
   </w:style>
-  <w:style w:type="character" w:styleId="675">
+  <w:style w:type="character" w:styleId="721">
     <w:name w:val="Heading 5 Char"/>
-    <w:basedOn w:val="670"/>
-    <w:link w:val="665"/>
+    <w:basedOn w:val="716"/>
+    <w:link w:val="711"/>
     <w:uiPriority w:val="9"/>
     <w:qFormat/>
     <w:pPr>
@@ -1022,10 +1058,10 @@
       <w:color w:val="0f4761" w:themeColor="accent1" w:themeShade="BF"/>
     </w:rPr>
   </w:style>
-  <w:style w:type="character" w:styleId="676">
+  <w:style w:type="character" w:styleId="722">
     <w:name w:val="Heading 6 Char"/>
-    <w:basedOn w:val="670"/>
-    <w:link w:val="666"/>
+    <w:basedOn w:val="716"/>
+    <w:link w:val="712"/>
     <w:uiPriority w:val="9"/>
     <w:qFormat/>
     <w:pPr>
@@ -1040,10 +1076,10 @@
       <w:color w:val="595959" w:themeColor="text1" w:themeTint="A6"/>
     </w:rPr>
   </w:style>
-  <w:style w:type="character" w:styleId="677">
+  <w:style w:type="character" w:styleId="723">
     <w:name w:val="Heading 7 Char"/>
-    <w:basedOn w:val="670"/>
-    <w:link w:val="667"/>
+    <w:basedOn w:val="716"/>
+    <w:link w:val="713"/>
     <w:uiPriority w:val="9"/>
     <w:qFormat/>
     <w:pPr>
@@ -1056,10 +1092,10 @@
       <w:color w:val="595959" w:themeColor="text1" w:themeTint="A6"/>
     </w:rPr>
   </w:style>
-  <w:style w:type="character" w:styleId="678">
+  <w:style w:type="character" w:styleId="724">
     <w:name w:val="Heading 8 Char"/>
-    <w:basedOn w:val="670"/>
-    <w:link w:val="668"/>
+    <w:basedOn w:val="716"/>
+    <w:link w:val="714"/>
     <w:uiPriority w:val="9"/>
     <w:qFormat/>
     <w:pPr>
@@ -1074,10 +1110,10 @@
       <w:color w:val="272727" w:themeColor="text1" w:themeTint="D8"/>
     </w:rPr>
   </w:style>
-  <w:style w:type="character" w:styleId="679">
+  <w:style w:type="character" w:styleId="725">
     <w:name w:val="Heading 9 Char"/>
-    <w:basedOn w:val="670"/>
-    <w:link w:val="669"/>
+    <w:basedOn w:val="716"/>
+    <w:link w:val="715"/>
     <w:uiPriority w:val="9"/>
     <w:qFormat/>
     <w:pPr>
@@ -1092,10 +1128,10 @@
       <w:color w:val="272727" w:themeColor="text1" w:themeTint="D8"/>
     </w:rPr>
   </w:style>
-  <w:style w:type="character" w:styleId="680">
+  <w:style w:type="character" w:styleId="726">
     <w:name w:val="Title Char"/>
-    <w:basedOn w:val="670"/>
-    <w:link w:val="706"/>
+    <w:basedOn w:val="716"/>
+    <w:link w:val="752"/>
     <w:uiPriority w:val="10"/>
     <w:qFormat/>
     <w:pPr>
@@ -1110,10 +1146,10 @@
       <w:szCs w:val="56"/>
     </w:rPr>
   </w:style>
-  <w:style w:type="character" w:styleId="681">
+  <w:style w:type="character" w:styleId="727">
     <w:name w:val="Subtitle Char"/>
-    <w:basedOn w:val="670"/>
-    <w:link w:val="707"/>
+    <w:basedOn w:val="716"/>
+    <w:link w:val="753"/>
     <w:uiPriority w:val="11"/>
     <w:qFormat/>
     <w:pPr>
@@ -1128,10 +1164,10 @@
       <w:szCs w:val="28"/>
     </w:rPr>
   </w:style>
-  <w:style w:type="character" w:styleId="682">
+  <w:style w:type="character" w:styleId="728">
     <w:name w:val="Quote Char"/>
-    <w:basedOn w:val="670"/>
-    <w:link w:val="708"/>
+    <w:basedOn w:val="716"/>
+    <w:link w:val="754"/>
     <w:uiPriority w:val="29"/>
     <w:qFormat/>
     <w:pPr>
@@ -1145,9 +1181,9 @@
       <w:color w:val="404040" w:themeColor="text1" w:themeTint="BF"/>
     </w:rPr>
   </w:style>
-  <w:style w:type="character" w:styleId="683">
+  <w:style w:type="character" w:styleId="729">
     <w:name w:val="Intense Emphasis"/>
-    <w:basedOn w:val="670"/>
+    <w:basedOn w:val="716"/>
     <w:uiPriority w:val="21"/>
     <w:qFormat/>
     <w:pPr>
@@ -1161,10 +1197,10 @@
       <w:color w:val="0f4761" w:themeColor="accent1" w:themeShade="BF"/>
     </w:rPr>
   </w:style>
-  <w:style w:type="character" w:styleId="684">
+  <w:style w:type="character" w:styleId="730">
     <w:name w:val="Intense Quote Char"/>
-    <w:basedOn w:val="670"/>
-    <w:link w:val="710"/>
+    <w:basedOn w:val="716"/>
+    <w:link w:val="756"/>
     <w:uiPriority w:val="30"/>
     <w:qFormat/>
     <w:pPr>
@@ -1178,9 +1214,9 @@
       <w:color w:val="0f4761" w:themeColor="accent1" w:themeShade="BF"/>
     </w:rPr>
   </w:style>
-  <w:style w:type="character" w:styleId="685">
+  <w:style w:type="character" w:styleId="731">
     <w:name w:val="Intense Reference"/>
-    <w:basedOn w:val="670"/>
+    <w:basedOn w:val="716"/>
     <w:uiPriority w:val="32"/>
     <w:qFormat/>
     <w:pPr>
@@ -1196,9 +1232,9 @@
       <w:spacing w:val="5"/>
     </w:rPr>
   </w:style>
-  <w:style w:type="character" w:styleId="686">
+  <w:style w:type="character" w:styleId="732">
     <w:name w:val="Subtle Emphasis"/>
-    <w:basedOn w:val="670"/>
+    <w:basedOn w:val="716"/>
     <w:uiPriority w:val="19"/>
     <w:qFormat/>
     <w:pPr>
@@ -1212,9 +1248,9 @@
       <w:color w:val="404040" w:themeColor="text1" w:themeTint="BF"/>
     </w:rPr>
   </w:style>
-  <w:style w:type="character" w:styleId="687">
+  <w:style w:type="character" w:styleId="733">
     <w:name w:val="Emphasis"/>
-    <w:basedOn w:val="670"/>
+    <w:basedOn w:val="716"/>
     <w:uiPriority w:val="20"/>
     <w:qFormat/>
     <w:pPr>
@@ -1227,9 +1263,9 @@
       <w:iCs/>
     </w:rPr>
   </w:style>
-  <w:style w:type="character" w:styleId="688">
+  <w:style w:type="character" w:styleId="734">
     <w:name w:val="Strong"/>
-    <w:basedOn w:val="670"/>
+    <w:basedOn w:val="716"/>
     <w:uiPriority w:val="22"/>
     <w:qFormat/>
     <w:pPr>
@@ -1242,9 +1278,9 @@
       <w:bCs/>
     </w:rPr>
   </w:style>
-  <w:style w:type="character" w:styleId="689">
+  <w:style w:type="character" w:styleId="735">
     <w:name w:val="Subtle Reference"/>
-    <w:basedOn w:val="670"/>
+    <w:basedOn w:val="716"/>
     <w:uiPriority w:val="31"/>
     <w:qFormat/>
     <w:pPr>
@@ -1257,9 +1293,9 @@
       <w:color w:val="5a5a5a" w:themeColor="text1" w:themeTint="A5"/>
     </w:rPr>
   </w:style>
-  <w:style w:type="character" w:styleId="690">
+  <w:style w:type="character" w:styleId="736">
     <w:name w:val="Book Title"/>
-    <w:basedOn w:val="670"/>
+    <w:basedOn w:val="716"/>
     <w:uiPriority w:val="33"/>
     <w:qFormat/>
     <w:pPr>
@@ -1275,10 +1311,10 @@
       <w:spacing w:val="5"/>
     </w:rPr>
   </w:style>
-  <w:style w:type="character" w:styleId="691">
+  <w:style w:type="character" w:styleId="737">
     <w:name w:val="Header Char"/>
-    <w:basedOn w:val="670"/>
-    <w:link w:val="713"/>
+    <w:basedOn w:val="716"/>
+    <w:link w:val="759"/>
     <w:uiPriority w:val="99"/>
     <w:qFormat/>
     <w:pPr>
@@ -1287,10 +1323,10 @@
       <w:ind/>
     </w:pPr>
   </w:style>
-  <w:style w:type="character" w:styleId="692">
+  <w:style w:type="character" w:styleId="738">
     <w:name w:val="Footer Char"/>
-    <w:basedOn w:val="670"/>
-    <w:link w:val="714"/>
+    <w:basedOn w:val="716"/>
+    <w:link w:val="760"/>
     <w:uiPriority w:val="99"/>
     <w:qFormat/>
     <w:pPr>
@@ -1299,10 +1335,10 @@
       <w:ind/>
     </w:pPr>
   </w:style>
-  <w:style w:type="character" w:styleId="693">
+  <w:style w:type="character" w:styleId="739">
     <w:name w:val="Footnote Text Char"/>
-    <w:basedOn w:val="670"/>
-    <w:link w:val="715"/>
+    <w:basedOn w:val="716"/>
+    <w:link w:val="761"/>
     <w:uiPriority w:val="99"/>
     <w:semiHidden/>
     <w:qFormat/>
@@ -1316,9 +1352,9 @@
       <w:szCs w:val="20"/>
     </w:rPr>
   </w:style>
-  <w:style w:type="character" w:styleId="694">
+  <w:style w:type="character" w:styleId="740">
     <w:name w:val="Footnote Characters"/>
-    <w:basedOn w:val="670"/>
+    <w:basedOn w:val="716"/>
     <w:uiPriority w:val="99"/>
     <w:semiHidden/>
     <w:unhideWhenUsed/>
@@ -1332,7 +1368,7 @@
       <w:vertAlign w:val="superscript"/>
     </w:rPr>
   </w:style>
-  <w:style w:type="character" w:styleId="695">
+  <w:style w:type="character" w:styleId="741">
     <w:name w:val="footnote reference"/>
     <w:pPr>
       <w:pBdr/>
@@ -1343,10 +1379,10 @@
       <w:vertAlign w:val="superscript"/>
     </w:rPr>
   </w:style>
-  <w:style w:type="character" w:styleId="696">
+  <w:style w:type="character" w:styleId="742">
     <w:name w:val="Endnote Text Char"/>
-    <w:basedOn w:val="670"/>
-    <w:link w:val="716"/>
+    <w:basedOn w:val="716"/>
+    <w:link w:val="762"/>
     <w:uiPriority w:val="99"/>
     <w:semiHidden/>
     <w:qFormat/>
@@ -1360,9 +1396,9 @@
       <w:szCs w:val="20"/>
     </w:rPr>
   </w:style>
-  <w:style w:type="character" w:styleId="697">
+  <w:style w:type="character" w:styleId="743">
     <w:name w:val="Endnote Characters"/>
-    <w:basedOn w:val="670"/>
+    <w:basedOn w:val="716"/>
     <w:uiPriority w:val="99"/>
     <w:semiHidden/>
     <w:unhideWhenUsed/>
@@ -1376,7 +1412,7 @@
       <w:vertAlign w:val="superscript"/>
     </w:rPr>
   </w:style>
-  <w:style w:type="character" w:styleId="698">
+  <w:style w:type="character" w:styleId="744">
     <w:name w:val="endnote reference"/>
     <w:pPr>
       <w:pBdr/>
@@ -1387,7 +1423,7 @@
       <w:vertAlign w:val="superscript"/>
     </w:rPr>
   </w:style>
-  <w:style w:type="character" w:styleId="699">
+  <w:style w:type="character" w:styleId="745">
     <w:name w:val="Hyperlink"/>
     <w:pPr>
       <w:pBdr/>
@@ -1399,7 +1435,7 @@
       <w:u w:val="single"/>
     </w:rPr>
   </w:style>
-  <w:style w:type="character" w:styleId="700">
+  <w:style w:type="character" w:styleId="746">
     <w:name w:val="FollowedHyperlink"/>
     <w:pPr>
       <w:pBdr/>
@@ -1411,10 +1447,10 @@
       <w:u w:val="single"/>
     </w:rPr>
   </w:style>
-  <w:style w:type="paragraph" w:styleId="701">
+  <w:style w:type="paragraph" w:styleId="747">
     <w:name w:val="Heading"/>
-    <w:basedOn w:val="660"/>
-    <w:next w:val="702"/>
+    <w:basedOn w:val="706"/>
+    <w:next w:val="748"/>
     <w:qFormat/>
     <w:pPr>
       <w:keepNext w:val="true"/>
@@ -1428,18 +1464,18 @@
       <w:szCs w:val="28"/>
     </w:rPr>
   </w:style>
-  <w:style w:type="paragraph" w:styleId="702">
+  <w:style w:type="paragraph" w:styleId="748">
     <w:name w:val="Body Text"/>
-    <w:basedOn w:val="660"/>
+    <w:basedOn w:val="706"/>
     <w:pPr>
       <w:pBdr/>
       <w:spacing w:after="140" w:before="0" w:line="276" w:lineRule="auto"/>
       <w:ind/>
     </w:pPr>
   </w:style>
-  <w:style w:type="paragraph" w:styleId="703">
+  <w:style w:type="paragraph" w:styleId="749">
     <w:name w:val="List"/>
-    <w:basedOn w:val="702"/>
+    <w:basedOn w:val="748"/>
     <w:pPr>
       <w:pBdr/>
       <w:spacing/>
@@ -1449,9 +1485,9 @@
       <w:rFonts w:cs="Lohit Devanagari"/>
     </w:rPr>
   </w:style>
-  <w:style w:type="paragraph" w:styleId="704">
+  <w:style w:type="paragraph" w:styleId="750">
     <w:name w:val="Caption"/>
-    <w:basedOn w:val="660"/>
+    <w:basedOn w:val="706"/>
     <w:qFormat/>
     <w:pPr>
       <w:suppressLineNumbers w:val="true"/>
@@ -1467,9 +1503,9 @@
       <w:szCs w:val="24"/>
     </w:rPr>
   </w:style>
-  <w:style w:type="paragraph" w:styleId="705">
+  <w:style w:type="paragraph" w:styleId="751">
     <w:name w:val="Index"/>
-    <w:basedOn w:val="660"/>
+    <w:basedOn w:val="706"/>
     <w:qFormat/>
     <w:pPr>
       <w:suppressLineNumbers w:val="true"/>
@@ -1481,11 +1517,11 @@
       <w:rFonts w:cs="Lohit Devanagari"/>
     </w:rPr>
   </w:style>
-  <w:style w:type="paragraph" w:styleId="706">
+  <w:style w:type="paragraph" w:styleId="752">
     <w:name w:val="Title"/>
-    <w:basedOn w:val="660"/>
-    <w:next w:val="660"/>
-    <w:link w:val="680"/>
+    <w:basedOn w:val="706"/>
+    <w:next w:val="706"/>
+    <w:link w:val="726"/>
     <w:uiPriority w:val="10"/>
     <w:qFormat/>
     <w:pPr>
@@ -1501,11 +1537,11 @@
       <w:szCs w:val="56"/>
     </w:rPr>
   </w:style>
-  <w:style w:type="paragraph" w:styleId="707">
+  <w:style w:type="paragraph" w:styleId="753">
     <w:name w:val="Subtitle"/>
-    <w:basedOn w:val="660"/>
-    <w:next w:val="660"/>
-    <w:link w:val="681"/>
+    <w:basedOn w:val="706"/>
+    <w:next w:val="706"/>
+    <w:link w:val="727"/>
     <w:uiPriority w:val="11"/>
     <w:qFormat/>
     <w:pPr>
@@ -1520,11 +1556,11 @@
       <w:szCs w:val="28"/>
     </w:rPr>
   </w:style>
-  <w:style w:type="paragraph" w:styleId="708">
+  <w:style w:type="paragraph" w:styleId="754">
     <w:name w:val="Quote"/>
-    <w:basedOn w:val="660"/>
-    <w:next w:val="660"/>
-    <w:link w:val="682"/>
+    <w:basedOn w:val="706"/>
+    <w:next w:val="706"/>
+    <w:link w:val="728"/>
     <w:uiPriority w:val="29"/>
     <w:qFormat/>
     <w:pPr>
@@ -1539,9 +1575,9 @@
       <w:color w:val="404040" w:themeColor="text1" w:themeTint="BF"/>
     </w:rPr>
   </w:style>
-  <w:style w:type="paragraph" w:styleId="709">
+  <w:style w:type="paragraph" w:styleId="755">
     <w:name w:val="List Paragraph"/>
-    <w:basedOn w:val="660"/>
+    <w:basedOn w:val="706"/>
     <w:uiPriority w:val="34"/>
     <w:qFormat/>
     <w:pPr>
@@ -1551,11 +1587,11 @@
       <w:contextualSpacing w:val="true"/>
     </w:pPr>
   </w:style>
-  <w:style w:type="paragraph" w:styleId="710">
+  <w:style w:type="paragraph" w:styleId="756">
     <w:name w:val="Intense Quote"/>
-    <w:basedOn w:val="660"/>
-    <w:next w:val="660"/>
-    <w:link w:val="684"/>
+    <w:basedOn w:val="706"/>
+    <w:next w:val="706"/>
+    <w:link w:val="730"/>
     <w:uiPriority w:val="30"/>
     <w:qFormat/>
     <w:pPr>
@@ -1573,9 +1609,9 @@
       <w:color w:val="0f4761" w:themeColor="accent1" w:themeShade="BF"/>
     </w:rPr>
   </w:style>
-  <w:style w:type="paragraph" w:styleId="711">
+  <w:style w:type="paragraph" w:styleId="757">
     <w:name w:val="No Spacing"/>
-    <w:basedOn w:val="660"/>
+    <w:basedOn w:val="706"/>
     <w:uiPriority w:val="1"/>
     <w:qFormat/>
     <w:pPr>
@@ -1584,9 +1620,9 @@
       <w:ind/>
     </w:pPr>
   </w:style>
-  <w:style w:type="paragraph" w:styleId="712">
+  <w:style w:type="paragraph" w:styleId="758">
     <w:name w:val="Header and Footer"/>
-    <w:basedOn w:val="660"/>
+    <w:basedOn w:val="706"/>
     <w:qFormat/>
     <w:pPr>
       <w:pBdr/>
@@ -1594,10 +1630,10 @@
       <w:ind/>
     </w:pPr>
   </w:style>
-  <w:style w:type="paragraph" w:styleId="713">
+  <w:style w:type="paragraph" w:styleId="759">
     <w:name w:val="Header"/>
-    <w:basedOn w:val="660"/>
-    <w:link w:val="691"/>
+    <w:basedOn w:val="706"/>
+    <w:link w:val="737"/>
     <w:uiPriority w:val="99"/>
     <w:unhideWhenUsed/>
     <w:pPr>
@@ -1611,10 +1647,10 @@
       <w:ind/>
     </w:pPr>
   </w:style>
-  <w:style w:type="paragraph" w:styleId="714">
+  <w:style w:type="paragraph" w:styleId="760">
     <w:name w:val="Footer"/>
-    <w:basedOn w:val="660"/>
-    <w:link w:val="692"/>
+    <w:basedOn w:val="706"/>
+    <w:link w:val="738"/>
     <w:uiPriority w:val="99"/>
     <w:unhideWhenUsed/>
     <w:pPr>
@@ -1628,10 +1664,10 @@
       <w:ind/>
     </w:pPr>
   </w:style>
-  <w:style w:type="paragraph" w:styleId="715">
+  <w:style w:type="paragraph" w:styleId="761">
     <w:name w:val="footnote text"/>
-    <w:basedOn w:val="660"/>
-    <w:link w:val="693"/>
+    <w:basedOn w:val="706"/>
+    <w:link w:val="739"/>
     <w:uiPriority w:val="99"/>
     <w:semiHidden/>
     <w:unhideWhenUsed/>
@@ -1645,10 +1681,10 @@
       <w:szCs w:val="20"/>
     </w:rPr>
   </w:style>
-  <w:style w:type="paragraph" w:styleId="716">
+  <w:style w:type="paragraph" w:styleId="762">
     <w:name w:val="endnote text"/>
-    <w:basedOn w:val="660"/>
-    <w:link w:val="696"/>
+    <w:basedOn w:val="706"/>
+    <w:link w:val="742"/>
     <w:uiPriority w:val="99"/>
     <w:semiHidden/>
     <w:unhideWhenUsed/>
@@ -1662,16 +1698,16 @@
       <w:szCs w:val="20"/>
     </w:rPr>
   </w:style>
-  <w:style w:type="paragraph" w:styleId="717">
+  <w:style w:type="paragraph" w:styleId="763">
     <w:name w:val="Index Heading"/>
-    <w:basedOn w:val="701"/>
+    <w:basedOn w:val="747"/>
     <w:pPr>
       <w:pBdr/>
       <w:spacing/>
       <w:ind/>
     </w:pPr>
   </w:style>
-  <w:style w:type="paragraph" w:styleId="718">
+  <w:style w:type="paragraph" w:styleId="764">
     <w:name w:val="TOC Heading"/>
     <w:uiPriority w:val="39"/>
     <w:unhideWhenUsed/>
@@ -1692,10 +1728,10 @@
       <w:lang w:val="en-US" w:eastAsia="zh-CN" w:bidi="hi-IN"/>
     </w:rPr>
   </w:style>
-  <w:style w:type="paragraph" w:styleId="719">
+  <w:style w:type="paragraph" w:styleId="765">
     <w:name w:val="table of figures"/>
-    <w:basedOn w:val="660"/>
-    <w:next w:val="660"/>
+    <w:basedOn w:val="706"/>
+    <w:next w:val="706"/>
     <w:uiPriority w:val="99"/>
     <w:unhideWhenUsed/>
     <w:pPr>
@@ -1704,7 +1740,7 @@
       <w:ind/>
     </w:pPr>
   </w:style>
-  <w:style w:type="numbering" w:styleId="720" w:default="1">
+  <w:style w:type="numbering" w:styleId="766" w:default="1">
     <w:name w:val="No List"/>
     <w:uiPriority w:val="99"/>
     <w:semiHidden/>
@@ -1716,7 +1752,7 @@
       <w:ind/>
     </w:pPr>
   </w:style>
-  <w:style w:type="table" w:styleId="721" w:default="1">
+  <w:style w:type="table" w:styleId="767" w:default="1">
     <w:name w:val="Normal Table"/>
     <w:uiPriority w:val="99"/>
     <w:semiHidden/>
@@ -1908,9 +1944,9 @@
       </w:tcPr>
     </w:tblStylePr>
   </w:style>
-  <w:style w:type="table" w:styleId="722">
+  <w:style w:type="table" w:styleId="768">
     <w:name w:val="Table Grid"/>
-    <w:basedOn w:val="721"/>
+    <w:basedOn w:val="767"/>
     <w:uiPriority w:val="59"/>
     <w:pPr>
       <w:pBdr/>
@@ -2106,9 +2142,9 @@
       </w:tcPr>
     </w:tblStylePr>
   </w:style>
-  <w:style w:type="table" w:styleId="723">
+  <w:style w:type="table" w:styleId="769">
     <w:name w:val="Table Grid Light"/>
-    <w:basedOn w:val="721"/>
+    <w:basedOn w:val="767"/>
     <w:uiPriority w:val="59"/>
     <w:pPr>
       <w:pBdr/>
@@ -2304,9 +2340,9 @@
       </w:tcPr>
     </w:tblStylePr>
   </w:style>
-  <w:style w:type="table" w:styleId="724">
+  <w:style w:type="table" w:styleId="770">
     <w:name w:val="Plain Table 1"/>
-    <w:basedOn w:val="721"/>
+    <w:basedOn w:val="767"/>
     <w:uiPriority w:val="59"/>
     <w:pPr>
       <w:pBdr/>
@@ -2520,9 +2556,9 @@
       </w:tcPr>
     </w:tblStylePr>
   </w:style>
-  <w:style w:type="table" w:styleId="725">
+  <w:style w:type="table" w:styleId="771">
     <w:name w:val="Plain Table 2"/>
-    <w:basedOn w:val="721"/>
+    <w:basedOn w:val="767"/>
     <w:uiPriority w:val="59"/>
     <w:pPr>
       <w:pBdr/>
@@ -2744,9 +2780,9 @@
       </w:tcPr>
     </w:tblStylePr>
   </w:style>
-  <w:style w:type="table" w:styleId="726">
+  <w:style w:type="table" w:styleId="772">
     <w:name w:val="Plain Table 3"/>
-    <w:basedOn w:val="721"/>
+    <w:basedOn w:val="767"/>
     <w:uiPriority w:val="99"/>
     <w:pPr>
       <w:pBdr/>
@@ -2965,9 +3001,9 @@
       </w:tcPr>
     </w:tblStylePr>
   </w:style>
-  <w:style w:type="table" w:styleId="727">
+  <w:style w:type="table" w:styleId="773">
     <w:name w:val="Plain Table 4"/>
-    <w:basedOn w:val="721"/>
+    <w:basedOn w:val="767"/>
     <w:uiPriority w:val="99"/>
     <w:pPr>
       <w:pBdr/>
@@ -3172,9 +3208,9 @@
       </w:tcPr>
     </w:tblStylePr>
   </w:style>
-  <w:style w:type="table" w:styleId="728">
+  <w:style w:type="table" w:styleId="774">
     <w:name w:val="Plain Table 5"/>
-    <w:basedOn w:val="721"/>
+    <w:basedOn w:val="767"/>
     <w:uiPriority w:val="99"/>
     <w:pPr>
       <w:pBdr/>
@@ -3396,9 +3432,9 @@
       </w:tcPr>
     </w:tblStylePr>
   </w:style>
-  <w:style w:type="table" w:styleId="729">
+  <w:style w:type="table" w:styleId="775">
     <w:name w:val="Grid Table 1 Light"/>
-    <w:basedOn w:val="721"/>
+    <w:basedOn w:val="767"/>
     <w:uiPriority w:val="99"/>
     <w:pPr>
       <w:pBdr/>
@@ -3612,9 +3648,9 @@
       </w:tcPr>
     </w:tblStylePr>
   </w:style>
-  <w:style w:type="table" w:styleId="730">
+  <w:style w:type="table" w:styleId="776">
     <w:name w:val="Grid Table 1 Light - Accent 1"/>
-    <w:basedOn w:val="721"/>
+    <w:basedOn w:val="767"/>
     <w:uiPriority w:val="99"/>
     <w:pPr>
       <w:pBdr/>
@@ -3828,9 +3864,9 @@
       </w:tcPr>
     </w:tblStylePr>
   </w:style>
-  <w:style w:type="table" w:styleId="731">
+  <w:style w:type="table" w:styleId="777">
     <w:name w:val="Grid Table 1 Light - Accent 2"/>
-    <w:basedOn w:val="721"/>
+    <w:basedOn w:val="767"/>
     <w:uiPriority w:val="99"/>
     <w:pPr>
       <w:pBdr/>
@@ -4044,9 +4080,9 @@
       </w:tcPr>
     </w:tblStylePr>
   </w:style>
-  <w:style w:type="table" w:styleId="732">
+  <w:style w:type="table" w:styleId="778">
     <w:name w:val="Grid Table 1 Light - Accent 3"/>
-    <w:basedOn w:val="721"/>
+    <w:basedOn w:val="767"/>
     <w:uiPriority w:val="99"/>
     <w:pPr>
       <w:pBdr/>
@@ -4260,9 +4296,9 @@
       </w:tcPr>
     </w:tblStylePr>
   </w:style>
-  <w:style w:type="table" w:styleId="733">
+  <w:style w:type="table" w:styleId="779">
     <w:name w:val="Grid Table 1 Light - Accent 4"/>
-    <w:basedOn w:val="721"/>
+    <w:basedOn w:val="767"/>
     <w:uiPriority w:val="99"/>
     <w:pPr>
       <w:pBdr/>
@@ -4476,9 +4512,9 @@
       </w:tcPr>
     </w:tblStylePr>
   </w:style>
-  <w:style w:type="table" w:styleId="734">
+  <w:style w:type="table" w:styleId="780">
     <w:name w:val="Grid Table 1 Light - Accent 5"/>
-    <w:basedOn w:val="721"/>
+    <w:basedOn w:val="767"/>
     <w:uiPriority w:val="99"/>
     <w:pPr>
       <w:pBdr/>
@@ -4692,9 +4728,9 @@
       </w:tcPr>
     </w:tblStylePr>
   </w:style>
-  <w:style w:type="table" w:styleId="735">
+  <w:style w:type="table" w:styleId="781">
     <w:name w:val="Grid Table 1 Light - Accent 6"/>
-    <w:basedOn w:val="721"/>
+    <w:basedOn w:val="767"/>
     <w:uiPriority w:val="99"/>
     <w:pPr>
       <w:pBdr/>
@@ -4908,9 +4944,9 @@
       </w:tcPr>
     </w:tblStylePr>
   </w:style>
-  <w:style w:type="table" w:styleId="736">
+  <w:style w:type="table" w:styleId="782">
     <w:name w:val="Grid Table 2"/>
-    <w:basedOn w:val="721"/>
+    <w:basedOn w:val="767"/>
     <w:uiPriority w:val="99"/>
     <w:pPr>
       <w:pBdr/>
@@ -5131,9 +5167,9 @@
       </w:tcPr>
     </w:tblStylePr>
   </w:style>
-  <w:style w:type="table" w:styleId="737">
+  <w:style w:type="table" w:styleId="783">
     <w:name w:val="Grid Table 2 - Accent 1"/>
-    <w:basedOn w:val="721"/>
+    <w:basedOn w:val="767"/>
     <w:uiPriority w:val="99"/>
     <w:pPr>
       <w:pBdr/>
@@ -5354,9 +5390,9 @@
       </w:tcPr>
     </w:tblStylePr>
   </w:style>
-  <w:style w:type="table" w:styleId="738">
+  <w:style w:type="table" w:styleId="784">
     <w:name w:val="Grid Table 2 - Accent 2"/>
-    <w:basedOn w:val="721"/>
+    <w:basedOn w:val="767"/>
     <w:uiPriority w:val="99"/>
     <w:pPr>
       <w:pBdr/>
@@ -5577,9 +5613,9 @@
       </w:tcPr>
     </w:tblStylePr>
   </w:style>
-  <w:style w:type="table" w:styleId="739">
+  <w:style w:type="table" w:styleId="785">
     <w:name w:val="Grid Table 2 - Accent 3"/>
-    <w:basedOn w:val="721"/>
+    <w:basedOn w:val="767"/>
     <w:uiPriority w:val="99"/>
     <w:pPr>
       <w:pBdr/>
@@ -5800,9 +5836,9 @@
       </w:tcPr>
     </w:tblStylePr>
   </w:style>
-  <w:style w:type="table" w:styleId="740">
+  <w:style w:type="table" w:styleId="786">
     <w:name w:val="Grid Table 2 - Accent 4"/>
-    <w:basedOn w:val="721"/>
+    <w:basedOn w:val="767"/>
     <w:uiPriority w:val="99"/>
     <w:pPr>
       <w:pBdr/>
@@ -6023,9 +6059,9 @@
       </w:tcPr>
     </w:tblStylePr>
   </w:style>
-  <w:style w:type="table" w:styleId="741">
+  <w:style w:type="table" w:styleId="787">
     <w:name w:val="Grid Table 2 - Accent 5"/>
-    <w:basedOn w:val="721"/>
+    <w:basedOn w:val="767"/>
     <w:uiPriority w:val="99"/>
     <w:pPr>
       <w:pBdr/>
@@ -6246,9 +6282,9 @@
       </w:tcPr>
     </w:tblStylePr>
   </w:style>
-  <w:style w:type="table" w:styleId="742">
+  <w:style w:type="table" w:styleId="788">
     <w:name w:val="Grid Table 2 - Accent 6"/>
-    <w:basedOn w:val="721"/>
+    <w:basedOn w:val="767"/>
     <w:uiPriority w:val="99"/>
     <w:pPr>
       <w:pBdr/>
@@ -6469,9 +6505,9 @@
       </w:tcPr>
     </w:tblStylePr>
   </w:style>
-  <w:style w:type="table" w:styleId="743">
+  <w:style w:type="table" w:styleId="789">
     <w:name w:val="Grid Table 3"/>
-    <w:basedOn w:val="721"/>
+    <w:basedOn w:val="767"/>
     <w:uiPriority w:val="99"/>
     <w:pPr>
       <w:pBdr/>
@@ -6705,9 +6741,9 @@
       </w:tcPr>
     </w:tblStylePr>
   </w:style>
-  <w:style w:type="table" w:styleId="744">
+  <w:style w:type="table" w:styleId="790">
     <w:name w:val="Grid Table 3 - Accent 1"/>
-    <w:basedOn w:val="721"/>
+    <w:basedOn w:val="767"/>
     <w:uiPriority w:val="99"/>
     <w:pPr>
       <w:pBdr/>
@@ -6941,9 +6977,9 @@
       </w:tcPr>
     </w:tblStylePr>
   </w:style>
-  <w:style w:type="table" w:styleId="745">
+  <w:style w:type="table" w:styleId="791">
     <w:name w:val="Grid Table 3 - Accent 2"/>
-    <w:basedOn w:val="721"/>
+    <w:basedOn w:val="767"/>
     <w:uiPriority w:val="99"/>
     <w:pPr>
       <w:pBdr/>
@@ -7177,9 +7213,9 @@
       </w:tcPr>
     </w:tblStylePr>
   </w:style>
-  <w:style w:type="table" w:styleId="746">
+  <w:style w:type="table" w:styleId="792">
     <w:name w:val="Grid Table 3 - Accent 3"/>
-    <w:basedOn w:val="721"/>
+    <w:basedOn w:val="767"/>
     <w:uiPriority w:val="99"/>
     <w:pPr>
       <w:pBdr/>
@@ -7413,9 +7449,9 @@
       </w:tcPr>
     </w:tblStylePr>
   </w:style>
-  <w:style w:type="table" w:styleId="747">
+  <w:style w:type="table" w:styleId="793">
     <w:name w:val="Grid Table 3 - Accent 4"/>
-    <w:basedOn w:val="721"/>
+    <w:basedOn w:val="767"/>
     <w:uiPriority w:val="99"/>
     <w:pPr>
       <w:pBdr/>
@@ -7649,9 +7685,9 @@
       </w:tcPr>
     </w:tblStylePr>
   </w:style>
-  <w:style w:type="table" w:styleId="748">
+  <w:style w:type="table" w:styleId="794">
     <w:name w:val="Grid Table 3 - Accent 5"/>
-    <w:basedOn w:val="721"/>
+    <w:basedOn w:val="767"/>
     <w:uiPriority w:val="99"/>
     <w:pPr>
       <w:pBdr/>
@@ -7885,9 +7921,9 @@
       </w:tcPr>
     </w:tblStylePr>
   </w:style>
-  <w:style w:type="table" w:styleId="749">
+  <w:style w:type="table" w:styleId="795">
     <w:name w:val="Grid Table 3 - Accent 6"/>
-    <w:basedOn w:val="721"/>
+    <w:basedOn w:val="767"/>
     <w:uiPriority w:val="99"/>
     <w:pPr>
       <w:pBdr/>
@@ -8121,9 +8157,9 @@
       </w:tcPr>
     </w:tblStylePr>
   </w:style>
-  <w:style w:type="table" w:styleId="750">
+  <w:style w:type="table" w:styleId="796">
     <w:name w:val="Grid Table 4"/>
-    <w:basedOn w:val="721"/>
+    <w:basedOn w:val="767"/>
     <w:uiPriority w:val="59"/>
     <w:pPr>
       <w:pBdr/>
@@ -8344,9 +8380,9 @@
       </w:tcPr>
     </w:tblStylePr>
   </w:style>
-  <w:style w:type="table" w:styleId="751">
+  <w:style w:type="table" w:styleId="797">
     <w:name w:val="Grid Table 4 - Accent 1"/>
-    <w:basedOn w:val="721"/>
+    <w:basedOn w:val="767"/>
     <w:uiPriority w:val="59"/>
     <w:pPr>
       <w:pBdr/>
@@ -8567,9 +8603,9 @@
       </w:tcPr>
     </w:tblStylePr>
   </w:style>
-  <w:style w:type="table" w:styleId="752">
+  <w:style w:type="table" w:styleId="798">
     <w:name w:val="Grid Table 4 - Accent 2"/>
-    <w:basedOn w:val="721"/>
+    <w:basedOn w:val="767"/>
     <w:uiPriority w:val="59"/>
     <w:pPr>
       <w:pBdr/>
@@ -8790,9 +8826,9 @@
       </w:tcPr>
     </w:tblStylePr>
   </w:style>
-  <w:style w:type="table" w:styleId="753">
+  <w:style w:type="table" w:styleId="799">
     <w:name w:val="Grid Table 4 - Accent 3"/>
-    <w:basedOn w:val="721"/>
+    <w:basedOn w:val="767"/>
     <w:uiPriority w:val="59"/>
     <w:pPr>
       <w:pBdr/>
@@ -9013,9 +9049,9 @@
       </w:tcPr>
     </w:tblStylePr>
   </w:style>
-  <w:style w:type="table" w:styleId="754">
+  <w:style w:type="table" w:styleId="800">
     <w:name w:val="Grid Table 4 - Accent 4"/>
-    <w:basedOn w:val="721"/>
+    <w:basedOn w:val="767"/>
     <w:uiPriority w:val="59"/>
     <w:pPr>
       <w:pBdr/>
@@ -9236,9 +9272,9 @@
       </w:tcPr>
     </w:tblStylePr>
   </w:style>
-  <w:style w:type="table" w:styleId="755">
+  <w:style w:type="table" w:styleId="801">
     <w:name w:val="Grid Table 4 - Accent 5"/>
-    <w:basedOn w:val="721"/>
+    <w:basedOn w:val="767"/>
     <w:uiPriority w:val="59"/>
     <w:pPr>
       <w:pBdr/>
@@ -9459,9 +9495,9 @@
       </w:tcPr>
     </w:tblStylePr>
   </w:style>
-  <w:style w:type="table" w:styleId="756">
+  <w:style w:type="table" w:styleId="802">
     <w:name w:val="Grid Table 4 - Accent 6"/>
-    <w:basedOn w:val="721"/>
+    <w:basedOn w:val="767"/>
     <w:uiPriority w:val="59"/>
     <w:pPr>
       <w:pBdr/>
@@ -9682,9 +9718,9 @@
       </w:tcPr>
     </w:tblStylePr>
   </w:style>
-  <w:style w:type="table" w:styleId="757">
+  <w:style w:type="table" w:styleId="803">
     <w:name w:val="Grid Table 5 Dark"/>
-    <w:basedOn w:val="721"/>
+    <w:basedOn w:val="767"/>
     <w:uiPriority w:val="99"/>
     <w:pPr>
       <w:pBdr/>
@@ -9900,9 +9936,9 @@
       </w:tcPr>
     </w:tblStylePr>
   </w:style>
-  <w:style w:type="table" w:styleId="758">
+  <w:style w:type="table" w:styleId="804">
     <w:name w:val="Grid Table 5 Dark- Accent 1"/>
-    <w:basedOn w:val="721"/>
+    <w:basedOn w:val="767"/>
     <w:uiPriority w:val="99"/>
     <w:pPr>
       <w:pBdr/>
@@ -10118,9 +10154,9 @@
       </w:tcPr>
     </w:tblStylePr>
   </w:style>
-  <w:style w:type="table" w:styleId="759">
+  <w:style w:type="table" w:styleId="805">
     <w:name w:val="Grid Table 5 Dark - Accent 2"/>
-    <w:basedOn w:val="721"/>
+    <w:basedOn w:val="767"/>
     <w:uiPriority w:val="99"/>
     <w:pPr>
       <w:pBdr/>
@@ -10336,9 +10372,9 @@
       </w:tcPr>
     </w:tblStylePr>
   </w:style>
-  <w:style w:type="table" w:styleId="760">
+  <w:style w:type="table" w:styleId="806">
     <w:name w:val="Grid Table 5 Dark - Accent 3"/>
-    <w:basedOn w:val="721"/>
+    <w:basedOn w:val="767"/>
     <w:uiPriority w:val="99"/>
     <w:pPr>
       <w:pBdr/>
@@ -10554,9 +10590,9 @@
       </w:tcPr>
     </w:tblStylePr>
   </w:style>
-  <w:style w:type="table" w:styleId="761">
+  <w:style w:type="table" w:styleId="807">
     <w:name w:val="Grid Table 5 Dark- Accent 4"/>
-    <w:basedOn w:val="721"/>
+    <w:basedOn w:val="767"/>
     <w:uiPriority w:val="99"/>
     <w:pPr>
       <w:pBdr/>
@@ -10772,9 +10808,9 @@
       </w:tcPr>
     </w:tblStylePr>
   </w:style>
-  <w:style w:type="table" w:styleId="762">
+  <w:style w:type="table" w:styleId="808">
     <w:name w:val="Grid Table 5 Dark - Accent 5"/>
-    <w:basedOn w:val="721"/>
+    <w:basedOn w:val="767"/>
     <w:uiPriority w:val="99"/>
     <w:pPr>
       <w:pBdr/>
@@ -10990,9 +11026,9 @@
       </w:tcPr>
     </w:tblStylePr>
   </w:style>
-  <w:style w:type="table" w:styleId="763">
+  <w:style w:type="table" w:styleId="809">
     <w:name w:val="Grid Table 5 Dark - Accent 6"/>
-    <w:basedOn w:val="721"/>
+    <w:basedOn w:val="767"/>
     <w:uiPriority w:val="99"/>
     <w:pPr>
       <w:pBdr/>
@@ -11208,9 +11244,9 @@
       </w:tcPr>
     </w:tblStylePr>
   </w:style>
-  <w:style w:type="table" w:styleId="764">
+  <w:style w:type="table" w:styleId="810">
     <w:name w:val="Grid Table 6 Colorful"/>
-    <w:basedOn w:val="721"/>
+    <w:basedOn w:val="767"/>
     <w:uiPriority w:val="99"/>
     <w:pPr>
       <w:pBdr/>
@@ -11434,9 +11470,9 @@
       </w:tcPr>
     </w:tblStylePr>
   </w:style>
-  <w:style w:type="table" w:styleId="765">
+  <w:style w:type="table" w:styleId="811">
     <w:name w:val="Grid Table 6 Colorful - Accent 1"/>
-    <w:basedOn w:val="721"/>
+    <w:basedOn w:val="767"/>
     <w:uiPriority w:val="99"/>
     <w:pPr>
       <w:pBdr/>
@@ -11660,9 +11696,9 @@
       </w:tcPr>
     </w:tblStylePr>
   </w:style>
-  <w:style w:type="table" w:styleId="766">
+  <w:style w:type="table" w:styleId="812">
     <w:name w:val="Grid Table 6 Colorful - Accent 2"/>
-    <w:basedOn w:val="721"/>
+    <w:basedOn w:val="767"/>
     <w:uiPriority w:val="99"/>
     <w:pPr>
       <w:pBdr/>
@@ -11886,9 +11922,9 @@
       </w:tcPr>
     </w:tblStylePr>
   </w:style>
-  <w:style w:type="table" w:styleId="767">
+  <w:style w:type="table" w:styleId="813">
     <w:name w:val="Grid Table 6 Colorful - Accent 3"/>
-    <w:basedOn w:val="721"/>
+    <w:basedOn w:val="767"/>
     <w:uiPriority w:val="99"/>
     <w:pPr>
       <w:pBdr/>
@@ -12112,9 +12148,9 @@
       </w:tcPr>
     </w:tblStylePr>
   </w:style>
-  <w:style w:type="table" w:styleId="768">
+  <w:style w:type="table" w:styleId="814">
     <w:name w:val="Grid Table 6 Colorful - Accent 4"/>
-    <w:basedOn w:val="721"/>
+    <w:basedOn w:val="767"/>
     <w:uiPriority w:val="99"/>
     <w:pPr>
       <w:pBdr/>
@@ -12338,9 +12374,9 @@
       </w:tcPr>
     </w:tblStylePr>
   </w:style>
-  <w:style w:type="table" w:styleId="769">
+  <w:style w:type="table" w:styleId="815">
     <w:name w:val="Grid Table 6 Colorful - Accent 5"/>
-    <w:basedOn w:val="721"/>
+    <w:basedOn w:val="767"/>
     <w:uiPriority w:val="99"/>
     <w:pPr>
       <w:pBdr/>
@@ -12564,9 +12600,9 @@
       </w:tcPr>
     </w:tblStylePr>
   </w:style>
-  <w:style w:type="table" w:styleId="770">
+  <w:style w:type="table" w:styleId="816">
     <w:name w:val="Grid Table 6 Colorful - Accent 6"/>
-    <w:basedOn w:val="721"/>
+    <w:basedOn w:val="767"/>
     <w:uiPriority w:val="99"/>
     <w:pPr>
       <w:pBdr/>
@@ -12790,9 +12826,9 @@
       </w:tcPr>
     </w:tblStylePr>
   </w:style>
-  <w:style w:type="table" w:styleId="771">
+  <w:style w:type="table" w:styleId="817">
     <w:name w:val="Grid Table 7 Colorful"/>
-    <w:basedOn w:val="721"/>
+    <w:basedOn w:val="767"/>
     <w:uiPriority w:val="99"/>
     <w:pPr>
       <w:pBdr/>
@@ -13037,9 +13073,9 @@
       </w:tcPr>
     </w:tblStylePr>
   </w:style>
-  <w:style w:type="table" w:styleId="772">
+  <w:style w:type="table" w:styleId="818">
     <w:name w:val="Grid Table 7 Colorful - Accent 1"/>
-    <w:basedOn w:val="721"/>
+    <w:basedOn w:val="767"/>
     <w:uiPriority w:val="99"/>
     <w:pPr>
       <w:pBdr/>
@@ -13284,9 +13320,9 @@
       </w:tcPr>
     </w:tblStylePr>
   </w:style>
-  <w:style w:type="table" w:styleId="773">
+  <w:style w:type="table" w:styleId="819">
     <w:name w:val="Grid Table 7 Colorful - Accent 2"/>
-    <w:basedOn w:val="721"/>
+    <w:basedOn w:val="767"/>
     <w:uiPriority w:val="99"/>
     <w:pPr>
       <w:pBdr/>
@@ -13531,9 +13567,9 @@
       </w:tcPr>
     </w:tblStylePr>
   </w:style>
-  <w:style w:type="table" w:styleId="774">
+  <w:style w:type="table" w:styleId="820">
     <w:name w:val="Grid Table 7 Colorful - Accent 3"/>
-    <w:basedOn w:val="721"/>
+    <w:basedOn w:val="767"/>
     <w:uiPriority w:val="99"/>
     <w:pPr>
       <w:pBdr/>
@@ -13778,9 +13814,9 @@
       </w:tcPr>
     </w:tblStylePr>
   </w:style>
-  <w:style w:type="table" w:styleId="775">
+  <w:style w:type="table" w:styleId="821">
     <w:name w:val="Grid Table 7 Colorful - Accent 4"/>
-    <w:basedOn w:val="721"/>
+    <w:basedOn w:val="767"/>
     <w:uiPriority w:val="99"/>
     <w:pPr>
       <w:pBdr/>
@@ -14025,9 +14061,9 @@
       </w:tcPr>
     </w:tblStylePr>
   </w:style>
-  <w:style w:type="table" w:styleId="776">
+  <w:style w:type="table" w:styleId="822">
     <w:name w:val="Grid Table 7 Colorful - Accent 5"/>
-    <w:basedOn w:val="721"/>
+    <w:basedOn w:val="767"/>
     <w:uiPriority w:val="99"/>
     <w:pPr>
       <w:pBdr/>
@@ -14272,9 +14308,9 @@
       </w:tcPr>
     </w:tblStylePr>
   </w:style>
-  <w:style w:type="table" w:styleId="777">
+  <w:style w:type="table" w:styleId="823">
     <w:name w:val="Grid Table 7 Colorful - Accent 6"/>
-    <w:basedOn w:val="721"/>
+    <w:basedOn w:val="767"/>
     <w:uiPriority w:val="99"/>
     <w:pPr>
       <w:pBdr/>
@@ -14519,9 +14555,9 @@
       </w:tcPr>
     </w:tblStylePr>
   </w:style>
-  <w:style w:type="table" w:styleId="778">
+  <w:style w:type="table" w:styleId="824">
     <w:name w:val="List Table 1 Light"/>
-    <w:basedOn w:val="721"/>
+    <w:basedOn w:val="767"/>
     <w:uiPriority w:val="99"/>
     <w:pPr>
       <w:pBdr/>
@@ -14730,9 +14766,9 @@
       </w:tcPr>
     </w:tblStylePr>
   </w:style>
-  <w:style w:type="table" w:styleId="779">
+  <w:style w:type="table" w:styleId="825">
     <w:name w:val="List Table 1 Light - Accent 1"/>
-    <w:basedOn w:val="721"/>
+    <w:basedOn w:val="767"/>
     <w:uiPriority w:val="99"/>
     <w:pPr>
       <w:pBdr/>
@@ -14941,9 +14977,9 @@
       </w:tcPr>
     </w:tblStylePr>
   </w:style>
-  <w:style w:type="table" w:styleId="780">
+  <w:style w:type="table" w:styleId="826">
     <w:name w:val="List Table 1 Light - Accent 2"/>
-    <w:basedOn w:val="721"/>
+    <w:basedOn w:val="767"/>
     <w:uiPriority w:val="99"/>
     <w:pPr>
       <w:pBdr/>
@@ -15152,9 +15188,9 @@
       </w:tcPr>
     </w:tblStylePr>
   </w:style>
-  <w:style w:type="table" w:styleId="781">
+  <w:style w:type="table" w:styleId="827">
     <w:name w:val="List Table 1 Light - Accent 3"/>
-    <w:basedOn w:val="721"/>
+    <w:basedOn w:val="767"/>
     <w:uiPriority w:val="99"/>
     <w:pPr>
       <w:pBdr/>
@@ -15363,9 +15399,9 @@
       </w:tcPr>
     </w:tblStylePr>
   </w:style>
-  <w:style w:type="table" w:styleId="782">
+  <w:style w:type="table" w:styleId="828">
     <w:name w:val="List Table 1 Light - Accent 4"/>
-    <w:basedOn w:val="721"/>
+    <w:basedOn w:val="767"/>
     <w:uiPriority w:val="99"/>
     <w:pPr>
       <w:pBdr/>
@@ -15574,9 +15610,9 @@
       </w:tcPr>
     </w:tblStylePr>
   </w:style>
-  <w:style w:type="table" w:styleId="783">
+  <w:style w:type="table" w:styleId="829">
     <w:name w:val="List Table 1 Light - Accent 5"/>
-    <w:basedOn w:val="721"/>
+    <w:basedOn w:val="767"/>
     <w:uiPriority w:val="99"/>
     <w:pPr>
       <w:pBdr/>
@@ -15785,9 +15821,9 @@
       </w:tcPr>
     </w:tblStylePr>
   </w:style>
-  <w:style w:type="table" w:styleId="784">
+  <w:style w:type="table" w:styleId="830">
     <w:name w:val="List Table 1 Light - Accent 6"/>
-    <w:basedOn w:val="721"/>
+    <w:basedOn w:val="767"/>
     <w:uiPriority w:val="99"/>
     <w:pPr>
       <w:pBdr/>
@@ -15996,9 +16032,9 @@
       </w:tcPr>
     </w:tblStylePr>
   </w:style>
-  <w:style w:type="table" w:styleId="785">
+  <w:style w:type="table" w:styleId="831">
     <w:name w:val="List Table 2"/>
-    <w:basedOn w:val="721"/>
+    <w:basedOn w:val="767"/>
     <w:uiPriority w:val="99"/>
     <w:pPr>
       <w:pBdr/>
@@ -16221,9 +16257,9 @@
       </w:tcPr>
     </w:tblStylePr>
   </w:style>
-  <w:style w:type="table" w:styleId="786">
+  <w:style w:type="table" w:styleId="832">
     <w:name w:val="List Table 2 - Accent 1"/>
-    <w:basedOn w:val="721"/>
+    <w:basedOn w:val="767"/>
     <w:uiPriority w:val="99"/>
     <w:pPr>
       <w:pBdr/>
@@ -16446,9 +16482,9 @@
       </w:tcPr>
     </w:tblStylePr>
   </w:style>
-  <w:style w:type="table" w:styleId="787">
+  <w:style w:type="table" w:styleId="833">
     <w:name w:val="List Table 2 - Accent 2"/>
-    <w:basedOn w:val="721"/>
+    <w:basedOn w:val="767"/>
     <w:uiPriority w:val="99"/>
     <w:pPr>
       <w:pBdr/>
@@ -16671,9 +16707,9 @@
       </w:tcPr>
     </w:tblStylePr>
   </w:style>
-  <w:style w:type="table" w:styleId="788">
+  <w:style w:type="table" w:styleId="834">
     <w:name w:val="List Table 2 - Accent 3"/>
-    <w:basedOn w:val="721"/>
+    <w:basedOn w:val="767"/>
     <w:uiPriority w:val="99"/>
     <w:pPr>
       <w:pBdr/>
@@ -16896,9 +16932,9 @@
       </w:tcPr>
     </w:tblStylePr>
   </w:style>
-  <w:style w:type="table" w:styleId="789">
+  <w:style w:type="table" w:styleId="835">
     <w:name w:val="List Table 2 - Accent 4"/>
-    <w:basedOn w:val="721"/>
+    <w:basedOn w:val="767"/>
     <w:uiPriority w:val="99"/>
     <w:pPr>
       <w:pBdr/>
@@ -17121,9 +17157,9 @@
       </w:tcPr>
     </w:tblStylePr>
   </w:style>
-  <w:style w:type="table" w:styleId="790">
+  <w:style w:type="table" w:styleId="836">
     <w:name w:val="List Table 2 - Accent 5"/>
-    <w:basedOn w:val="721"/>
+    <w:basedOn w:val="767"/>
     <w:uiPriority w:val="99"/>
     <w:pPr>
       <w:pBdr/>
@@ -17346,9 +17382,9 @@
       </w:tcPr>
     </w:tblStylePr>
   </w:style>
-  <w:style w:type="table" w:styleId="791">
+  <w:style w:type="table" w:styleId="837">
     <w:name w:val="List Table 2 - Accent 6"/>
-    <w:basedOn w:val="721"/>
+    <w:basedOn w:val="767"/>
     <w:uiPriority w:val="99"/>
     <w:pPr>
       <w:pBdr/>
@@ -17571,9 +17607,9 @@
       </w:tcPr>
     </w:tblStylePr>
   </w:style>
-  <w:style w:type="table" w:styleId="792">
+  <w:style w:type="table" w:styleId="838">
     <w:name w:val="List Table 3"/>
-    <w:basedOn w:val="721"/>
+    <w:basedOn w:val="767"/>
     <w:uiPriority w:val="99"/>
     <w:pPr>
       <w:pBdr/>
@@ -17789,9 +17825,9 @@
       </w:tcPr>
     </w:tblStylePr>
   </w:style>
-  <w:style w:type="table" w:styleId="793">
+  <w:style w:type="table" w:styleId="839">
     <w:name w:val="List Table 3 - Accent 1"/>
-    <w:basedOn w:val="721"/>
+    <w:basedOn w:val="767"/>
     <w:uiPriority w:val="99"/>
     <w:pPr>
       <w:pBdr/>
@@ -18007,9 +18043,9 @@
       </w:tcPr>
     </w:tblStylePr>
   </w:style>
-  <w:style w:type="table" w:styleId="794">
+  <w:style w:type="table" w:styleId="840">
     <w:name w:val="List Table 3 - Accent 2"/>
-    <w:basedOn w:val="721"/>
+    <w:basedOn w:val="767"/>
     <w:uiPriority w:val="99"/>
     <w:pPr>
       <w:pBdr/>
@@ -18225,9 +18261,9 @@
       </w:tcPr>
     </w:tblStylePr>
   </w:style>
-  <w:style w:type="table" w:styleId="795">
+  <w:style w:type="table" w:styleId="841">
     <w:name w:val="List Table 3 - Accent 3"/>
-    <w:basedOn w:val="721"/>
+    <w:basedOn w:val="767"/>
     <w:uiPriority w:val="99"/>
     <w:pPr>
       <w:pBdr/>
@@ -18443,9 +18479,9 @@
       </w:tcPr>
     </w:tblStylePr>
   </w:style>
-  <w:style w:type="table" w:styleId="796">
+  <w:style w:type="table" w:styleId="842">
     <w:name w:val="List Table 3 - Accent 4"/>
-    <w:basedOn w:val="721"/>
+    <w:basedOn w:val="767"/>
     <w:uiPriority w:val="99"/>
     <w:pPr>
       <w:pBdr/>
@@ -18661,9 +18697,9 @@
       </w:tcPr>
     </w:tblStylePr>
   </w:style>
-  <w:style w:type="table" w:styleId="797">
+  <w:style w:type="table" w:styleId="843">
     <w:name w:val="List Table 3 - Accent 5"/>
-    <w:basedOn w:val="721"/>
+    <w:basedOn w:val="767"/>
     <w:uiPriority w:val="99"/>
     <w:pPr>
       <w:pBdr/>
@@ -18879,9 +18915,9 @@
       </w:tcPr>
     </w:tblStylePr>
   </w:style>
-  <w:style w:type="table" w:styleId="798">
+  <w:style w:type="table" w:styleId="844">
     <w:name w:val="List Table 3 - Accent 6"/>
-    <w:basedOn w:val="721"/>
+    <w:basedOn w:val="767"/>
     <w:uiPriority w:val="99"/>
     <w:pPr>
       <w:pBdr/>
@@ -19097,9 +19133,9 @@
       </w:tcPr>
     </w:tblStylePr>
   </w:style>
-  <w:style w:type="table" w:styleId="799">
+  <w:style w:type="table" w:styleId="845">
     <w:name w:val="List Table 4"/>
-    <w:basedOn w:val="721"/>
+    <w:basedOn w:val="767"/>
     <w:uiPriority w:val="99"/>
     <w:pPr>
       <w:pBdr/>
@@ -19312,9 +19348,9 @@
       </w:tcPr>
     </w:tblStylePr>
   </w:style>
-  <w:style w:type="table" w:styleId="800">
+  <w:style w:type="table" w:styleId="846">
     <w:name w:val="List Table 4 - Accent 1"/>
-    <w:basedOn w:val="721"/>
+    <w:basedOn w:val="767"/>
     <w:uiPriority w:val="99"/>
     <w:pPr>
       <w:pBdr/>
@@ -19527,9 +19563,9 @@
       </w:tcPr>
     </w:tblStylePr>
   </w:style>
-  <w:style w:type="table" w:styleId="801">
+  <w:style w:type="table" w:styleId="847">
     <w:name w:val="List Table 4 - Accent 2"/>
-    <w:basedOn w:val="721"/>
+    <w:basedOn w:val="767"/>
     <w:uiPriority w:val="99"/>
     <w:pPr>
       <w:pBdr/>
@@ -19742,9 +19778,9 @@
       </w:tcPr>
     </w:tblStylePr>
   </w:style>
-  <w:style w:type="table" w:styleId="802">
+  <w:style w:type="table" w:styleId="848">
     <w:name w:val="List Table 4 - Accent 3"/>
-    <w:basedOn w:val="721"/>
+    <w:basedOn w:val="767"/>
     <w:uiPriority w:val="99"/>
     <w:pPr>
       <w:pBdr/>
@@ -19957,9 +19993,9 @@
       </w:tcPr>
     </w:tblStylePr>
   </w:style>
-  <w:style w:type="table" w:styleId="803">
+  <w:style w:type="table" w:styleId="849">
     <w:name w:val="List Table 4 - Accent 4"/>
-    <w:basedOn w:val="721"/>
+    <w:basedOn w:val="767"/>
     <w:uiPriority w:val="99"/>
     <w:pPr>
       <w:pBdr/>
@@ -20172,9 +20208,9 @@
       </w:tcPr>
     </w:tblStylePr>
   </w:style>
-  <w:style w:type="table" w:styleId="804">
+  <w:style w:type="table" w:styleId="850">
     <w:name w:val="List Table 4 - Accent 5"/>
-    <w:basedOn w:val="721"/>
+    <w:basedOn w:val="767"/>
     <w:uiPriority w:val="99"/>
     <w:pPr>
       <w:pBdr/>
@@ -20387,9 +20423,9 @@
       </w:tcPr>
     </w:tblStylePr>
   </w:style>
-  <w:style w:type="table" w:styleId="805">
+  <w:style w:type="table" w:styleId="851">
     <w:name w:val="List Table 4 - Accent 6"/>
-    <w:basedOn w:val="721"/>
+    <w:basedOn w:val="767"/>
     <w:uiPriority w:val="99"/>
     <w:pPr>
       <w:pBdr/>
@@ -20602,9 +20638,9 @@
       </w:tcPr>
     </w:tblStylePr>
   </w:style>
-  <w:style w:type="table" w:styleId="806">
+  <w:style w:type="table" w:styleId="852">
     <w:name w:val="List Table 5 Dark"/>
-    <w:basedOn w:val="721"/>
+    <w:basedOn w:val="767"/>
     <w:uiPriority w:val="99"/>
     <w:pPr>
       <w:pBdr/>
@@ -20838,9 +20874,9 @@
       </w:tcPr>
     </w:tblStylePr>
   </w:style>
-  <w:style w:type="table" w:styleId="807">
+  <w:style w:type="table" w:styleId="853">
     <w:name w:val="List Table 5 Dark - Accent 1"/>
-    <w:basedOn w:val="721"/>
+    <w:basedOn w:val="767"/>
     <w:uiPriority w:val="99"/>
     <w:pPr>
       <w:pBdr/>
@@ -21074,9 +21110,9 @@
       </w:tcPr>
     </w:tblStylePr>
   </w:style>
-  <w:style w:type="table" w:styleId="808">
+  <w:style w:type="table" w:styleId="854">
     <w:name w:val="List Table 5 Dark - Accent 2"/>
-    <w:basedOn w:val="721"/>
+    <w:basedOn w:val="767"/>
     <w:uiPriority w:val="99"/>
     <w:pPr>
       <w:pBdr/>
@@ -21310,9 +21346,9 @@
       </w:tcPr>
     </w:tblStylePr>
   </w:style>
-  <w:style w:type="table" w:styleId="809">
+  <w:style w:type="table" w:styleId="855">
     <w:name w:val="List Table 5 Dark - Accent 3"/>
-    <w:basedOn w:val="721"/>
+    <w:basedOn w:val="767"/>
     <w:uiPriority w:val="99"/>
     <w:pPr>
       <w:pBdr/>
@@ -21546,9 +21582,9 @@
       </w:tcPr>
     </w:tblStylePr>
   </w:style>
-  <w:style w:type="table" w:styleId="810">
+  <w:style w:type="table" w:styleId="856">
     <w:name w:val="List Table 5 Dark - Accent 4"/>
-    <w:basedOn w:val="721"/>
+    <w:basedOn w:val="767"/>
     <w:uiPriority w:val="99"/>
     <w:pPr>
       <w:pBdr/>
@@ -21782,9 +21818,9 @@
       </w:tcPr>
     </w:tblStylePr>
   </w:style>
-  <w:style w:type="table" w:styleId="811">
+  <w:style w:type="table" w:styleId="857">
     <w:name w:val="List Table 5 Dark - Accent 5"/>
-    <w:basedOn w:val="721"/>
+    <w:basedOn w:val="767"/>
     <w:uiPriority w:val="99"/>
     <w:pPr>
       <w:pBdr/>
@@ -22018,9 +22054,9 @@
       </w:tcPr>
     </w:tblStylePr>
   </w:style>
-  <w:style w:type="table" w:styleId="812">
+  <w:style w:type="table" w:styleId="858">
     <w:name w:val="List Table 5 Dark - Accent 6"/>
-    <w:basedOn w:val="721"/>
+    <w:basedOn w:val="767"/>
     <w:uiPriority w:val="99"/>
     <w:pPr>
       <w:pBdr/>
@@ -22254,9 +22290,9 @@
       </w:tcPr>
     </w:tblStylePr>
   </w:style>
-  <w:style w:type="table" w:styleId="813">
+  <w:style w:type="table" w:styleId="859">
     <w:name w:val="List Table 6 Colorful"/>
-    <w:basedOn w:val="721"/>
+    <w:basedOn w:val="767"/>
     <w:uiPriority w:val="99"/>
     <w:pPr>
       <w:pBdr/>
@@ -22474,9 +22510,9 @@
       </w:tcPr>
     </w:tblStylePr>
   </w:style>
-  <w:style w:type="table" w:styleId="814">
+  <w:style w:type="table" w:styleId="860">
     <w:name w:val="List Table 6 Colorful - Accent 1"/>
-    <w:basedOn w:val="721"/>
+    <w:basedOn w:val="767"/>
     <w:uiPriority w:val="99"/>
     <w:pPr>
       <w:pBdr/>
@@ -22694,9 +22730,9 @@
       </w:tcPr>
     </w:tblStylePr>
   </w:style>
-  <w:style w:type="table" w:styleId="815">
+  <w:style w:type="table" w:styleId="861">
     <w:name w:val="List Table 6 Colorful - Accent 2"/>
-    <w:basedOn w:val="721"/>
+    <w:basedOn w:val="767"/>
     <w:uiPriority w:val="99"/>
     <w:pPr>
       <w:pBdr/>
@@ -22914,9 +22950,9 @@
       </w:tcPr>
     </w:tblStylePr>
   </w:style>
-  <w:style w:type="table" w:styleId="816">
+  <w:style w:type="table" w:styleId="862">
     <w:name w:val="List Table 6 Colorful - Accent 3"/>
-    <w:basedOn w:val="721"/>
+    <w:basedOn w:val="767"/>
     <w:uiPriority w:val="99"/>
     <w:pPr>
       <w:pBdr/>
@@ -23134,9 +23170,9 @@
       </w:tcPr>
     </w:tblStylePr>
   </w:style>
-  <w:style w:type="table" w:styleId="817">
+  <w:style w:type="table" w:styleId="863">
     <w:name w:val="List Table 6 Colorful - Accent 4"/>
-    <w:basedOn w:val="721"/>
+    <w:basedOn w:val="767"/>
     <w:uiPriority w:val="99"/>
     <w:pPr>
       <w:pBdr/>
@@ -23354,9 +23390,9 @@
       </w:tcPr>
     </w:tblStylePr>
   </w:style>
-  <w:style w:type="table" w:styleId="818">
+  <w:style w:type="table" w:styleId="864">
     <w:name w:val="List Table 6 Colorful - Accent 5"/>
-    <w:basedOn w:val="721"/>
+    <w:basedOn w:val="767"/>
     <w:uiPriority w:val="99"/>
     <w:pPr>
       <w:pBdr/>
@@ -23574,9 +23610,9 @@
       </w:tcPr>
     </w:tblStylePr>
   </w:style>
-  <w:style w:type="table" w:styleId="819">
+  <w:style w:type="table" w:styleId="865">
     <w:name w:val="List Table 6 Colorful - Accent 6"/>
-    <w:basedOn w:val="721"/>
+    <w:basedOn w:val="767"/>
     <w:uiPriority w:val="99"/>
     <w:pPr>
       <w:pBdr/>
@@ -23794,9 +23830,9 @@
       </w:tcPr>
     </w:tblStylePr>
   </w:style>
-  <w:style w:type="table" w:styleId="820">
+  <w:style w:type="table" w:styleId="866">
     <w:name w:val="List Table 7 Colorful"/>
-    <w:basedOn w:val="721"/>
+    <w:basedOn w:val="767"/>
     <w:uiPriority w:val="99"/>
     <w:pPr>
       <w:pBdr/>
@@ -24042,9 +24078,9 @@
       </w:tcPr>
     </w:tblStylePr>
   </w:style>
-  <w:style w:type="table" w:styleId="821">
+  <w:style w:type="table" w:styleId="867">
     <w:name w:val="List Table 7 Colorful - Accent 1"/>
-    <w:basedOn w:val="721"/>
+    <w:basedOn w:val="767"/>
     <w:uiPriority w:val="99"/>
     <w:pPr>
       <w:pBdr/>
@@ -24290,9 +24326,9 @@
       </w:tcPr>
     </w:tblStylePr>
   </w:style>
-  <w:style w:type="table" w:styleId="822">
+  <w:style w:type="table" w:styleId="868">
     <w:name w:val="List Table 7 Colorful - Accent 2"/>
-    <w:basedOn w:val="721"/>
+    <w:basedOn w:val="767"/>
     <w:uiPriority w:val="99"/>
     <w:pPr>
       <w:pBdr/>
@@ -24538,9 +24574,9 @@
       </w:tcPr>
     </w:tblStylePr>
   </w:style>
-  <w:style w:type="table" w:styleId="823">
+  <w:style w:type="table" w:styleId="869">
     <w:name w:val="List Table 7 Colorful - Accent 3"/>
-    <w:basedOn w:val="721"/>
+    <w:basedOn w:val="767"/>
     <w:uiPriority w:val="99"/>
     <w:pPr>
       <w:pBdr/>
@@ -24786,9 +24822,9 @@
       </w:tcPr>
     </w:tblStylePr>
   </w:style>
-  <w:style w:type="table" w:styleId="824">
+  <w:style w:type="table" w:styleId="870">
     <w:name w:val="List Table 7 Colorful - Accent 4"/>
-    <w:basedOn w:val="721"/>
+    <w:basedOn w:val="767"/>
     <w:uiPriority w:val="99"/>
     <w:pPr>
       <w:pBdr/>
@@ -25034,9 +25070,9 @@
       </w:tcPr>
     </w:tblStylePr>
   </w:style>
-  <w:style w:type="table" w:styleId="825">
+  <w:style w:type="table" w:styleId="871">
     <w:name w:val="List Table 7 Colorful - Accent 5"/>
-    <w:basedOn w:val="721"/>
+    <w:basedOn w:val="767"/>
     <w:uiPriority w:val="99"/>
     <w:pPr>
       <w:pBdr/>
@@ -25282,9 +25318,9 @@
       </w:tcPr>
     </w:tblStylePr>
   </w:style>
-  <w:style w:type="table" w:styleId="826">
+  <w:style w:type="table" w:styleId="872">
     <w:name w:val="List Table 7 Colorful - Accent 6"/>
-    <w:basedOn w:val="721"/>
+    <w:basedOn w:val="767"/>
     <w:uiPriority w:val="99"/>
     <w:pPr>
       <w:pBdr/>
@@ -25530,9 +25566,9 @@
       </w:tcPr>
     </w:tblStylePr>
   </w:style>
-  <w:style w:type="table" w:styleId="827">
+  <w:style w:type="table" w:styleId="873">
     <w:name w:val="Lined - Accent"/>
-    <w:basedOn w:val="721"/>
+    <w:basedOn w:val="767"/>
     <w:uiPriority w:val="99"/>
     <w:pPr>
       <w:pBdr/>
@@ -25747,9 +25783,9 @@
       </w:tcPr>
     </w:tblStylePr>
   </w:style>
-  <w:style w:type="table" w:styleId="828">
+  <w:style w:type="table" w:styleId="874">
     <w:name w:val="Lined - Accent 1"/>
-    <w:basedOn w:val="721"/>
+    <w:basedOn w:val="767"/>
     <w:uiPriority w:val="99"/>
     <w:pPr>
       <w:pBdr/>
@@ -25964,9 +26000,9 @@
       </w:tcPr>
     </w:tblStylePr>
   </w:style>
-  <w:style w:type="table" w:styleId="829">
+  <w:style w:type="table" w:styleId="875">
     <w:name w:val="Lined - Accent 2"/>
-    <w:basedOn w:val="721"/>
+    <w:basedOn w:val="767"/>
     <w:uiPriority w:val="99"/>
     <w:pPr>
       <w:pBdr/>
@@ -26181,9 +26217,9 @@
       </w:tcPr>
     </w:tblStylePr>
   </w:style>
-  <w:style w:type="table" w:styleId="830">
+  <w:style w:type="table" w:styleId="876">
     <w:name w:val="Lined - Accent 3"/>
-    <w:basedOn w:val="721"/>
+    <w:basedOn w:val="767"/>
     <w:uiPriority w:val="99"/>
     <w:pPr>
       <w:pBdr/>
@@ -26398,9 +26434,9 @@
       </w:tcPr>
     </w:tblStylePr>
   </w:style>
-  <w:style w:type="table" w:styleId="831">
+  <w:style w:type="table" w:styleId="877">
     <w:name w:val="Lined - Accent 4"/>
-    <w:basedOn w:val="721"/>
+    <w:basedOn w:val="767"/>
     <w:uiPriority w:val="99"/>
     <w:pPr>
       <w:pBdr/>
@@ -26615,9 +26651,9 @@
       </w:tcPr>
     </w:tblStylePr>
   </w:style>
-  <w:style w:type="table" w:styleId="832">
+  <w:style w:type="table" w:styleId="878">
     <w:name w:val="Lined - Accent 5"/>
-    <w:basedOn w:val="721"/>
+    <w:basedOn w:val="767"/>
     <w:uiPriority w:val="99"/>
     <w:pPr>
       <w:pBdr/>
@@ -26832,9 +26868,9 @@
       </w:tcPr>
     </w:tblStylePr>
   </w:style>
-  <w:style w:type="table" w:styleId="833">
+  <w:style w:type="table" w:styleId="879">
     <w:name w:val="Lined - Accent 6"/>
-    <w:basedOn w:val="721"/>
+    <w:basedOn w:val="767"/>
     <w:uiPriority w:val="99"/>
     <w:pPr>
       <w:pBdr/>
@@ -27049,9 +27085,9 @@
       </w:tcPr>
     </w:tblStylePr>
   </w:style>
-  <w:style w:type="table" w:styleId="834">
+  <w:style w:type="table" w:styleId="880">
     <w:name w:val="Bordered &amp; Lined - Accent"/>
-    <w:basedOn w:val="721"/>
+    <w:basedOn w:val="767"/>
     <w:uiPriority w:val="99"/>
     <w:pPr>
       <w:pBdr/>
@@ -27273,9 +27309,9 @@
       </w:tcPr>
     </w:tblStylePr>
   </w:style>
-  <w:style w:type="table" w:styleId="835">
+  <w:style w:type="table" w:styleId="881">
     <w:name w:val="Bordered &amp; Lined - Accent 1"/>
-    <w:basedOn w:val="721"/>
+    <w:basedOn w:val="767"/>
     <w:uiPriority w:val="99"/>
     <w:pPr>
       <w:pBdr/>
@@ -27497,9 +27533,9 @@
       </w:tcPr>
     </w:tblStylePr>
   </w:style>
-  <w:style w:type="table" w:styleId="836">
+  <w:style w:type="table" w:styleId="882">
     <w:name w:val="Bordered &amp; Lined - Accent 2"/>
-    <w:basedOn w:val="721"/>
+    <w:basedOn w:val="767"/>
     <w:uiPriority w:val="99"/>
     <w:pPr>
       <w:pBdr/>
@@ -27721,9 +27757,9 @@
       </w:tcPr>
     </w:tblStylePr>
   </w:style>
-  <w:style w:type="table" w:styleId="837">
+  <w:style w:type="table" w:styleId="883">
     <w:name w:val="Bordered &amp; Lined - Accent 3"/>
-    <w:basedOn w:val="721"/>
+    <w:basedOn w:val="767"/>
     <w:uiPriority w:val="99"/>
     <w:pPr>
       <w:pBdr/>
@@ -27945,9 +27981,9 @@
       </w:tcPr>
     </w:tblStylePr>
   </w:style>
-  <w:style w:type="table" w:styleId="838">
+  <w:style w:type="table" w:styleId="884">
     <w:name w:val="Bordered &amp; Lined - Accent 4"/>
-    <w:basedOn w:val="721"/>
+    <w:basedOn w:val="767"/>
     <w:uiPriority w:val="99"/>
     <w:pPr>
       <w:pBdr/>
@@ -28169,9 +28205,9 @@
       </w:tcPr>
     </w:tblStylePr>
   </w:style>
-  <w:style w:type="table" w:styleId="839">
+  <w:style w:type="table" w:styleId="885">
     <w:name w:val="Bordered &amp; Lined - Accent 5"/>
-    <w:basedOn w:val="721"/>
+    <w:basedOn w:val="767"/>
     <w:uiPriority w:val="99"/>
     <w:pPr>
       <w:pBdr/>
@@ -28393,9 +28429,9 @@
       </w:tcPr>
     </w:tblStylePr>
   </w:style>
-  <w:style w:type="table" w:styleId="840">
+  <w:style w:type="table" w:styleId="886">
     <w:name w:val="Bordered &amp; Lined - Accent 6"/>
-    <w:basedOn w:val="721"/>
+    <w:basedOn w:val="767"/>
     <w:uiPriority w:val="99"/>
     <w:pPr>
       <w:pBdr/>
@@ -28617,9 +28653,9 @@
       </w:tcPr>
     </w:tblStylePr>
   </w:style>
-  <w:style w:type="table" w:styleId="841">
+  <w:style w:type="table" w:styleId="887">
     <w:name w:val="Bordered"/>
-    <w:basedOn w:val="721"/>
+    <w:basedOn w:val="767"/>
     <w:uiPriority w:val="99"/>
     <w:pPr>
       <w:pBdr/>
@@ -28837,9 +28873,9 @@
       </w:tcPr>
     </w:tblStylePr>
   </w:style>
-  <w:style w:type="table" w:styleId="842">
+  <w:style w:type="table" w:styleId="888">
     <w:name w:val="Bordered - Accent 1"/>
-    <w:basedOn w:val="721"/>
+    <w:basedOn w:val="767"/>
     <w:uiPriority w:val="99"/>
     <w:pPr>
       <w:pBdr/>
@@ -29057,9 +29093,9 @@
       </w:tcPr>
     </w:tblStylePr>
   </w:style>
-  <w:style w:type="table" w:styleId="843">
+  <w:style w:type="table" w:styleId="889">
     <w:name w:val="Bordered - Accent 2"/>
-    <w:basedOn w:val="721"/>
+    <w:basedOn w:val="767"/>
     <w:uiPriority w:val="99"/>
     <w:pPr>
       <w:pBdr/>
@@ -29277,9 +29313,9 @@
       </w:tcPr>
     </w:tblStylePr>
   </w:style>
-  <w:style w:type="table" w:styleId="844">
+  <w:style w:type="table" w:styleId="890">
     <w:name w:val="Bordered - Accent 3"/>
-    <w:basedOn w:val="721"/>
+    <w:basedOn w:val="767"/>
     <w:uiPriority w:val="99"/>
     <w:pPr>
       <w:pBdr/>
@@ -29497,9 +29533,9 @@
       </w:tcPr>
     </w:tblStylePr>
   </w:style>
-  <w:style w:type="table" w:styleId="845">
+  <w:style w:type="table" w:styleId="891">
     <w:name w:val="Bordered - Accent 4"/>
-    <w:basedOn w:val="721"/>
+    <w:basedOn w:val="767"/>
     <w:uiPriority w:val="99"/>
     <w:pPr>
       <w:pBdr/>
@@ -29717,9 +29753,9 @@
       </w:tcPr>
     </w:tblStylePr>
   </w:style>
-  <w:style w:type="table" w:styleId="846">
+  <w:style w:type="table" w:styleId="892">
     <w:name w:val="Bordered - Accent 5"/>
-    <w:basedOn w:val="721"/>
+    <w:basedOn w:val="767"/>
     <w:uiPriority w:val="99"/>
     <w:pPr>
       <w:pBdr/>
@@ -29937,9 +29973,9 @@
       </w:tcPr>
     </w:tblStylePr>
   </w:style>
-  <w:style w:type="table" w:styleId="847">
+  <w:style w:type="table" w:styleId="893">
     <w:name w:val="Bordered - Accent 6"/>
-    <w:basedOn w:val="721"/>
+    <w:basedOn w:val="767"/>
     <w:uiPriority w:val="99"/>
     <w:pPr>
       <w:pBdr/>

</xml_diff>

<commit_message>
Effort to have the user name and device id displayed as text for the screensaver.
</commit_message>
<xml_diff>
--- a/Misc documents  and software/thanks for buying Zen rob.docx
+++ b/Misc documents  and software/thanks for buying Zen rob.docx
@@ -121,7 +121,7 @@
                 <o:lock v:ext="edit" aspectratio="t"/>
               </v:shapetype>
               <v:shape id="_x0000_i0" o:spid="_x0000_s0" type="#_x0000_t75" style="position:absolute;z-index:-2;o:allowoverlap:true;o:allowincell:true;mso-position-horizontal-relative:text;margin-left:105.75pt;mso-position-horizontal:absolute;mso-position-vertical-relative:text;margin-top:0.40pt;mso-position-vertical:absolute;width:47.75pt;height:46.40pt;mso-wrap-distance-left:0.00pt;mso-wrap-distance-top:0.00pt;mso-wrap-distance-right:0.00pt;mso-wrap-distance-bottom:0.00pt;z-index:1;" stroked="false">
-                <v:imagedata r:id="rId8" o:title=""/>
+                <v:imagedata r:id="rId8" o:title="" croptop="0f" cropleft="0f" cropbottom="1380f" cropright="0f"/>
                 <o:lock v:ext="edit" rotation="t"/>
               </v:shape>
             </w:pict>
@@ -372,7 +372,39 @@
           <w:sz w:val="15"/>
           <w:szCs w:val="15"/>
         </w:rPr>
-        <w:t xml:space="preserve">01-31</w:t>
+        <w:t xml:space="preserve">0</w:t>
+      </w:r>
+      <w:r>
+        <w:rPr>
+          <w:rFonts w:ascii="Liberation Sans" w:hAnsi="Liberation Sans"/>
+          <w:b w:val="0"/>
+          <w:bCs w:val="0"/>
+          <w:sz w:val="15"/>
+          <w:szCs w:val="15"/>
+          <w:lang w:val="ja-JP"/>
+        </w:rPr>
+        <w:t xml:space="preserve">2</w:t>
+      </w:r>
+      <w:r>
+        <w:rPr>
+          <w:rFonts w:ascii="Liberation Sans" w:hAnsi="Liberation Sans"/>
+          <w:b w:val="0"/>
+          <w:bCs w:val="0"/>
+          <w:sz w:val="15"/>
+          <w:szCs w:val="15"/>
+        </w:rPr>
+        <w:t xml:space="preserve">-</w:t>
+      </w:r>
+      <w:r>
+        <w:rPr>
+          <w:rFonts w:ascii="Liberation Sans" w:hAnsi="Liberation Sans"/>
+          <w:b w:val="0"/>
+          <w:bCs w:val="0"/>
+          <w:sz w:val="15"/>
+          <w:szCs w:val="15"/>
+          <w:lang w:val="ja-JP"/>
+        </w:rPr>
+        <w:t xml:space="preserve">28</w:t>
       </w:r>
       <w:r>
         <w:rPr>

</xml_diff>

<commit_message>
V5.x.x boards idea (with notecard) and fix path trailing space og a folder
</commit_message>
<xml_diff>
--- a/Misc documents  and software/thanks for buying Zen rob.docx
+++ b/Misc documents  and software/thanks for buying Zen rob.docx
@@ -371,19 +371,9 @@
           <w:bCs w:val="0"/>
           <w:sz w:val="15"/>
           <w:szCs w:val="15"/>
-        </w:rPr>
-        <w:t xml:space="preserve">0</w:t>
-      </w:r>
-      <w:r>
-        <w:rPr>
-          <w:rFonts w:ascii="Liberation Sans" w:hAnsi="Liberation Sans"/>
-          <w:b w:val="0"/>
-          <w:bCs w:val="0"/>
-          <w:sz w:val="15"/>
-          <w:szCs w:val="15"/>
           <w:lang w:val="ja-JP"/>
         </w:rPr>
-        <w:t xml:space="preserve">2</w:t>
+        <w:t xml:space="preserve">04</w:t>
       </w:r>
       <w:r>
         <w:rPr>
@@ -404,16 +394,7 @@
           <w:szCs w:val="15"/>
           <w:lang w:val="ja-JP"/>
         </w:rPr>
-        <w:t xml:space="preserve">28</w:t>
-      </w:r>
-      <w:r>
-        <w:rPr>
-          <w:rFonts w:ascii="Liberation Sans" w:hAnsi="Liberation Sans"/>
-          <w:b w:val="0"/>
-          <w:bCs w:val="0"/>
-          <w:sz w:val="15"/>
-          <w:szCs w:val="15"/>
-        </w:rPr>
+        <w:t xml:space="preserve">14</w:t>
       </w:r>
       <w:r>
         <w:rPr>

</xml_diff>

<commit_message>
Update V4.2.0 boards and V5.x.x. boards
</commit_message>
<xml_diff>
--- a/Misc documents  and software/thanks for buying Zen rob.docx
+++ b/Misc documents  and software/thanks for buying Zen rob.docx
@@ -4,7 +4,7 @@
   <w:body>
     <w:p>
       <w:pPr>
-        <w:pStyle w:val="706"/>
+        <w:pStyle w:val="710"/>
         <w:pBdr/>
         <w:bidi w:val="false"/>
         <w:spacing/>
@@ -36,7 +36,7 @@
     </w:p>
     <w:p>
       <w:pPr>
-        <w:pStyle w:val="706"/>
+        <w:pStyle w:val="710"/>
         <w:pBdr/>
         <w:bidi w:val="false"/>
         <w:spacing/>
@@ -159,7 +159,7 @@
     </w:p>
     <w:p>
       <w:pPr>
-        <w:pStyle w:val="706"/>
+        <w:pStyle w:val="710"/>
         <w:pBdr/>
         <w:bidi w:val="false"/>
         <w:spacing/>
@@ -204,7 +204,7 @@
     </w:p>
     <w:p>
       <w:pPr>
-        <w:pStyle w:val="706"/>
+        <w:pStyle w:val="710"/>
         <w:pBdr/>
         <w:bidi w:val="false"/>
         <w:spacing/>
@@ -248,7 +248,7 @@
     </w:p>
     <w:p>
       <w:pPr>
-        <w:pStyle w:val="706"/>
+        <w:pStyle w:val="710"/>
         <w:pBdr/>
         <w:bidi w:val="false"/>
         <w:spacing/>
@@ -293,7 +293,7 @@
     </w:p>
     <w:p>
       <w:pPr>
-        <w:pStyle w:val="706"/>
+        <w:pStyle w:val="710"/>
         <w:widowControl w:val="true"/>
         <w:pBdr/>
         <w:bidi w:val="false"/>
@@ -339,7 +339,7 @@
     </w:p>
     <w:p>
       <w:pPr>
-        <w:pStyle w:val="706"/>
+        <w:pStyle w:val="710"/>
         <w:widowControl w:val="true"/>
         <w:pBdr/>
         <w:bidi w:val="false"/>
@@ -373,7 +373,18 @@
           <w:szCs w:val="15"/>
           <w:lang w:val="ja-JP"/>
         </w:rPr>
-        <w:t xml:space="preserve">04</w:t>
+        <w:t xml:space="preserve">0</w:t>
+      </w:r>
+      <w:r>
+        <w:rPr>
+          <w:rFonts w:ascii="Liberation Sans" w:hAnsi="Liberation Sans"/>
+          <w:b w:val="0"/>
+          <w:bCs w:val="0"/>
+          <w:sz w:val="15"/>
+          <w:szCs w:val="15"/>
+          <w:lang w:val="ja-JP"/>
+        </w:rPr>
+        <w:t xml:space="preserve">7</w:t>
       </w:r>
       <w:r>
         <w:rPr>
@@ -394,7 +405,7 @@
           <w:szCs w:val="15"/>
           <w:lang w:val="ja-JP"/>
         </w:rPr>
-        <w:t xml:space="preserve">14</w:t>
+        <w:t xml:space="preserve">30</w:t>
       </w:r>
       <w:r>
         <w:rPr>
@@ -642,10 +653,24 @@
     <w:lsdException w:name="Bibliography" w:uiPriority="37"/>
     <w:lsdException w:name="TOC Heading" w:uiPriority="39" w:qFormat="1"/>
   </w:latentStyles>
-  <w:style w:type="paragraph" w:styleId="697">
+  <w:style w:type="character" w:styleId="197">
+    <w:name w:val="Placeholder Text"/>
+    <w:basedOn w:val="720"/>
+    <w:uiPriority w:val="99"/>
+    <w:semiHidden/>
+    <w:pPr>
+      <w:pBdr/>
+      <w:spacing/>
+      <w:ind/>
+    </w:pPr>
+    <w:rPr>
+      <w:color w:val="666666"/>
+    </w:rPr>
+  </w:style>
+  <w:style w:type="paragraph" w:styleId="701">
     <w:name w:val="toc 1"/>
-    <w:basedOn w:val="706"/>
-    <w:next w:val="706"/>
+    <w:basedOn w:val="710"/>
+    <w:next w:val="710"/>
     <w:uiPriority w:val="39"/>
     <w:unhideWhenUsed/>
     <w:pPr>
@@ -654,10 +679,10 @@
       <w:ind/>
     </w:pPr>
   </w:style>
-  <w:style w:type="paragraph" w:styleId="698">
+  <w:style w:type="paragraph" w:styleId="702">
     <w:name w:val="toc 2"/>
-    <w:basedOn w:val="706"/>
-    <w:next w:val="706"/>
+    <w:basedOn w:val="710"/>
+    <w:next w:val="710"/>
     <w:uiPriority w:val="39"/>
     <w:unhideWhenUsed/>
     <w:pPr>
@@ -666,10 +691,10 @@
       <w:ind w:left="220"/>
     </w:pPr>
   </w:style>
-  <w:style w:type="paragraph" w:styleId="699">
+  <w:style w:type="paragraph" w:styleId="703">
     <w:name w:val="toc 3"/>
-    <w:basedOn w:val="706"/>
-    <w:next w:val="706"/>
+    <w:basedOn w:val="710"/>
+    <w:next w:val="710"/>
     <w:uiPriority w:val="39"/>
     <w:unhideWhenUsed/>
     <w:pPr>
@@ -678,10 +703,10 @@
       <w:ind w:left="440"/>
     </w:pPr>
   </w:style>
-  <w:style w:type="paragraph" w:styleId="700">
+  <w:style w:type="paragraph" w:styleId="704">
     <w:name w:val="toc 4"/>
-    <w:basedOn w:val="706"/>
-    <w:next w:val="706"/>
+    <w:basedOn w:val="710"/>
+    <w:next w:val="710"/>
     <w:uiPriority w:val="39"/>
     <w:unhideWhenUsed/>
     <w:pPr>
@@ -690,10 +715,10 @@
       <w:ind w:left="660"/>
     </w:pPr>
   </w:style>
-  <w:style w:type="paragraph" w:styleId="701">
+  <w:style w:type="paragraph" w:styleId="705">
     <w:name w:val="toc 5"/>
-    <w:basedOn w:val="706"/>
-    <w:next w:val="706"/>
+    <w:basedOn w:val="710"/>
+    <w:next w:val="710"/>
     <w:uiPriority w:val="39"/>
     <w:unhideWhenUsed/>
     <w:pPr>
@@ -702,10 +727,10 @@
       <w:ind w:left="880"/>
     </w:pPr>
   </w:style>
-  <w:style w:type="paragraph" w:styleId="702">
+  <w:style w:type="paragraph" w:styleId="706">
     <w:name w:val="toc 6"/>
-    <w:basedOn w:val="706"/>
-    <w:next w:val="706"/>
+    <w:basedOn w:val="710"/>
+    <w:next w:val="710"/>
     <w:uiPriority w:val="39"/>
     <w:unhideWhenUsed/>
     <w:pPr>
@@ -714,10 +739,10 @@
       <w:ind w:left="1100"/>
     </w:pPr>
   </w:style>
-  <w:style w:type="paragraph" w:styleId="703">
+  <w:style w:type="paragraph" w:styleId="707">
     <w:name w:val="toc 7"/>
-    <w:basedOn w:val="706"/>
-    <w:next w:val="706"/>
+    <w:basedOn w:val="710"/>
+    <w:next w:val="710"/>
     <w:uiPriority w:val="39"/>
     <w:unhideWhenUsed/>
     <w:pPr>
@@ -726,10 +751,10 @@
       <w:ind w:left="1320"/>
     </w:pPr>
   </w:style>
-  <w:style w:type="paragraph" w:styleId="704">
+  <w:style w:type="paragraph" w:styleId="708">
     <w:name w:val="toc 8"/>
-    <w:basedOn w:val="706"/>
-    <w:next w:val="706"/>
+    <w:basedOn w:val="710"/>
+    <w:next w:val="710"/>
     <w:uiPriority w:val="39"/>
     <w:unhideWhenUsed/>
     <w:pPr>
@@ -738,10 +763,10 @@
       <w:ind w:left="1540"/>
     </w:pPr>
   </w:style>
-  <w:style w:type="paragraph" w:styleId="705">
+  <w:style w:type="paragraph" w:styleId="709">
     <w:name w:val="toc 9"/>
-    <w:basedOn w:val="706"/>
-    <w:next w:val="706"/>
+    <w:basedOn w:val="710"/>
+    <w:next w:val="710"/>
     <w:uiPriority w:val="39"/>
     <w:unhideWhenUsed/>
     <w:pPr>
@@ -750,7 +775,7 @@
       <w:ind w:left="1760"/>
     </w:pPr>
   </w:style>
-  <w:style w:type="paragraph" w:styleId="706" w:default="1">
+  <w:style w:type="paragraph" w:styleId="710" w:default="1">
     <w:name w:val="Normal"/>
     <w:qFormat/>
     <w:pPr>
@@ -769,11 +794,11 @@
       <w:lang w:val="en-US" w:eastAsia="zh-CN" w:bidi="hi-IN"/>
     </w:rPr>
   </w:style>
-  <w:style w:type="paragraph" w:styleId="707">
+  <w:style w:type="paragraph" w:styleId="711">
     <w:name w:val="Heading 1"/>
-    <w:basedOn w:val="706"/>
-    <w:next w:val="706"/>
-    <w:link w:val="717"/>
+    <w:basedOn w:val="710"/>
+    <w:next w:val="710"/>
+    <w:link w:val="721"/>
     <w:uiPriority w:val="9"/>
     <w:qFormat/>
     <w:pPr>
@@ -791,11 +816,11 @@
       <w:szCs w:val="40"/>
     </w:rPr>
   </w:style>
-  <w:style w:type="paragraph" w:styleId="708">
+  <w:style w:type="paragraph" w:styleId="712">
     <w:name w:val="Heading 2"/>
-    <w:basedOn w:val="706"/>
-    <w:next w:val="706"/>
-    <w:link w:val="718"/>
+    <w:basedOn w:val="710"/>
+    <w:next w:val="710"/>
+    <w:link w:val="722"/>
     <w:uiPriority w:val="9"/>
     <w:unhideWhenUsed/>
     <w:qFormat/>
@@ -814,11 +839,11 @@
       <w:szCs w:val="32"/>
     </w:rPr>
   </w:style>
-  <w:style w:type="paragraph" w:styleId="709">
+  <w:style w:type="paragraph" w:styleId="713">
     <w:name w:val="Heading 3"/>
-    <w:basedOn w:val="706"/>
-    <w:next w:val="706"/>
-    <w:link w:val="719"/>
+    <w:basedOn w:val="710"/>
+    <w:next w:val="710"/>
+    <w:link w:val="723"/>
     <w:uiPriority w:val="9"/>
     <w:unhideWhenUsed/>
     <w:qFormat/>
@@ -837,11 +862,11 @@
       <w:szCs w:val="28"/>
     </w:rPr>
   </w:style>
-  <w:style w:type="paragraph" w:styleId="710">
+  <w:style w:type="paragraph" w:styleId="714">
     <w:name w:val="Heading 4"/>
-    <w:basedOn w:val="706"/>
-    <w:next w:val="706"/>
-    <w:link w:val="720"/>
+    <w:basedOn w:val="710"/>
+    <w:next w:val="710"/>
+    <w:link w:val="724"/>
     <w:uiPriority w:val="9"/>
     <w:unhideWhenUsed/>
     <w:qFormat/>
@@ -860,11 +885,11 @@
       <w:color w:val="0f4761" w:themeColor="accent1" w:themeShade="BF"/>
     </w:rPr>
   </w:style>
-  <w:style w:type="paragraph" w:styleId="711">
+  <w:style w:type="paragraph" w:styleId="715">
     <w:name w:val="Heading 5"/>
-    <w:basedOn w:val="706"/>
-    <w:next w:val="706"/>
-    <w:link w:val="721"/>
+    <w:basedOn w:val="710"/>
+    <w:next w:val="710"/>
+    <w:link w:val="725"/>
     <w:uiPriority w:val="9"/>
     <w:unhideWhenUsed/>
     <w:qFormat/>
@@ -881,11 +906,11 @@
       <w:color w:val="0f4761" w:themeColor="accent1" w:themeShade="BF"/>
     </w:rPr>
   </w:style>
-  <w:style w:type="paragraph" w:styleId="712">
+  <w:style w:type="paragraph" w:styleId="716">
     <w:name w:val="Heading 6"/>
-    <w:basedOn w:val="706"/>
-    <w:next w:val="706"/>
-    <w:link w:val="722"/>
+    <w:basedOn w:val="710"/>
+    <w:next w:val="710"/>
+    <w:link w:val="726"/>
     <w:uiPriority w:val="9"/>
     <w:unhideWhenUsed/>
     <w:qFormat/>
@@ -904,11 +929,11 @@
       <w:color w:val="595959" w:themeColor="text1" w:themeTint="A6"/>
     </w:rPr>
   </w:style>
-  <w:style w:type="paragraph" w:styleId="713">
+  <w:style w:type="paragraph" w:styleId="717">
     <w:name w:val="Heading 7"/>
-    <w:basedOn w:val="706"/>
-    <w:next w:val="706"/>
-    <w:link w:val="723"/>
+    <w:basedOn w:val="710"/>
+    <w:next w:val="710"/>
+    <w:link w:val="727"/>
     <w:uiPriority w:val="9"/>
     <w:unhideWhenUsed/>
     <w:qFormat/>
@@ -925,11 +950,11 @@
       <w:color w:val="595959" w:themeColor="text1" w:themeTint="A6"/>
     </w:rPr>
   </w:style>
-  <w:style w:type="paragraph" w:styleId="714">
+  <w:style w:type="paragraph" w:styleId="718">
     <w:name w:val="Heading 8"/>
-    <w:basedOn w:val="706"/>
-    <w:next w:val="706"/>
-    <w:link w:val="724"/>
+    <w:basedOn w:val="710"/>
+    <w:next w:val="710"/>
+    <w:link w:val="728"/>
     <w:uiPriority w:val="9"/>
     <w:unhideWhenUsed/>
     <w:qFormat/>
@@ -948,11 +973,11 @@
       <w:color w:val="272727" w:themeColor="text1" w:themeTint="D8"/>
     </w:rPr>
   </w:style>
-  <w:style w:type="paragraph" w:styleId="715">
+  <w:style w:type="paragraph" w:styleId="719">
     <w:name w:val="Heading 9"/>
-    <w:basedOn w:val="706"/>
-    <w:next w:val="706"/>
-    <w:link w:val="725"/>
+    <w:basedOn w:val="710"/>
+    <w:next w:val="710"/>
+    <w:link w:val="729"/>
     <w:uiPriority w:val="9"/>
     <w:unhideWhenUsed/>
     <w:qFormat/>
@@ -971,7 +996,7 @@
       <w:color w:val="272727" w:themeColor="text1" w:themeTint="D8"/>
     </w:rPr>
   </w:style>
-  <w:style w:type="character" w:styleId="716" w:default="1">
+  <w:style w:type="character" w:styleId="720" w:default="1">
     <w:name w:val="Default Paragraph Font"/>
     <w:uiPriority w:val="1"/>
     <w:semiHidden/>
@@ -983,10 +1008,10 @@
       <w:ind/>
     </w:pPr>
   </w:style>
-  <w:style w:type="character" w:styleId="717">
+  <w:style w:type="character" w:styleId="721">
     <w:name w:val="Heading 1 Char"/>
-    <w:basedOn w:val="716"/>
-    <w:link w:val="707"/>
+    <w:basedOn w:val="720"/>
+    <w:link w:val="711"/>
     <w:uiPriority w:val="9"/>
     <w:qFormat/>
     <w:pPr>
@@ -1001,10 +1026,10 @@
       <w:szCs w:val="40"/>
     </w:rPr>
   </w:style>
-  <w:style w:type="character" w:styleId="718">
+  <w:style w:type="character" w:styleId="722">
     <w:name w:val="Heading 2 Char"/>
-    <w:basedOn w:val="716"/>
-    <w:link w:val="708"/>
+    <w:basedOn w:val="720"/>
+    <w:link w:val="712"/>
     <w:uiPriority w:val="9"/>
     <w:qFormat/>
     <w:pPr>
@@ -1019,10 +1044,10 @@
       <w:szCs w:val="32"/>
     </w:rPr>
   </w:style>
-  <w:style w:type="character" w:styleId="719">
+  <w:style w:type="character" w:styleId="723">
     <w:name w:val="Heading 3 Char"/>
-    <w:basedOn w:val="716"/>
-    <w:link w:val="709"/>
+    <w:basedOn w:val="720"/>
+    <w:link w:val="713"/>
     <w:uiPriority w:val="9"/>
     <w:qFormat/>
     <w:pPr>
@@ -1037,10 +1062,10 @@
       <w:szCs w:val="28"/>
     </w:rPr>
   </w:style>
-  <w:style w:type="character" w:styleId="720">
+  <w:style w:type="character" w:styleId="724">
     <w:name w:val="Heading 4 Char"/>
-    <w:basedOn w:val="716"/>
-    <w:link w:val="710"/>
+    <w:basedOn w:val="720"/>
+    <w:link w:val="714"/>
     <w:uiPriority w:val="9"/>
     <w:qFormat/>
     <w:pPr>
@@ -1055,10 +1080,10 @@
       <w:color w:val="0f4761" w:themeColor="accent1" w:themeShade="BF"/>
     </w:rPr>
   </w:style>
-  <w:style w:type="character" w:styleId="721">
+  <w:style w:type="character" w:styleId="725">
     <w:name w:val="Heading 5 Char"/>
-    <w:basedOn w:val="716"/>
-    <w:link w:val="711"/>
+    <w:basedOn w:val="720"/>
+    <w:link w:val="715"/>
     <w:uiPriority w:val="9"/>
     <w:qFormat/>
     <w:pPr>
@@ -1071,10 +1096,10 @@
       <w:color w:val="0f4761" w:themeColor="accent1" w:themeShade="BF"/>
     </w:rPr>
   </w:style>
-  <w:style w:type="character" w:styleId="722">
+  <w:style w:type="character" w:styleId="726">
     <w:name w:val="Heading 6 Char"/>
-    <w:basedOn w:val="716"/>
-    <w:link w:val="712"/>
+    <w:basedOn w:val="720"/>
+    <w:link w:val="716"/>
     <w:uiPriority w:val="9"/>
     <w:qFormat/>
     <w:pPr>
@@ -1089,10 +1114,10 @@
       <w:color w:val="595959" w:themeColor="text1" w:themeTint="A6"/>
     </w:rPr>
   </w:style>
-  <w:style w:type="character" w:styleId="723">
+  <w:style w:type="character" w:styleId="727">
     <w:name w:val="Heading 7 Char"/>
-    <w:basedOn w:val="716"/>
-    <w:link w:val="713"/>
+    <w:basedOn w:val="720"/>
+    <w:link w:val="717"/>
     <w:uiPriority w:val="9"/>
     <w:qFormat/>
     <w:pPr>
@@ -1105,10 +1130,10 @@
       <w:color w:val="595959" w:themeColor="text1" w:themeTint="A6"/>
     </w:rPr>
   </w:style>
-  <w:style w:type="character" w:styleId="724">
+  <w:style w:type="character" w:styleId="728">
     <w:name w:val="Heading 8 Char"/>
-    <w:basedOn w:val="716"/>
-    <w:link w:val="714"/>
+    <w:basedOn w:val="720"/>
+    <w:link w:val="718"/>
     <w:uiPriority w:val="9"/>
     <w:qFormat/>
     <w:pPr>
@@ -1123,10 +1148,10 @@
       <w:color w:val="272727" w:themeColor="text1" w:themeTint="D8"/>
     </w:rPr>
   </w:style>
-  <w:style w:type="character" w:styleId="725">
+  <w:style w:type="character" w:styleId="729">
     <w:name w:val="Heading 9 Char"/>
-    <w:basedOn w:val="716"/>
-    <w:link w:val="715"/>
+    <w:basedOn w:val="720"/>
+    <w:link w:val="719"/>
     <w:uiPriority w:val="9"/>
     <w:qFormat/>
     <w:pPr>
@@ -1141,10 +1166,10 @@
       <w:color w:val="272727" w:themeColor="text1" w:themeTint="D8"/>
     </w:rPr>
   </w:style>
-  <w:style w:type="character" w:styleId="726">
+  <w:style w:type="character" w:styleId="730">
     <w:name w:val="Title Char"/>
-    <w:basedOn w:val="716"/>
-    <w:link w:val="752"/>
+    <w:basedOn w:val="720"/>
+    <w:link w:val="756"/>
     <w:uiPriority w:val="10"/>
     <w:qFormat/>
     <w:pPr>
@@ -1159,10 +1184,10 @@
       <w:szCs w:val="56"/>
     </w:rPr>
   </w:style>
-  <w:style w:type="character" w:styleId="727">
+  <w:style w:type="character" w:styleId="731">
     <w:name w:val="Subtitle Char"/>
-    <w:basedOn w:val="716"/>
-    <w:link w:val="753"/>
+    <w:basedOn w:val="720"/>
+    <w:link w:val="757"/>
     <w:uiPriority w:val="11"/>
     <w:qFormat/>
     <w:pPr>
@@ -1177,10 +1202,10 @@
       <w:szCs w:val="28"/>
     </w:rPr>
   </w:style>
-  <w:style w:type="character" w:styleId="728">
+  <w:style w:type="character" w:styleId="732">
     <w:name w:val="Quote Char"/>
-    <w:basedOn w:val="716"/>
-    <w:link w:val="754"/>
+    <w:basedOn w:val="720"/>
+    <w:link w:val="758"/>
     <w:uiPriority w:val="29"/>
     <w:qFormat/>
     <w:pPr>
@@ -1194,9 +1219,9 @@
       <w:color w:val="404040" w:themeColor="text1" w:themeTint="BF"/>
     </w:rPr>
   </w:style>
-  <w:style w:type="character" w:styleId="729">
+  <w:style w:type="character" w:styleId="733">
     <w:name w:val="Intense Emphasis"/>
-    <w:basedOn w:val="716"/>
+    <w:basedOn w:val="720"/>
     <w:uiPriority w:val="21"/>
     <w:qFormat/>
     <w:pPr>
@@ -1210,10 +1235,10 @@
       <w:color w:val="0f4761" w:themeColor="accent1" w:themeShade="BF"/>
     </w:rPr>
   </w:style>
-  <w:style w:type="character" w:styleId="730">
+  <w:style w:type="character" w:styleId="734">
     <w:name w:val="Intense Quote Char"/>
-    <w:basedOn w:val="716"/>
-    <w:link w:val="756"/>
+    <w:basedOn w:val="720"/>
+    <w:link w:val="760"/>
     <w:uiPriority w:val="30"/>
     <w:qFormat/>
     <w:pPr>
@@ -1227,9 +1252,9 @@
       <w:color w:val="0f4761" w:themeColor="accent1" w:themeShade="BF"/>
     </w:rPr>
   </w:style>
-  <w:style w:type="character" w:styleId="731">
+  <w:style w:type="character" w:styleId="735">
     <w:name w:val="Intense Reference"/>
-    <w:basedOn w:val="716"/>
+    <w:basedOn w:val="720"/>
     <w:uiPriority w:val="32"/>
     <w:qFormat/>
     <w:pPr>
@@ -1245,9 +1270,9 @@
       <w:spacing w:val="5"/>
     </w:rPr>
   </w:style>
-  <w:style w:type="character" w:styleId="732">
+  <w:style w:type="character" w:styleId="736">
     <w:name w:val="Subtle Emphasis"/>
-    <w:basedOn w:val="716"/>
+    <w:basedOn w:val="720"/>
     <w:uiPriority w:val="19"/>
     <w:qFormat/>
     <w:pPr>
@@ -1261,9 +1286,9 @@
       <w:color w:val="404040" w:themeColor="text1" w:themeTint="BF"/>
     </w:rPr>
   </w:style>
-  <w:style w:type="character" w:styleId="733">
+  <w:style w:type="character" w:styleId="737">
     <w:name w:val="Emphasis"/>
-    <w:basedOn w:val="716"/>
+    <w:basedOn w:val="720"/>
     <w:uiPriority w:val="20"/>
     <w:qFormat/>
     <w:pPr>
@@ -1276,9 +1301,9 @@
       <w:iCs/>
     </w:rPr>
   </w:style>
-  <w:style w:type="character" w:styleId="734">
+  <w:style w:type="character" w:styleId="738">
     <w:name w:val="Strong"/>
-    <w:basedOn w:val="716"/>
+    <w:basedOn w:val="720"/>
     <w:uiPriority w:val="22"/>
     <w:qFormat/>
     <w:pPr>
@@ -1291,9 +1316,9 @@
       <w:bCs/>
     </w:rPr>
   </w:style>
-  <w:style w:type="character" w:styleId="735">
+  <w:style w:type="character" w:styleId="739">
     <w:name w:val="Subtle Reference"/>
-    <w:basedOn w:val="716"/>
+    <w:basedOn w:val="720"/>
     <w:uiPriority w:val="31"/>
     <w:qFormat/>
     <w:pPr>
@@ -1306,9 +1331,9 @@
       <w:color w:val="5a5a5a" w:themeColor="text1" w:themeTint="A5"/>
     </w:rPr>
   </w:style>
-  <w:style w:type="character" w:styleId="736">
+  <w:style w:type="character" w:styleId="740">
     <w:name w:val="Book Title"/>
-    <w:basedOn w:val="716"/>
+    <w:basedOn w:val="720"/>
     <w:uiPriority w:val="33"/>
     <w:qFormat/>
     <w:pPr>
@@ -1324,10 +1349,10 @@
       <w:spacing w:val="5"/>
     </w:rPr>
   </w:style>
-  <w:style w:type="character" w:styleId="737">
+  <w:style w:type="character" w:styleId="741">
     <w:name w:val="Header Char"/>
-    <w:basedOn w:val="716"/>
-    <w:link w:val="759"/>
+    <w:basedOn w:val="720"/>
+    <w:link w:val="763"/>
     <w:uiPriority w:val="99"/>
     <w:qFormat/>
     <w:pPr>
@@ -1336,10 +1361,10 @@
       <w:ind/>
     </w:pPr>
   </w:style>
-  <w:style w:type="character" w:styleId="738">
+  <w:style w:type="character" w:styleId="742">
     <w:name w:val="Footer Char"/>
-    <w:basedOn w:val="716"/>
-    <w:link w:val="760"/>
+    <w:basedOn w:val="720"/>
+    <w:link w:val="764"/>
     <w:uiPriority w:val="99"/>
     <w:qFormat/>
     <w:pPr>
@@ -1348,10 +1373,10 @@
       <w:ind/>
     </w:pPr>
   </w:style>
-  <w:style w:type="character" w:styleId="739">
+  <w:style w:type="character" w:styleId="743">
     <w:name w:val="Footnote Text Char"/>
-    <w:basedOn w:val="716"/>
-    <w:link w:val="761"/>
+    <w:basedOn w:val="720"/>
+    <w:link w:val="765"/>
     <w:uiPriority w:val="99"/>
     <w:semiHidden/>
     <w:qFormat/>
@@ -1365,9 +1390,9 @@
       <w:szCs w:val="20"/>
     </w:rPr>
   </w:style>
-  <w:style w:type="character" w:styleId="740">
+  <w:style w:type="character" w:styleId="744">
     <w:name w:val="Footnote Characters"/>
-    <w:basedOn w:val="716"/>
+    <w:basedOn w:val="720"/>
     <w:uiPriority w:val="99"/>
     <w:semiHidden/>
     <w:unhideWhenUsed/>
@@ -1381,7 +1406,7 @@
       <w:vertAlign w:val="superscript"/>
     </w:rPr>
   </w:style>
-  <w:style w:type="character" w:styleId="741">
+  <w:style w:type="character" w:styleId="745">
     <w:name w:val="footnote reference"/>
     <w:pPr>
       <w:pBdr/>
@@ -1392,10 +1417,10 @@
       <w:vertAlign w:val="superscript"/>
     </w:rPr>
   </w:style>
-  <w:style w:type="character" w:styleId="742">
+  <w:style w:type="character" w:styleId="746">
     <w:name w:val="Endnote Text Char"/>
-    <w:basedOn w:val="716"/>
-    <w:link w:val="762"/>
+    <w:basedOn w:val="720"/>
+    <w:link w:val="766"/>
     <w:uiPriority w:val="99"/>
     <w:semiHidden/>
     <w:qFormat/>
@@ -1409,9 +1434,9 @@
       <w:szCs w:val="20"/>
     </w:rPr>
   </w:style>
-  <w:style w:type="character" w:styleId="743">
+  <w:style w:type="character" w:styleId="747">
     <w:name w:val="Endnote Characters"/>
-    <w:basedOn w:val="716"/>
+    <w:basedOn w:val="720"/>
     <w:uiPriority w:val="99"/>
     <w:semiHidden/>
     <w:unhideWhenUsed/>
@@ -1425,7 +1450,7 @@
       <w:vertAlign w:val="superscript"/>
     </w:rPr>
   </w:style>
-  <w:style w:type="character" w:styleId="744">
+  <w:style w:type="character" w:styleId="748">
     <w:name w:val="endnote reference"/>
     <w:pPr>
       <w:pBdr/>
@@ -1436,7 +1461,7 @@
       <w:vertAlign w:val="superscript"/>
     </w:rPr>
   </w:style>
-  <w:style w:type="character" w:styleId="745">
+  <w:style w:type="character" w:styleId="749">
     <w:name w:val="Hyperlink"/>
     <w:pPr>
       <w:pBdr/>
@@ -1448,7 +1473,7 @@
       <w:u w:val="single"/>
     </w:rPr>
   </w:style>
-  <w:style w:type="character" w:styleId="746">
+  <w:style w:type="character" w:styleId="750">
     <w:name w:val="FollowedHyperlink"/>
     <w:pPr>
       <w:pBdr/>
@@ -1460,10 +1485,10 @@
       <w:u w:val="single"/>
     </w:rPr>
   </w:style>
-  <w:style w:type="paragraph" w:styleId="747">
+  <w:style w:type="paragraph" w:styleId="751">
     <w:name w:val="Heading"/>
-    <w:basedOn w:val="706"/>
-    <w:next w:val="748"/>
+    <w:basedOn w:val="710"/>
+    <w:next w:val="752"/>
     <w:qFormat/>
     <w:pPr>
       <w:keepNext w:val="true"/>
@@ -1477,18 +1502,18 @@
       <w:szCs w:val="28"/>
     </w:rPr>
   </w:style>
-  <w:style w:type="paragraph" w:styleId="748">
+  <w:style w:type="paragraph" w:styleId="752">
     <w:name w:val="Body Text"/>
-    <w:basedOn w:val="706"/>
+    <w:basedOn w:val="710"/>
     <w:pPr>
       <w:pBdr/>
       <w:spacing w:after="140" w:before="0" w:line="276" w:lineRule="auto"/>
       <w:ind/>
     </w:pPr>
   </w:style>
-  <w:style w:type="paragraph" w:styleId="749">
+  <w:style w:type="paragraph" w:styleId="753">
     <w:name w:val="List"/>
-    <w:basedOn w:val="748"/>
+    <w:basedOn w:val="752"/>
     <w:pPr>
       <w:pBdr/>
       <w:spacing/>
@@ -1498,9 +1523,9 @@
       <w:rFonts w:cs="Lohit Devanagari"/>
     </w:rPr>
   </w:style>
-  <w:style w:type="paragraph" w:styleId="750">
+  <w:style w:type="paragraph" w:styleId="754">
     <w:name w:val="Caption"/>
-    <w:basedOn w:val="706"/>
+    <w:basedOn w:val="710"/>
     <w:qFormat/>
     <w:pPr>
       <w:suppressLineNumbers w:val="true"/>
@@ -1516,9 +1541,9 @@
       <w:szCs w:val="24"/>
     </w:rPr>
   </w:style>
-  <w:style w:type="paragraph" w:styleId="751">
+  <w:style w:type="paragraph" w:styleId="755">
     <w:name w:val="Index"/>
-    <w:basedOn w:val="706"/>
+    <w:basedOn w:val="710"/>
     <w:qFormat/>
     <w:pPr>
       <w:suppressLineNumbers w:val="true"/>
@@ -1530,11 +1555,11 @@
       <w:rFonts w:cs="Lohit Devanagari"/>
     </w:rPr>
   </w:style>
-  <w:style w:type="paragraph" w:styleId="752">
+  <w:style w:type="paragraph" w:styleId="756">
     <w:name w:val="Title"/>
-    <w:basedOn w:val="706"/>
-    <w:next w:val="706"/>
-    <w:link w:val="726"/>
+    <w:basedOn w:val="710"/>
+    <w:next w:val="710"/>
+    <w:link w:val="730"/>
     <w:uiPriority w:val="10"/>
     <w:qFormat/>
     <w:pPr>
@@ -1550,11 +1575,11 @@
       <w:szCs w:val="56"/>
     </w:rPr>
   </w:style>
-  <w:style w:type="paragraph" w:styleId="753">
+  <w:style w:type="paragraph" w:styleId="757">
     <w:name w:val="Subtitle"/>
-    <w:basedOn w:val="706"/>
-    <w:next w:val="706"/>
-    <w:link w:val="727"/>
+    <w:basedOn w:val="710"/>
+    <w:next w:val="710"/>
+    <w:link w:val="731"/>
     <w:uiPriority w:val="11"/>
     <w:qFormat/>
     <w:pPr>
@@ -1569,11 +1594,11 @@
       <w:szCs w:val="28"/>
     </w:rPr>
   </w:style>
-  <w:style w:type="paragraph" w:styleId="754">
+  <w:style w:type="paragraph" w:styleId="758">
     <w:name w:val="Quote"/>
-    <w:basedOn w:val="706"/>
-    <w:next w:val="706"/>
-    <w:link w:val="728"/>
+    <w:basedOn w:val="710"/>
+    <w:next w:val="710"/>
+    <w:link w:val="732"/>
     <w:uiPriority w:val="29"/>
     <w:qFormat/>
     <w:pPr>
@@ -1588,9 +1613,9 @@
       <w:color w:val="404040" w:themeColor="text1" w:themeTint="BF"/>
     </w:rPr>
   </w:style>
-  <w:style w:type="paragraph" w:styleId="755">
+  <w:style w:type="paragraph" w:styleId="759">
     <w:name w:val="List Paragraph"/>
-    <w:basedOn w:val="706"/>
+    <w:basedOn w:val="710"/>
     <w:uiPriority w:val="34"/>
     <w:qFormat/>
     <w:pPr>
@@ -1600,11 +1625,11 @@
       <w:contextualSpacing w:val="true"/>
     </w:pPr>
   </w:style>
-  <w:style w:type="paragraph" w:styleId="756">
+  <w:style w:type="paragraph" w:styleId="760">
     <w:name w:val="Intense Quote"/>
-    <w:basedOn w:val="706"/>
-    <w:next w:val="706"/>
-    <w:link w:val="730"/>
+    <w:basedOn w:val="710"/>
+    <w:next w:val="710"/>
+    <w:link w:val="734"/>
     <w:uiPriority w:val="30"/>
     <w:qFormat/>
     <w:pPr>
@@ -1622,9 +1647,9 @@
       <w:color w:val="0f4761" w:themeColor="accent1" w:themeShade="BF"/>
     </w:rPr>
   </w:style>
-  <w:style w:type="paragraph" w:styleId="757">
+  <w:style w:type="paragraph" w:styleId="761">
     <w:name w:val="No Spacing"/>
-    <w:basedOn w:val="706"/>
+    <w:basedOn w:val="710"/>
     <w:uiPriority w:val="1"/>
     <w:qFormat/>
     <w:pPr>
@@ -1633,9 +1658,9 @@
       <w:ind/>
     </w:pPr>
   </w:style>
-  <w:style w:type="paragraph" w:styleId="758">
+  <w:style w:type="paragraph" w:styleId="762">
     <w:name w:val="Header and Footer"/>
-    <w:basedOn w:val="706"/>
+    <w:basedOn w:val="710"/>
     <w:qFormat/>
     <w:pPr>
       <w:pBdr/>
@@ -1643,10 +1668,10 @@
       <w:ind/>
     </w:pPr>
   </w:style>
-  <w:style w:type="paragraph" w:styleId="759">
+  <w:style w:type="paragraph" w:styleId="763">
     <w:name w:val="Header"/>
-    <w:basedOn w:val="706"/>
-    <w:link w:val="737"/>
+    <w:basedOn w:val="710"/>
+    <w:link w:val="741"/>
     <w:uiPriority w:val="99"/>
     <w:unhideWhenUsed/>
     <w:pPr>
@@ -1660,10 +1685,10 @@
       <w:ind/>
     </w:pPr>
   </w:style>
-  <w:style w:type="paragraph" w:styleId="760">
+  <w:style w:type="paragraph" w:styleId="764">
     <w:name w:val="Footer"/>
-    <w:basedOn w:val="706"/>
-    <w:link w:val="738"/>
+    <w:basedOn w:val="710"/>
+    <w:link w:val="742"/>
     <w:uiPriority w:val="99"/>
     <w:unhideWhenUsed/>
     <w:pPr>
@@ -1677,10 +1702,10 @@
       <w:ind/>
     </w:pPr>
   </w:style>
-  <w:style w:type="paragraph" w:styleId="761">
+  <w:style w:type="paragraph" w:styleId="765">
     <w:name w:val="footnote text"/>
-    <w:basedOn w:val="706"/>
-    <w:link w:val="739"/>
+    <w:basedOn w:val="710"/>
+    <w:link w:val="743"/>
     <w:uiPriority w:val="99"/>
     <w:semiHidden/>
     <w:unhideWhenUsed/>
@@ -1694,10 +1719,10 @@
       <w:szCs w:val="20"/>
     </w:rPr>
   </w:style>
-  <w:style w:type="paragraph" w:styleId="762">
+  <w:style w:type="paragraph" w:styleId="766">
     <w:name w:val="endnote text"/>
-    <w:basedOn w:val="706"/>
-    <w:link w:val="742"/>
+    <w:basedOn w:val="710"/>
+    <w:link w:val="746"/>
     <w:uiPriority w:val="99"/>
     <w:semiHidden/>
     <w:unhideWhenUsed/>
@@ -1711,16 +1736,16 @@
       <w:szCs w:val="20"/>
     </w:rPr>
   </w:style>
-  <w:style w:type="paragraph" w:styleId="763">
+  <w:style w:type="paragraph" w:styleId="767">
     <w:name w:val="Index Heading"/>
-    <w:basedOn w:val="747"/>
+    <w:basedOn w:val="751"/>
     <w:pPr>
       <w:pBdr/>
       <w:spacing/>
       <w:ind/>
     </w:pPr>
   </w:style>
-  <w:style w:type="paragraph" w:styleId="764">
+  <w:style w:type="paragraph" w:styleId="768">
     <w:name w:val="TOC Heading"/>
     <w:uiPriority w:val="39"/>
     <w:unhideWhenUsed/>
@@ -1741,10 +1766,10 @@
       <w:lang w:val="en-US" w:eastAsia="zh-CN" w:bidi="hi-IN"/>
     </w:rPr>
   </w:style>
-  <w:style w:type="paragraph" w:styleId="765">
+  <w:style w:type="paragraph" w:styleId="769">
     <w:name w:val="table of figures"/>
-    <w:basedOn w:val="706"/>
-    <w:next w:val="706"/>
+    <w:basedOn w:val="710"/>
+    <w:next w:val="710"/>
     <w:uiPriority w:val="99"/>
     <w:unhideWhenUsed/>
     <w:pPr>
@@ -1753,7 +1778,7 @@
       <w:ind/>
     </w:pPr>
   </w:style>
-  <w:style w:type="numbering" w:styleId="766" w:default="1">
+  <w:style w:type="numbering" w:styleId="770" w:default="1">
     <w:name w:val="No List"/>
     <w:uiPriority w:val="99"/>
     <w:semiHidden/>
@@ -1765,7 +1790,7 @@
       <w:ind/>
     </w:pPr>
   </w:style>
-  <w:style w:type="table" w:styleId="767" w:default="1">
+  <w:style w:type="table" w:styleId="771" w:default="1">
     <w:name w:val="Normal Table"/>
     <w:uiPriority w:val="99"/>
     <w:semiHidden/>
@@ -1776,13 +1801,13 @@
       <w:ind/>
     </w:pPr>
     <w:tblPr>
-      <w:tblBorders/>
       <w:tblCellMar>
         <w:left w:w="108" w:type="dxa"/>
         <w:top w:w="0" w:type="dxa"/>
         <w:right w:w="108" w:type="dxa"/>
         <w:bottom w:w="0" w:type="dxa"/>
       </w:tblCellMar>
+      <w:tblBorders/>
     </w:tblPr>
     <w:tcPr>
       <w:tcBorders/>
@@ -1957,9 +1982,9 @@
       </w:tcPr>
     </w:tblStylePr>
   </w:style>
-  <w:style w:type="table" w:styleId="768">
+  <w:style w:type="table" w:styleId="772">
     <w:name w:val="Table Grid"/>
-    <w:basedOn w:val="767"/>
+    <w:basedOn w:val="771"/>
     <w:uiPriority w:val="59"/>
     <w:pPr>
       <w:pBdr/>
@@ -1967,6 +1992,12 @@
       <w:ind/>
     </w:pPr>
     <w:tblPr>
+      <w:tblCellMar>
+        <w:left w:w="108" w:type="dxa"/>
+        <w:top w:w="0" w:type="dxa"/>
+        <w:right w:w="108" w:type="dxa"/>
+        <w:bottom w:w="0" w:type="dxa"/>
+      </w:tblCellMar>
       <w:tblBorders>
         <w:top w:val="single" w:color="000000" w:sz="4" w:space="0"/>
         <w:left w:val="single" w:color="000000" w:sz="4" w:space="0"/>
@@ -1975,12 +2006,6 @@
         <w:insideH w:val="single" w:color="000000" w:sz="4" w:space="0"/>
         <w:insideV w:val="single" w:color="000000" w:sz="4" w:space="0"/>
       </w:tblBorders>
-      <w:tblCellMar>
-        <w:left w:w="108" w:type="dxa"/>
-        <w:top w:w="0" w:type="dxa"/>
-        <w:right w:w="108" w:type="dxa"/>
-        <w:bottom w:w="0" w:type="dxa"/>
-      </w:tblCellMar>
     </w:tblPr>
     <w:tcPr>
       <w:tcBorders/>
@@ -2155,9 +2180,9 @@
       </w:tcPr>
     </w:tblStylePr>
   </w:style>
-  <w:style w:type="table" w:styleId="769">
+  <w:style w:type="table" w:styleId="773">
     <w:name w:val="Table Grid Light"/>
-    <w:basedOn w:val="767"/>
+    <w:basedOn w:val="771"/>
     <w:uiPriority w:val="59"/>
     <w:pPr>
       <w:pBdr/>
@@ -2165,6 +2190,12 @@
       <w:ind/>
     </w:pPr>
     <w:tblPr>
+      <w:tblCellMar>
+        <w:left w:w="108" w:type="dxa"/>
+        <w:top w:w="0" w:type="dxa"/>
+        <w:right w:w="108" w:type="dxa"/>
+        <w:bottom w:w="0" w:type="dxa"/>
+      </w:tblCellMar>
       <w:tblBorders>
         <w:top w:val="single" w:color="000000" w:themeColor="text1" w:themeTint="50" w:sz="4" w:space="0"/>
         <w:left w:val="single" w:color="000000" w:themeColor="text1" w:themeTint="50" w:sz="4" w:space="0"/>
@@ -2173,12 +2204,6 @@
         <w:insideH w:val="single" w:color="000000" w:themeColor="text1" w:themeTint="50" w:sz="4" w:space="0"/>
         <w:insideV w:val="single" w:color="000000" w:themeColor="text1" w:themeTint="50" w:sz="4" w:space="0"/>
       </w:tblBorders>
-      <w:tblCellMar>
-        <w:left w:w="108" w:type="dxa"/>
-        <w:top w:w="0" w:type="dxa"/>
-        <w:right w:w="108" w:type="dxa"/>
-        <w:bottom w:w="0" w:type="dxa"/>
-      </w:tblCellMar>
     </w:tblPr>
     <w:tcPr>
       <w:tcBorders/>
@@ -2353,9 +2378,9 @@
       </w:tcPr>
     </w:tblStylePr>
   </w:style>
-  <w:style w:type="table" w:styleId="770">
+  <w:style w:type="table" w:styleId="774">
     <w:name w:val="Plain Table 1"/>
-    <w:basedOn w:val="767"/>
+    <w:basedOn w:val="771"/>
     <w:uiPriority w:val="59"/>
     <w:pPr>
       <w:pBdr/>
@@ -2363,6 +2388,12 @@
       <w:ind/>
     </w:pPr>
     <w:tblPr>
+      <w:tblCellMar>
+        <w:left w:w="108" w:type="dxa"/>
+        <w:top w:w="0" w:type="dxa"/>
+        <w:right w:w="108" w:type="dxa"/>
+        <w:bottom w:w="0" w:type="dxa"/>
+      </w:tblCellMar>
       <w:tblBorders>
         <w:top w:val="single" w:color="000000" w:themeColor="text1" w:themeTint="50" w:sz="4" w:space="0"/>
         <w:left w:val="single" w:color="000000" w:themeColor="text1" w:themeTint="50" w:sz="4" w:space="0"/>
@@ -2371,12 +2402,6 @@
         <w:insideH w:val="single" w:color="000000" w:themeColor="text1" w:themeTint="50" w:sz="4" w:space="0"/>
         <w:insideV w:val="single" w:color="000000" w:themeColor="text1" w:themeTint="50" w:sz="4" w:space="0"/>
       </w:tblBorders>
-      <w:tblCellMar>
-        <w:left w:w="108" w:type="dxa"/>
-        <w:top w:w="0" w:type="dxa"/>
-        <w:right w:w="108" w:type="dxa"/>
-        <w:bottom w:w="0" w:type="dxa"/>
-      </w:tblCellMar>
     </w:tblPr>
     <w:tcPr>
       <w:tcBorders/>
@@ -2569,9 +2594,9 @@
       </w:tcPr>
     </w:tblStylePr>
   </w:style>
-  <w:style w:type="table" w:styleId="771">
+  <w:style w:type="table" w:styleId="775">
     <w:name w:val="Plain Table 2"/>
-    <w:basedOn w:val="767"/>
+    <w:basedOn w:val="771"/>
     <w:uiPriority w:val="59"/>
     <w:pPr>
       <w:pBdr/>
@@ -2579,18 +2604,18 @@
       <w:ind/>
     </w:pPr>
     <w:tblPr>
+      <w:tblCellMar>
+        <w:left w:w="108" w:type="dxa"/>
+        <w:top w:w="0" w:type="dxa"/>
+        <w:right w:w="108" w:type="dxa"/>
+        <w:bottom w:w="0" w:type="dxa"/>
+      </w:tblCellMar>
       <w:tblBorders>
         <w:top w:val="single" w:color="000000" w:themeColor="text1" w:sz="4" w:space="0"/>
         <w:left w:val="none" w:color="000000" w:themeColor="text1" w:sz="4" w:space="0"/>
         <w:bottom w:val="single" w:color="000000" w:themeColor="text1" w:sz="4" w:space="0"/>
         <w:right w:val="none" w:color="000000" w:themeColor="text1" w:sz="4" w:space="0"/>
       </w:tblBorders>
-      <w:tblCellMar>
-        <w:left w:w="108" w:type="dxa"/>
-        <w:top w:w="0" w:type="dxa"/>
-        <w:right w:w="108" w:type="dxa"/>
-        <w:bottom w:w="0" w:type="dxa"/>
-      </w:tblCellMar>
     </w:tblPr>
     <w:tcPr>
       <w:tcBorders/>
@@ -2793,9 +2818,9 @@
       </w:tcPr>
     </w:tblStylePr>
   </w:style>
-  <w:style w:type="table" w:styleId="772">
+  <w:style w:type="table" w:styleId="776">
     <w:name w:val="Plain Table 3"/>
-    <w:basedOn w:val="767"/>
+    <w:basedOn w:val="771"/>
     <w:uiPriority w:val="99"/>
     <w:pPr>
       <w:pBdr/>
@@ -3014,9 +3039,9 @@
       </w:tcPr>
     </w:tblStylePr>
   </w:style>
-  <w:style w:type="table" w:styleId="773">
+  <w:style w:type="table" w:styleId="777">
     <w:name w:val="Plain Table 4"/>
-    <w:basedOn w:val="767"/>
+    <w:basedOn w:val="771"/>
     <w:uiPriority w:val="99"/>
     <w:pPr>
       <w:pBdr/>
@@ -3221,9 +3246,9 @@
       </w:tcPr>
     </w:tblStylePr>
   </w:style>
-  <w:style w:type="table" w:styleId="774">
+  <w:style w:type="table" w:styleId="778">
     <w:name w:val="Plain Table 5"/>
-    <w:basedOn w:val="767"/>
+    <w:basedOn w:val="771"/>
     <w:uiPriority w:val="99"/>
     <w:pPr>
       <w:pBdr/>
@@ -3445,9 +3470,9 @@
       </w:tcPr>
     </w:tblStylePr>
   </w:style>
-  <w:style w:type="table" w:styleId="775">
+  <w:style w:type="table" w:styleId="779">
     <w:name w:val="Grid Table 1 Light"/>
-    <w:basedOn w:val="767"/>
+    <w:basedOn w:val="771"/>
     <w:uiPriority w:val="99"/>
     <w:pPr>
       <w:pBdr/>
@@ -3661,9 +3686,9 @@
       </w:tcPr>
     </w:tblStylePr>
   </w:style>
-  <w:style w:type="table" w:styleId="776">
+  <w:style w:type="table" w:styleId="780">
     <w:name w:val="Grid Table 1 Light - Accent 1"/>
-    <w:basedOn w:val="767"/>
+    <w:basedOn w:val="771"/>
     <w:uiPriority w:val="99"/>
     <w:pPr>
       <w:pBdr/>
@@ -3877,9 +3902,9 @@
       </w:tcPr>
     </w:tblStylePr>
   </w:style>
-  <w:style w:type="table" w:styleId="777">
+  <w:style w:type="table" w:styleId="781">
     <w:name w:val="Grid Table 1 Light - Accent 2"/>
-    <w:basedOn w:val="767"/>
+    <w:basedOn w:val="771"/>
     <w:uiPriority w:val="99"/>
     <w:pPr>
       <w:pBdr/>
@@ -4093,9 +4118,9 @@
       </w:tcPr>
     </w:tblStylePr>
   </w:style>
-  <w:style w:type="table" w:styleId="778">
+  <w:style w:type="table" w:styleId="782">
     <w:name w:val="Grid Table 1 Light - Accent 3"/>
-    <w:basedOn w:val="767"/>
+    <w:basedOn w:val="771"/>
     <w:uiPriority w:val="99"/>
     <w:pPr>
       <w:pBdr/>
@@ -4309,9 +4334,9 @@
       </w:tcPr>
     </w:tblStylePr>
   </w:style>
-  <w:style w:type="table" w:styleId="779">
+  <w:style w:type="table" w:styleId="783">
     <w:name w:val="Grid Table 1 Light - Accent 4"/>
-    <w:basedOn w:val="767"/>
+    <w:basedOn w:val="771"/>
     <w:uiPriority w:val="99"/>
     <w:pPr>
       <w:pBdr/>
@@ -4525,9 +4550,9 @@
       </w:tcPr>
     </w:tblStylePr>
   </w:style>
-  <w:style w:type="table" w:styleId="780">
+  <w:style w:type="table" w:styleId="784">
     <w:name w:val="Grid Table 1 Light - Accent 5"/>
-    <w:basedOn w:val="767"/>
+    <w:basedOn w:val="771"/>
     <w:uiPriority w:val="99"/>
     <w:pPr>
       <w:pBdr/>
@@ -4741,9 +4766,9 @@
       </w:tcPr>
     </w:tblStylePr>
   </w:style>
-  <w:style w:type="table" w:styleId="781">
+  <w:style w:type="table" w:styleId="785">
     <w:name w:val="Grid Table 1 Light - Accent 6"/>
-    <w:basedOn w:val="767"/>
+    <w:basedOn w:val="771"/>
     <w:uiPriority w:val="99"/>
     <w:pPr>
       <w:pBdr/>
@@ -4957,9 +4982,9 @@
       </w:tcPr>
     </w:tblStylePr>
   </w:style>
-  <w:style w:type="table" w:styleId="782">
+  <w:style w:type="table" w:styleId="786">
     <w:name w:val="Grid Table 2"/>
-    <w:basedOn w:val="767"/>
+    <w:basedOn w:val="771"/>
     <w:uiPriority w:val="99"/>
     <w:pPr>
       <w:pBdr/>
@@ -5180,9 +5205,9 @@
       </w:tcPr>
     </w:tblStylePr>
   </w:style>
-  <w:style w:type="table" w:styleId="783">
+  <w:style w:type="table" w:styleId="787">
     <w:name w:val="Grid Table 2 - Accent 1"/>
-    <w:basedOn w:val="767"/>
+    <w:basedOn w:val="771"/>
     <w:uiPriority w:val="99"/>
     <w:pPr>
       <w:pBdr/>
@@ -5403,9 +5428,9 @@
       </w:tcPr>
     </w:tblStylePr>
   </w:style>
-  <w:style w:type="table" w:styleId="784">
+  <w:style w:type="table" w:styleId="788">
     <w:name w:val="Grid Table 2 - Accent 2"/>
-    <w:basedOn w:val="767"/>
+    <w:basedOn w:val="771"/>
     <w:uiPriority w:val="99"/>
     <w:pPr>
       <w:pBdr/>
@@ -5626,9 +5651,9 @@
       </w:tcPr>
     </w:tblStylePr>
   </w:style>
-  <w:style w:type="table" w:styleId="785">
+  <w:style w:type="table" w:styleId="789">
     <w:name w:val="Grid Table 2 - Accent 3"/>
-    <w:basedOn w:val="767"/>
+    <w:basedOn w:val="771"/>
     <w:uiPriority w:val="99"/>
     <w:pPr>
       <w:pBdr/>
@@ -5849,9 +5874,9 @@
       </w:tcPr>
     </w:tblStylePr>
   </w:style>
-  <w:style w:type="table" w:styleId="786">
+  <w:style w:type="table" w:styleId="790">
     <w:name w:val="Grid Table 2 - Accent 4"/>
-    <w:basedOn w:val="767"/>
+    <w:basedOn w:val="771"/>
     <w:uiPriority w:val="99"/>
     <w:pPr>
       <w:pBdr/>
@@ -6072,9 +6097,9 @@
       </w:tcPr>
     </w:tblStylePr>
   </w:style>
-  <w:style w:type="table" w:styleId="787">
+  <w:style w:type="table" w:styleId="791">
     <w:name w:val="Grid Table 2 - Accent 5"/>
-    <w:basedOn w:val="767"/>
+    <w:basedOn w:val="771"/>
     <w:uiPriority w:val="99"/>
     <w:pPr>
       <w:pBdr/>
@@ -6295,9 +6320,9 @@
       </w:tcPr>
     </w:tblStylePr>
   </w:style>
-  <w:style w:type="table" w:styleId="788">
+  <w:style w:type="table" w:styleId="792">
     <w:name w:val="Grid Table 2 - Accent 6"/>
-    <w:basedOn w:val="767"/>
+    <w:basedOn w:val="771"/>
     <w:uiPriority w:val="99"/>
     <w:pPr>
       <w:pBdr/>
@@ -6518,9 +6543,9 @@
       </w:tcPr>
     </w:tblStylePr>
   </w:style>
-  <w:style w:type="table" w:styleId="789">
+  <w:style w:type="table" w:styleId="793">
     <w:name w:val="Grid Table 3"/>
-    <w:basedOn w:val="767"/>
+    <w:basedOn w:val="771"/>
     <w:uiPriority w:val="99"/>
     <w:pPr>
       <w:pBdr/>
@@ -6754,9 +6779,9 @@
       </w:tcPr>
     </w:tblStylePr>
   </w:style>
-  <w:style w:type="table" w:styleId="790">
+  <w:style w:type="table" w:styleId="794">
     <w:name w:val="Grid Table 3 - Accent 1"/>
-    <w:basedOn w:val="767"/>
+    <w:basedOn w:val="771"/>
     <w:uiPriority w:val="99"/>
     <w:pPr>
       <w:pBdr/>
@@ -6990,9 +7015,9 @@
       </w:tcPr>
     </w:tblStylePr>
   </w:style>
-  <w:style w:type="table" w:styleId="791">
+  <w:style w:type="table" w:styleId="795">
     <w:name w:val="Grid Table 3 - Accent 2"/>
-    <w:basedOn w:val="767"/>
+    <w:basedOn w:val="771"/>
     <w:uiPriority w:val="99"/>
     <w:pPr>
       <w:pBdr/>
@@ -7226,9 +7251,9 @@
       </w:tcPr>
     </w:tblStylePr>
   </w:style>
-  <w:style w:type="table" w:styleId="792">
+  <w:style w:type="table" w:styleId="796">
     <w:name w:val="Grid Table 3 - Accent 3"/>
-    <w:basedOn w:val="767"/>
+    <w:basedOn w:val="771"/>
     <w:uiPriority w:val="99"/>
     <w:pPr>
       <w:pBdr/>
@@ -7462,9 +7487,9 @@
       </w:tcPr>
     </w:tblStylePr>
   </w:style>
-  <w:style w:type="table" w:styleId="793">
+  <w:style w:type="table" w:styleId="797">
     <w:name w:val="Grid Table 3 - Accent 4"/>
-    <w:basedOn w:val="767"/>
+    <w:basedOn w:val="771"/>
     <w:uiPriority w:val="99"/>
     <w:pPr>
       <w:pBdr/>
@@ -7698,9 +7723,9 @@
       </w:tcPr>
     </w:tblStylePr>
   </w:style>
-  <w:style w:type="table" w:styleId="794">
+  <w:style w:type="table" w:styleId="798">
     <w:name w:val="Grid Table 3 - Accent 5"/>
-    <w:basedOn w:val="767"/>
+    <w:basedOn w:val="771"/>
     <w:uiPriority w:val="99"/>
     <w:pPr>
       <w:pBdr/>
@@ -7934,9 +7959,9 @@
       </w:tcPr>
     </w:tblStylePr>
   </w:style>
-  <w:style w:type="table" w:styleId="795">
+  <w:style w:type="table" w:styleId="799">
     <w:name w:val="Grid Table 3 - Accent 6"/>
-    <w:basedOn w:val="767"/>
+    <w:basedOn w:val="771"/>
     <w:uiPriority w:val="99"/>
     <w:pPr>
       <w:pBdr/>
@@ -8170,9 +8195,9 @@
       </w:tcPr>
     </w:tblStylePr>
   </w:style>
-  <w:style w:type="table" w:styleId="796">
+  <w:style w:type="table" w:styleId="800">
     <w:name w:val="Grid Table 4"/>
-    <w:basedOn w:val="767"/>
+    <w:basedOn w:val="771"/>
     <w:uiPriority w:val="59"/>
     <w:pPr>
       <w:pBdr/>
@@ -8393,9 +8418,9 @@
       </w:tcPr>
     </w:tblStylePr>
   </w:style>
-  <w:style w:type="table" w:styleId="797">
+  <w:style w:type="table" w:styleId="801">
     <w:name w:val="Grid Table 4 - Accent 1"/>
-    <w:basedOn w:val="767"/>
+    <w:basedOn w:val="771"/>
     <w:uiPriority w:val="59"/>
     <w:pPr>
       <w:pBdr/>
@@ -8616,9 +8641,9 @@
       </w:tcPr>
     </w:tblStylePr>
   </w:style>
-  <w:style w:type="table" w:styleId="798">
+  <w:style w:type="table" w:styleId="802">
     <w:name w:val="Grid Table 4 - Accent 2"/>
-    <w:basedOn w:val="767"/>
+    <w:basedOn w:val="771"/>
     <w:uiPriority w:val="59"/>
     <w:pPr>
       <w:pBdr/>
@@ -8839,9 +8864,9 @@
       </w:tcPr>
     </w:tblStylePr>
   </w:style>
-  <w:style w:type="table" w:styleId="799">
+  <w:style w:type="table" w:styleId="803">
     <w:name w:val="Grid Table 4 - Accent 3"/>
-    <w:basedOn w:val="767"/>
+    <w:basedOn w:val="771"/>
     <w:uiPriority w:val="59"/>
     <w:pPr>
       <w:pBdr/>
@@ -9062,9 +9087,9 @@
       </w:tcPr>
     </w:tblStylePr>
   </w:style>
-  <w:style w:type="table" w:styleId="800">
+  <w:style w:type="table" w:styleId="804">
     <w:name w:val="Grid Table 4 - Accent 4"/>
-    <w:basedOn w:val="767"/>
+    <w:basedOn w:val="771"/>
     <w:uiPriority w:val="59"/>
     <w:pPr>
       <w:pBdr/>
@@ -9285,9 +9310,9 @@
       </w:tcPr>
     </w:tblStylePr>
   </w:style>
-  <w:style w:type="table" w:styleId="801">
+  <w:style w:type="table" w:styleId="805">
     <w:name w:val="Grid Table 4 - Accent 5"/>
-    <w:basedOn w:val="767"/>
+    <w:basedOn w:val="771"/>
     <w:uiPriority w:val="59"/>
     <w:pPr>
       <w:pBdr/>
@@ -9508,9 +9533,9 @@
       </w:tcPr>
     </w:tblStylePr>
   </w:style>
-  <w:style w:type="table" w:styleId="802">
+  <w:style w:type="table" w:styleId="806">
     <w:name w:val="Grid Table 4 - Accent 6"/>
-    <w:basedOn w:val="767"/>
+    <w:basedOn w:val="771"/>
     <w:uiPriority w:val="59"/>
     <w:pPr>
       <w:pBdr/>
@@ -9731,9 +9756,9 @@
       </w:tcPr>
     </w:tblStylePr>
   </w:style>
-  <w:style w:type="table" w:styleId="803">
+  <w:style w:type="table" w:styleId="807">
     <w:name w:val="Grid Table 5 Dark"/>
-    <w:basedOn w:val="767"/>
+    <w:basedOn w:val="771"/>
     <w:uiPriority w:val="99"/>
     <w:pPr>
       <w:pBdr/>
@@ -9949,9 +9974,9 @@
       </w:tcPr>
     </w:tblStylePr>
   </w:style>
-  <w:style w:type="table" w:styleId="804">
+  <w:style w:type="table" w:styleId="808">
     <w:name w:val="Grid Table 5 Dark- Accent 1"/>
-    <w:basedOn w:val="767"/>
+    <w:basedOn w:val="771"/>
     <w:uiPriority w:val="99"/>
     <w:pPr>
       <w:pBdr/>
@@ -10167,9 +10192,9 @@
       </w:tcPr>
     </w:tblStylePr>
   </w:style>
-  <w:style w:type="table" w:styleId="805">
+  <w:style w:type="table" w:styleId="809">
     <w:name w:val="Grid Table 5 Dark - Accent 2"/>
-    <w:basedOn w:val="767"/>
+    <w:basedOn w:val="771"/>
     <w:uiPriority w:val="99"/>
     <w:pPr>
       <w:pBdr/>
@@ -10385,9 +10410,9 @@
       </w:tcPr>
     </w:tblStylePr>
   </w:style>
-  <w:style w:type="table" w:styleId="806">
+  <w:style w:type="table" w:styleId="810">
     <w:name w:val="Grid Table 5 Dark - Accent 3"/>
-    <w:basedOn w:val="767"/>
+    <w:basedOn w:val="771"/>
     <w:uiPriority w:val="99"/>
     <w:pPr>
       <w:pBdr/>
@@ -10603,9 +10628,9 @@
       </w:tcPr>
     </w:tblStylePr>
   </w:style>
-  <w:style w:type="table" w:styleId="807">
+  <w:style w:type="table" w:styleId="811">
     <w:name w:val="Grid Table 5 Dark- Accent 4"/>
-    <w:basedOn w:val="767"/>
+    <w:basedOn w:val="771"/>
     <w:uiPriority w:val="99"/>
     <w:pPr>
       <w:pBdr/>
@@ -10821,9 +10846,9 @@
       </w:tcPr>
     </w:tblStylePr>
   </w:style>
-  <w:style w:type="table" w:styleId="808">
+  <w:style w:type="table" w:styleId="812">
     <w:name w:val="Grid Table 5 Dark - Accent 5"/>
-    <w:basedOn w:val="767"/>
+    <w:basedOn w:val="771"/>
     <w:uiPriority w:val="99"/>
     <w:pPr>
       <w:pBdr/>
@@ -11039,9 +11064,9 @@
       </w:tcPr>
     </w:tblStylePr>
   </w:style>
-  <w:style w:type="table" w:styleId="809">
+  <w:style w:type="table" w:styleId="813">
     <w:name w:val="Grid Table 5 Dark - Accent 6"/>
-    <w:basedOn w:val="767"/>
+    <w:basedOn w:val="771"/>
     <w:uiPriority w:val="99"/>
     <w:pPr>
       <w:pBdr/>
@@ -11257,9 +11282,9 @@
       </w:tcPr>
     </w:tblStylePr>
   </w:style>
-  <w:style w:type="table" w:styleId="810">
+  <w:style w:type="table" w:styleId="814">
     <w:name w:val="Grid Table 6 Colorful"/>
-    <w:basedOn w:val="767"/>
+    <w:basedOn w:val="771"/>
     <w:uiPriority w:val="99"/>
     <w:pPr>
       <w:pBdr/>
@@ -11483,9 +11508,9 @@
       </w:tcPr>
     </w:tblStylePr>
   </w:style>
-  <w:style w:type="table" w:styleId="811">
+  <w:style w:type="table" w:styleId="815">
     <w:name w:val="Grid Table 6 Colorful - Accent 1"/>
-    <w:basedOn w:val="767"/>
+    <w:basedOn w:val="771"/>
     <w:uiPriority w:val="99"/>
     <w:pPr>
       <w:pBdr/>
@@ -11709,9 +11734,9 @@
       </w:tcPr>
     </w:tblStylePr>
   </w:style>
-  <w:style w:type="table" w:styleId="812">
+  <w:style w:type="table" w:styleId="816">
     <w:name w:val="Grid Table 6 Colorful - Accent 2"/>
-    <w:basedOn w:val="767"/>
+    <w:basedOn w:val="771"/>
     <w:uiPriority w:val="99"/>
     <w:pPr>
       <w:pBdr/>
@@ -11935,9 +11960,9 @@
       </w:tcPr>
     </w:tblStylePr>
   </w:style>
-  <w:style w:type="table" w:styleId="813">
+  <w:style w:type="table" w:styleId="817">
     <w:name w:val="Grid Table 6 Colorful - Accent 3"/>
-    <w:basedOn w:val="767"/>
+    <w:basedOn w:val="771"/>
     <w:uiPriority w:val="99"/>
     <w:pPr>
       <w:pBdr/>
@@ -12161,9 +12186,9 @@
       </w:tcPr>
     </w:tblStylePr>
   </w:style>
-  <w:style w:type="table" w:styleId="814">
+  <w:style w:type="table" w:styleId="818">
     <w:name w:val="Grid Table 6 Colorful - Accent 4"/>
-    <w:basedOn w:val="767"/>
+    <w:basedOn w:val="771"/>
     <w:uiPriority w:val="99"/>
     <w:pPr>
       <w:pBdr/>
@@ -12387,9 +12412,9 @@
       </w:tcPr>
     </w:tblStylePr>
   </w:style>
-  <w:style w:type="table" w:styleId="815">
+  <w:style w:type="table" w:styleId="819">
     <w:name w:val="Grid Table 6 Colorful - Accent 5"/>
-    <w:basedOn w:val="767"/>
+    <w:basedOn w:val="771"/>
     <w:uiPriority w:val="99"/>
     <w:pPr>
       <w:pBdr/>
@@ -12613,9 +12638,9 @@
       </w:tcPr>
     </w:tblStylePr>
   </w:style>
-  <w:style w:type="table" w:styleId="816">
+  <w:style w:type="table" w:styleId="820">
     <w:name w:val="Grid Table 6 Colorful - Accent 6"/>
-    <w:basedOn w:val="767"/>
+    <w:basedOn w:val="771"/>
     <w:uiPriority w:val="99"/>
     <w:pPr>
       <w:pBdr/>
@@ -12839,9 +12864,9 @@
       </w:tcPr>
     </w:tblStylePr>
   </w:style>
-  <w:style w:type="table" w:styleId="817">
+  <w:style w:type="table" w:styleId="821">
     <w:name w:val="Grid Table 7 Colorful"/>
-    <w:basedOn w:val="767"/>
+    <w:basedOn w:val="771"/>
     <w:uiPriority w:val="99"/>
     <w:pPr>
       <w:pBdr/>
@@ -13086,9 +13111,9 @@
       </w:tcPr>
     </w:tblStylePr>
   </w:style>
-  <w:style w:type="table" w:styleId="818">
+  <w:style w:type="table" w:styleId="822">
     <w:name w:val="Grid Table 7 Colorful - Accent 1"/>
-    <w:basedOn w:val="767"/>
+    <w:basedOn w:val="771"/>
     <w:uiPriority w:val="99"/>
     <w:pPr>
       <w:pBdr/>
@@ -13333,9 +13358,9 @@
       </w:tcPr>
     </w:tblStylePr>
   </w:style>
-  <w:style w:type="table" w:styleId="819">
+  <w:style w:type="table" w:styleId="823">
     <w:name w:val="Grid Table 7 Colorful - Accent 2"/>
-    <w:basedOn w:val="767"/>
+    <w:basedOn w:val="771"/>
     <w:uiPriority w:val="99"/>
     <w:pPr>
       <w:pBdr/>
@@ -13580,9 +13605,9 @@
       </w:tcPr>
     </w:tblStylePr>
   </w:style>
-  <w:style w:type="table" w:styleId="820">
+  <w:style w:type="table" w:styleId="824">
     <w:name w:val="Grid Table 7 Colorful - Accent 3"/>
-    <w:basedOn w:val="767"/>
+    <w:basedOn w:val="771"/>
     <w:uiPriority w:val="99"/>
     <w:pPr>
       <w:pBdr/>
@@ -13827,9 +13852,9 @@
       </w:tcPr>
     </w:tblStylePr>
   </w:style>
-  <w:style w:type="table" w:styleId="821">
+  <w:style w:type="table" w:styleId="825">
     <w:name w:val="Grid Table 7 Colorful - Accent 4"/>
-    <w:basedOn w:val="767"/>
+    <w:basedOn w:val="771"/>
     <w:uiPriority w:val="99"/>
     <w:pPr>
       <w:pBdr/>
@@ -14074,9 +14099,9 @@
       </w:tcPr>
     </w:tblStylePr>
   </w:style>
-  <w:style w:type="table" w:styleId="822">
+  <w:style w:type="table" w:styleId="826">
     <w:name w:val="Grid Table 7 Colorful - Accent 5"/>
-    <w:basedOn w:val="767"/>
+    <w:basedOn w:val="771"/>
     <w:uiPriority w:val="99"/>
     <w:pPr>
       <w:pBdr/>
@@ -14321,9 +14346,9 @@
       </w:tcPr>
     </w:tblStylePr>
   </w:style>
-  <w:style w:type="table" w:styleId="823">
+  <w:style w:type="table" w:styleId="827">
     <w:name w:val="Grid Table 7 Colorful - Accent 6"/>
-    <w:basedOn w:val="767"/>
+    <w:basedOn w:val="771"/>
     <w:uiPriority w:val="99"/>
     <w:pPr>
       <w:pBdr/>
@@ -14568,9 +14593,9 @@
       </w:tcPr>
     </w:tblStylePr>
   </w:style>
-  <w:style w:type="table" w:styleId="824">
+  <w:style w:type="table" w:styleId="828">
     <w:name w:val="List Table 1 Light"/>
-    <w:basedOn w:val="767"/>
+    <w:basedOn w:val="771"/>
     <w:uiPriority w:val="99"/>
     <w:pPr>
       <w:pBdr/>
@@ -14779,9 +14804,9 @@
       </w:tcPr>
     </w:tblStylePr>
   </w:style>
-  <w:style w:type="table" w:styleId="825">
+  <w:style w:type="table" w:styleId="829">
     <w:name w:val="List Table 1 Light - Accent 1"/>
-    <w:basedOn w:val="767"/>
+    <w:basedOn w:val="771"/>
     <w:uiPriority w:val="99"/>
     <w:pPr>
       <w:pBdr/>
@@ -14990,9 +15015,9 @@
       </w:tcPr>
     </w:tblStylePr>
   </w:style>
-  <w:style w:type="table" w:styleId="826">
+  <w:style w:type="table" w:styleId="830">
     <w:name w:val="List Table 1 Light - Accent 2"/>
-    <w:basedOn w:val="767"/>
+    <w:basedOn w:val="771"/>
     <w:uiPriority w:val="99"/>
     <w:pPr>
       <w:pBdr/>
@@ -15201,9 +15226,9 @@
       </w:tcPr>
     </w:tblStylePr>
   </w:style>
-  <w:style w:type="table" w:styleId="827">
+  <w:style w:type="table" w:styleId="831">
     <w:name w:val="List Table 1 Light - Accent 3"/>
-    <w:basedOn w:val="767"/>
+    <w:basedOn w:val="771"/>
     <w:uiPriority w:val="99"/>
     <w:pPr>
       <w:pBdr/>
@@ -15412,9 +15437,9 @@
       </w:tcPr>
     </w:tblStylePr>
   </w:style>
-  <w:style w:type="table" w:styleId="828">
+  <w:style w:type="table" w:styleId="832">
     <w:name w:val="List Table 1 Light - Accent 4"/>
-    <w:basedOn w:val="767"/>
+    <w:basedOn w:val="771"/>
     <w:uiPriority w:val="99"/>
     <w:pPr>
       <w:pBdr/>
@@ -15623,9 +15648,9 @@
       </w:tcPr>
     </w:tblStylePr>
   </w:style>
-  <w:style w:type="table" w:styleId="829">
+  <w:style w:type="table" w:styleId="833">
     <w:name w:val="List Table 1 Light - Accent 5"/>
-    <w:basedOn w:val="767"/>
+    <w:basedOn w:val="771"/>
     <w:uiPriority w:val="99"/>
     <w:pPr>
       <w:pBdr/>
@@ -15834,9 +15859,9 @@
       </w:tcPr>
     </w:tblStylePr>
   </w:style>
-  <w:style w:type="table" w:styleId="830">
+  <w:style w:type="table" w:styleId="834">
     <w:name w:val="List Table 1 Light - Accent 6"/>
-    <w:basedOn w:val="767"/>
+    <w:basedOn w:val="771"/>
     <w:uiPriority w:val="99"/>
     <w:pPr>
       <w:pBdr/>
@@ -16045,9 +16070,9 @@
       </w:tcPr>
     </w:tblStylePr>
   </w:style>
-  <w:style w:type="table" w:styleId="831">
+  <w:style w:type="table" w:styleId="835">
     <w:name w:val="List Table 2"/>
-    <w:basedOn w:val="767"/>
+    <w:basedOn w:val="771"/>
     <w:uiPriority w:val="99"/>
     <w:pPr>
       <w:pBdr/>
@@ -16270,9 +16295,9 @@
       </w:tcPr>
     </w:tblStylePr>
   </w:style>
-  <w:style w:type="table" w:styleId="832">
+  <w:style w:type="table" w:styleId="836">
     <w:name w:val="List Table 2 - Accent 1"/>
-    <w:basedOn w:val="767"/>
+    <w:basedOn w:val="771"/>
     <w:uiPriority w:val="99"/>
     <w:pPr>
       <w:pBdr/>
@@ -16495,9 +16520,9 @@
       </w:tcPr>
     </w:tblStylePr>
   </w:style>
-  <w:style w:type="table" w:styleId="833">
+  <w:style w:type="table" w:styleId="837">
     <w:name w:val="List Table 2 - Accent 2"/>
-    <w:basedOn w:val="767"/>
+    <w:basedOn w:val="771"/>
     <w:uiPriority w:val="99"/>
     <w:pPr>
       <w:pBdr/>
@@ -16720,9 +16745,9 @@
       </w:tcPr>
     </w:tblStylePr>
   </w:style>
-  <w:style w:type="table" w:styleId="834">
+  <w:style w:type="table" w:styleId="838">
     <w:name w:val="List Table 2 - Accent 3"/>
-    <w:basedOn w:val="767"/>
+    <w:basedOn w:val="771"/>
     <w:uiPriority w:val="99"/>
     <w:pPr>
       <w:pBdr/>
@@ -16945,9 +16970,9 @@
       </w:tcPr>
     </w:tblStylePr>
   </w:style>
-  <w:style w:type="table" w:styleId="835">
+  <w:style w:type="table" w:styleId="839">
     <w:name w:val="List Table 2 - Accent 4"/>
-    <w:basedOn w:val="767"/>
+    <w:basedOn w:val="771"/>
     <w:uiPriority w:val="99"/>
     <w:pPr>
       <w:pBdr/>
@@ -17170,9 +17195,9 @@
       </w:tcPr>
     </w:tblStylePr>
   </w:style>
-  <w:style w:type="table" w:styleId="836">
+  <w:style w:type="table" w:styleId="840">
     <w:name w:val="List Table 2 - Accent 5"/>
-    <w:basedOn w:val="767"/>
+    <w:basedOn w:val="771"/>
     <w:uiPriority w:val="99"/>
     <w:pPr>
       <w:pBdr/>
@@ -17395,9 +17420,9 @@
       </w:tcPr>
     </w:tblStylePr>
   </w:style>
-  <w:style w:type="table" w:styleId="837">
+  <w:style w:type="table" w:styleId="841">
     <w:name w:val="List Table 2 - Accent 6"/>
-    <w:basedOn w:val="767"/>
+    <w:basedOn w:val="771"/>
     <w:uiPriority w:val="99"/>
     <w:pPr>
       <w:pBdr/>
@@ -17620,9 +17645,9 @@
       </w:tcPr>
     </w:tblStylePr>
   </w:style>
-  <w:style w:type="table" w:styleId="838">
+  <w:style w:type="table" w:styleId="842">
     <w:name w:val="List Table 3"/>
-    <w:basedOn w:val="767"/>
+    <w:basedOn w:val="771"/>
     <w:uiPriority w:val="99"/>
     <w:pPr>
       <w:pBdr/>
@@ -17838,9 +17863,9 @@
       </w:tcPr>
     </w:tblStylePr>
   </w:style>
-  <w:style w:type="table" w:styleId="839">
+  <w:style w:type="table" w:styleId="843">
     <w:name w:val="List Table 3 - Accent 1"/>
-    <w:basedOn w:val="767"/>
+    <w:basedOn w:val="771"/>
     <w:uiPriority w:val="99"/>
     <w:pPr>
       <w:pBdr/>
@@ -18056,9 +18081,9 @@
       </w:tcPr>
     </w:tblStylePr>
   </w:style>
-  <w:style w:type="table" w:styleId="840">
+  <w:style w:type="table" w:styleId="844">
     <w:name w:val="List Table 3 - Accent 2"/>
-    <w:basedOn w:val="767"/>
+    <w:basedOn w:val="771"/>
     <w:uiPriority w:val="99"/>
     <w:pPr>
       <w:pBdr/>
@@ -18274,9 +18299,9 @@
       </w:tcPr>
     </w:tblStylePr>
   </w:style>
-  <w:style w:type="table" w:styleId="841">
+  <w:style w:type="table" w:styleId="845">
     <w:name w:val="List Table 3 - Accent 3"/>
-    <w:basedOn w:val="767"/>
+    <w:basedOn w:val="771"/>
     <w:uiPriority w:val="99"/>
     <w:pPr>
       <w:pBdr/>
@@ -18492,9 +18517,9 @@
       </w:tcPr>
     </w:tblStylePr>
   </w:style>
-  <w:style w:type="table" w:styleId="842">
+  <w:style w:type="table" w:styleId="846">
     <w:name w:val="List Table 3 - Accent 4"/>
-    <w:basedOn w:val="767"/>
+    <w:basedOn w:val="771"/>
     <w:uiPriority w:val="99"/>
     <w:pPr>
       <w:pBdr/>
@@ -18710,9 +18735,9 @@
       </w:tcPr>
     </w:tblStylePr>
   </w:style>
-  <w:style w:type="table" w:styleId="843">
+  <w:style w:type="table" w:styleId="847">
     <w:name w:val="List Table 3 - Accent 5"/>
-    <w:basedOn w:val="767"/>
+    <w:basedOn w:val="771"/>
     <w:uiPriority w:val="99"/>
     <w:pPr>
       <w:pBdr/>
@@ -18928,9 +18953,9 @@
       </w:tcPr>
     </w:tblStylePr>
   </w:style>
-  <w:style w:type="table" w:styleId="844">
+  <w:style w:type="table" w:styleId="848">
     <w:name w:val="List Table 3 - Accent 6"/>
-    <w:basedOn w:val="767"/>
+    <w:basedOn w:val="771"/>
     <w:uiPriority w:val="99"/>
     <w:pPr>
       <w:pBdr/>
@@ -19146,9 +19171,9 @@
       </w:tcPr>
     </w:tblStylePr>
   </w:style>
-  <w:style w:type="table" w:styleId="845">
+  <w:style w:type="table" w:styleId="849">
     <w:name w:val="List Table 4"/>
-    <w:basedOn w:val="767"/>
+    <w:basedOn w:val="771"/>
     <w:uiPriority w:val="99"/>
     <w:pPr>
       <w:pBdr/>
@@ -19361,9 +19386,9 @@
       </w:tcPr>
     </w:tblStylePr>
   </w:style>
-  <w:style w:type="table" w:styleId="846">
+  <w:style w:type="table" w:styleId="850">
     <w:name w:val="List Table 4 - Accent 1"/>
-    <w:basedOn w:val="767"/>
+    <w:basedOn w:val="771"/>
     <w:uiPriority w:val="99"/>
     <w:pPr>
       <w:pBdr/>
@@ -19576,9 +19601,9 @@
       </w:tcPr>
     </w:tblStylePr>
   </w:style>
-  <w:style w:type="table" w:styleId="847">
+  <w:style w:type="table" w:styleId="851">
     <w:name w:val="List Table 4 - Accent 2"/>
-    <w:basedOn w:val="767"/>
+    <w:basedOn w:val="771"/>
     <w:uiPriority w:val="99"/>
     <w:pPr>
       <w:pBdr/>
@@ -19791,9 +19816,9 @@
       </w:tcPr>
     </w:tblStylePr>
   </w:style>
-  <w:style w:type="table" w:styleId="848">
+  <w:style w:type="table" w:styleId="852">
     <w:name w:val="List Table 4 - Accent 3"/>
-    <w:basedOn w:val="767"/>
+    <w:basedOn w:val="771"/>
     <w:uiPriority w:val="99"/>
     <w:pPr>
       <w:pBdr/>
@@ -20006,9 +20031,9 @@
       </w:tcPr>
     </w:tblStylePr>
   </w:style>
-  <w:style w:type="table" w:styleId="849">
+  <w:style w:type="table" w:styleId="853">
     <w:name w:val="List Table 4 - Accent 4"/>
-    <w:basedOn w:val="767"/>
+    <w:basedOn w:val="771"/>
     <w:uiPriority w:val="99"/>
     <w:pPr>
       <w:pBdr/>
@@ -20221,9 +20246,9 @@
       </w:tcPr>
     </w:tblStylePr>
   </w:style>
-  <w:style w:type="table" w:styleId="850">
+  <w:style w:type="table" w:styleId="854">
     <w:name w:val="List Table 4 - Accent 5"/>
-    <w:basedOn w:val="767"/>
+    <w:basedOn w:val="771"/>
     <w:uiPriority w:val="99"/>
     <w:pPr>
       <w:pBdr/>
@@ -20436,9 +20461,9 @@
       </w:tcPr>
     </w:tblStylePr>
   </w:style>
-  <w:style w:type="table" w:styleId="851">
+  <w:style w:type="table" w:styleId="855">
     <w:name w:val="List Table 4 - Accent 6"/>
-    <w:basedOn w:val="767"/>
+    <w:basedOn w:val="771"/>
     <w:uiPriority w:val="99"/>
     <w:pPr>
       <w:pBdr/>
@@ -20651,9 +20676,9 @@
       </w:tcPr>
     </w:tblStylePr>
   </w:style>
-  <w:style w:type="table" w:styleId="852">
+  <w:style w:type="table" w:styleId="856">
     <w:name w:val="List Table 5 Dark"/>
-    <w:basedOn w:val="767"/>
+    <w:basedOn w:val="771"/>
     <w:uiPriority w:val="99"/>
     <w:pPr>
       <w:pBdr/>
@@ -20887,9 +20912,9 @@
       </w:tcPr>
     </w:tblStylePr>
   </w:style>
-  <w:style w:type="table" w:styleId="853">
+  <w:style w:type="table" w:styleId="857">
     <w:name w:val="List Table 5 Dark - Accent 1"/>
-    <w:basedOn w:val="767"/>
+    <w:basedOn w:val="771"/>
     <w:uiPriority w:val="99"/>
     <w:pPr>
       <w:pBdr/>
@@ -21123,9 +21148,9 @@
       </w:tcPr>
     </w:tblStylePr>
   </w:style>
-  <w:style w:type="table" w:styleId="854">
+  <w:style w:type="table" w:styleId="858">
     <w:name w:val="List Table 5 Dark - Accent 2"/>
-    <w:basedOn w:val="767"/>
+    <w:basedOn w:val="771"/>
     <w:uiPriority w:val="99"/>
     <w:pPr>
       <w:pBdr/>
@@ -21359,9 +21384,9 @@
       </w:tcPr>
     </w:tblStylePr>
   </w:style>
-  <w:style w:type="table" w:styleId="855">
+  <w:style w:type="table" w:styleId="859">
     <w:name w:val="List Table 5 Dark - Accent 3"/>
-    <w:basedOn w:val="767"/>
+    <w:basedOn w:val="771"/>
     <w:uiPriority w:val="99"/>
     <w:pPr>
       <w:pBdr/>
@@ -21595,9 +21620,9 @@
       </w:tcPr>
     </w:tblStylePr>
   </w:style>
-  <w:style w:type="table" w:styleId="856">
+  <w:style w:type="table" w:styleId="860">
     <w:name w:val="List Table 5 Dark - Accent 4"/>
-    <w:basedOn w:val="767"/>
+    <w:basedOn w:val="771"/>
     <w:uiPriority w:val="99"/>
     <w:pPr>
       <w:pBdr/>
@@ -21831,9 +21856,9 @@
       </w:tcPr>
     </w:tblStylePr>
   </w:style>
-  <w:style w:type="table" w:styleId="857">
+  <w:style w:type="table" w:styleId="861">
     <w:name w:val="List Table 5 Dark - Accent 5"/>
-    <w:basedOn w:val="767"/>
+    <w:basedOn w:val="771"/>
     <w:uiPriority w:val="99"/>
     <w:pPr>
       <w:pBdr/>
@@ -22067,9 +22092,9 @@
       </w:tcPr>
     </w:tblStylePr>
   </w:style>
-  <w:style w:type="table" w:styleId="858">
+  <w:style w:type="table" w:styleId="862">
     <w:name w:val="List Table 5 Dark - Accent 6"/>
-    <w:basedOn w:val="767"/>
+    <w:basedOn w:val="771"/>
     <w:uiPriority w:val="99"/>
     <w:pPr>
       <w:pBdr/>
@@ -22303,9 +22328,9 @@
       </w:tcPr>
     </w:tblStylePr>
   </w:style>
-  <w:style w:type="table" w:styleId="859">
+  <w:style w:type="table" w:styleId="863">
     <w:name w:val="List Table 6 Colorful"/>
-    <w:basedOn w:val="767"/>
+    <w:basedOn w:val="771"/>
     <w:uiPriority w:val="99"/>
     <w:pPr>
       <w:pBdr/>
@@ -22523,9 +22548,9 @@
       </w:tcPr>
     </w:tblStylePr>
   </w:style>
-  <w:style w:type="table" w:styleId="860">
+  <w:style w:type="table" w:styleId="864">
     <w:name w:val="List Table 6 Colorful - Accent 1"/>
-    <w:basedOn w:val="767"/>
+    <w:basedOn w:val="771"/>
     <w:uiPriority w:val="99"/>
     <w:pPr>
       <w:pBdr/>
@@ -22743,9 +22768,9 @@
       </w:tcPr>
     </w:tblStylePr>
   </w:style>
-  <w:style w:type="table" w:styleId="861">
+  <w:style w:type="table" w:styleId="865">
     <w:name w:val="List Table 6 Colorful - Accent 2"/>
-    <w:basedOn w:val="767"/>
+    <w:basedOn w:val="771"/>
     <w:uiPriority w:val="99"/>
     <w:pPr>
       <w:pBdr/>
@@ -22963,9 +22988,9 @@
       </w:tcPr>
     </w:tblStylePr>
   </w:style>
-  <w:style w:type="table" w:styleId="862">
+  <w:style w:type="table" w:styleId="866">
     <w:name w:val="List Table 6 Colorful - Accent 3"/>
-    <w:basedOn w:val="767"/>
+    <w:basedOn w:val="771"/>
     <w:uiPriority w:val="99"/>
     <w:pPr>
       <w:pBdr/>
@@ -23183,9 +23208,9 @@
       </w:tcPr>
     </w:tblStylePr>
   </w:style>
-  <w:style w:type="table" w:styleId="863">
+  <w:style w:type="table" w:styleId="867">
     <w:name w:val="List Table 6 Colorful - Accent 4"/>
-    <w:basedOn w:val="767"/>
+    <w:basedOn w:val="771"/>
     <w:uiPriority w:val="99"/>
     <w:pPr>
       <w:pBdr/>
@@ -23403,9 +23428,9 @@
       </w:tcPr>
     </w:tblStylePr>
   </w:style>
-  <w:style w:type="table" w:styleId="864">
+  <w:style w:type="table" w:styleId="868">
     <w:name w:val="List Table 6 Colorful - Accent 5"/>
-    <w:basedOn w:val="767"/>
+    <w:basedOn w:val="771"/>
     <w:uiPriority w:val="99"/>
     <w:pPr>
       <w:pBdr/>
@@ -23623,9 +23648,9 @@
       </w:tcPr>
     </w:tblStylePr>
   </w:style>
-  <w:style w:type="table" w:styleId="865">
+  <w:style w:type="table" w:styleId="869">
     <w:name w:val="List Table 6 Colorful - Accent 6"/>
-    <w:basedOn w:val="767"/>
+    <w:basedOn w:val="771"/>
     <w:uiPriority w:val="99"/>
     <w:pPr>
       <w:pBdr/>
@@ -23843,9 +23868,9 @@
       </w:tcPr>
     </w:tblStylePr>
   </w:style>
-  <w:style w:type="table" w:styleId="866">
+  <w:style w:type="table" w:styleId="870">
     <w:name w:val="List Table 7 Colorful"/>
-    <w:basedOn w:val="767"/>
+    <w:basedOn w:val="771"/>
     <w:uiPriority w:val="99"/>
     <w:pPr>
       <w:pBdr/>
@@ -24091,9 +24116,9 @@
       </w:tcPr>
     </w:tblStylePr>
   </w:style>
-  <w:style w:type="table" w:styleId="867">
+  <w:style w:type="table" w:styleId="871">
     <w:name w:val="List Table 7 Colorful - Accent 1"/>
-    <w:basedOn w:val="767"/>
+    <w:basedOn w:val="771"/>
     <w:uiPriority w:val="99"/>
     <w:pPr>
       <w:pBdr/>
@@ -24339,9 +24364,9 @@
       </w:tcPr>
     </w:tblStylePr>
   </w:style>
-  <w:style w:type="table" w:styleId="868">
+  <w:style w:type="table" w:styleId="872">
     <w:name w:val="List Table 7 Colorful - Accent 2"/>
-    <w:basedOn w:val="767"/>
+    <w:basedOn w:val="771"/>
     <w:uiPriority w:val="99"/>
     <w:pPr>
       <w:pBdr/>
@@ -24587,9 +24612,9 @@
       </w:tcPr>
     </w:tblStylePr>
   </w:style>
-  <w:style w:type="table" w:styleId="869">
+  <w:style w:type="table" w:styleId="873">
     <w:name w:val="List Table 7 Colorful - Accent 3"/>
-    <w:basedOn w:val="767"/>
+    <w:basedOn w:val="771"/>
     <w:uiPriority w:val="99"/>
     <w:pPr>
       <w:pBdr/>
@@ -24835,9 +24860,9 @@
       </w:tcPr>
     </w:tblStylePr>
   </w:style>
-  <w:style w:type="table" w:styleId="870">
+  <w:style w:type="table" w:styleId="874">
     <w:name w:val="List Table 7 Colorful - Accent 4"/>
-    <w:basedOn w:val="767"/>
+    <w:basedOn w:val="771"/>
     <w:uiPriority w:val="99"/>
     <w:pPr>
       <w:pBdr/>
@@ -25083,9 +25108,9 @@
       </w:tcPr>
     </w:tblStylePr>
   </w:style>
-  <w:style w:type="table" w:styleId="871">
+  <w:style w:type="table" w:styleId="875">
     <w:name w:val="List Table 7 Colorful - Accent 5"/>
-    <w:basedOn w:val="767"/>
+    <w:basedOn w:val="771"/>
     <w:uiPriority w:val="99"/>
     <w:pPr>
       <w:pBdr/>
@@ -25331,9 +25356,9 @@
       </w:tcPr>
     </w:tblStylePr>
   </w:style>
-  <w:style w:type="table" w:styleId="872">
+  <w:style w:type="table" w:styleId="876">
     <w:name w:val="List Table 7 Colorful - Accent 6"/>
-    <w:basedOn w:val="767"/>
+    <w:basedOn w:val="771"/>
     <w:uiPriority w:val="99"/>
     <w:pPr>
       <w:pBdr/>
@@ -25579,9 +25604,9 @@
       </w:tcPr>
     </w:tblStylePr>
   </w:style>
-  <w:style w:type="table" w:styleId="873">
+  <w:style w:type="table" w:styleId="877">
     <w:name w:val="Lined - Accent"/>
-    <w:basedOn w:val="767"/>
+    <w:basedOn w:val="771"/>
     <w:uiPriority w:val="99"/>
     <w:pPr>
       <w:pBdr/>
@@ -25796,9 +25821,9 @@
       </w:tcPr>
     </w:tblStylePr>
   </w:style>
-  <w:style w:type="table" w:styleId="874">
+  <w:style w:type="table" w:styleId="878">
     <w:name w:val="Lined - Accent 1"/>
-    <w:basedOn w:val="767"/>
+    <w:basedOn w:val="771"/>
     <w:uiPriority w:val="99"/>
     <w:pPr>
       <w:pBdr/>
@@ -26013,9 +26038,9 @@
       </w:tcPr>
     </w:tblStylePr>
   </w:style>
-  <w:style w:type="table" w:styleId="875">
+  <w:style w:type="table" w:styleId="879">
     <w:name w:val="Lined - Accent 2"/>
-    <w:basedOn w:val="767"/>
+    <w:basedOn w:val="771"/>
     <w:uiPriority w:val="99"/>
     <w:pPr>
       <w:pBdr/>
@@ -26230,9 +26255,9 @@
       </w:tcPr>
     </w:tblStylePr>
   </w:style>
-  <w:style w:type="table" w:styleId="876">
+  <w:style w:type="table" w:styleId="880">
     <w:name w:val="Lined - Accent 3"/>
-    <w:basedOn w:val="767"/>
+    <w:basedOn w:val="771"/>
     <w:uiPriority w:val="99"/>
     <w:pPr>
       <w:pBdr/>
@@ -26447,9 +26472,9 @@
       </w:tcPr>
     </w:tblStylePr>
   </w:style>
-  <w:style w:type="table" w:styleId="877">
+  <w:style w:type="table" w:styleId="881">
     <w:name w:val="Lined - Accent 4"/>
-    <w:basedOn w:val="767"/>
+    <w:basedOn w:val="771"/>
     <w:uiPriority w:val="99"/>
     <w:pPr>
       <w:pBdr/>
@@ -26664,9 +26689,9 @@
       </w:tcPr>
     </w:tblStylePr>
   </w:style>
-  <w:style w:type="table" w:styleId="878">
+  <w:style w:type="table" w:styleId="882">
     <w:name w:val="Lined - Accent 5"/>
-    <w:basedOn w:val="767"/>
+    <w:basedOn w:val="771"/>
     <w:uiPriority w:val="99"/>
     <w:pPr>
       <w:pBdr/>
@@ -26881,9 +26906,9 @@
       </w:tcPr>
     </w:tblStylePr>
   </w:style>
-  <w:style w:type="table" w:styleId="879">
+  <w:style w:type="table" w:styleId="883">
     <w:name w:val="Lined - Accent 6"/>
-    <w:basedOn w:val="767"/>
+    <w:basedOn w:val="771"/>
     <w:uiPriority w:val="99"/>
     <w:pPr>
       <w:pBdr/>
@@ -27098,9 +27123,9 @@
       </w:tcPr>
     </w:tblStylePr>
   </w:style>
-  <w:style w:type="table" w:styleId="880">
+  <w:style w:type="table" w:styleId="884">
     <w:name w:val="Bordered &amp; Lined - Accent"/>
-    <w:basedOn w:val="767"/>
+    <w:basedOn w:val="771"/>
     <w:uiPriority w:val="99"/>
     <w:pPr>
       <w:pBdr/>
@@ -27322,9 +27347,9 @@
       </w:tcPr>
     </w:tblStylePr>
   </w:style>
-  <w:style w:type="table" w:styleId="881">
+  <w:style w:type="table" w:styleId="885">
     <w:name w:val="Bordered &amp; Lined - Accent 1"/>
-    <w:basedOn w:val="767"/>
+    <w:basedOn w:val="771"/>
     <w:uiPriority w:val="99"/>
     <w:pPr>
       <w:pBdr/>
@@ -27546,9 +27571,9 @@
       </w:tcPr>
     </w:tblStylePr>
   </w:style>
-  <w:style w:type="table" w:styleId="882">
+  <w:style w:type="table" w:styleId="886">
     <w:name w:val="Bordered &amp; Lined - Accent 2"/>
-    <w:basedOn w:val="767"/>
+    <w:basedOn w:val="771"/>
     <w:uiPriority w:val="99"/>
     <w:pPr>
       <w:pBdr/>
@@ -27770,9 +27795,9 @@
       </w:tcPr>
     </w:tblStylePr>
   </w:style>
-  <w:style w:type="table" w:styleId="883">
+  <w:style w:type="table" w:styleId="887">
     <w:name w:val="Bordered &amp; Lined - Accent 3"/>
-    <w:basedOn w:val="767"/>
+    <w:basedOn w:val="771"/>
     <w:uiPriority w:val="99"/>
     <w:pPr>
       <w:pBdr/>
@@ -27994,9 +28019,9 @@
       </w:tcPr>
     </w:tblStylePr>
   </w:style>
-  <w:style w:type="table" w:styleId="884">
+  <w:style w:type="table" w:styleId="888">
     <w:name w:val="Bordered &amp; Lined - Accent 4"/>
-    <w:basedOn w:val="767"/>
+    <w:basedOn w:val="771"/>
     <w:uiPriority w:val="99"/>
     <w:pPr>
       <w:pBdr/>
@@ -28218,9 +28243,9 @@
       </w:tcPr>
     </w:tblStylePr>
   </w:style>
-  <w:style w:type="table" w:styleId="885">
+  <w:style w:type="table" w:styleId="889">
     <w:name w:val="Bordered &amp; Lined - Accent 5"/>
-    <w:basedOn w:val="767"/>
+    <w:basedOn w:val="771"/>
     <w:uiPriority w:val="99"/>
     <w:pPr>
       <w:pBdr/>
@@ -28442,9 +28467,9 @@
       </w:tcPr>
     </w:tblStylePr>
   </w:style>
-  <w:style w:type="table" w:styleId="886">
+  <w:style w:type="table" w:styleId="890">
     <w:name w:val="Bordered &amp; Lined - Accent 6"/>
-    <w:basedOn w:val="767"/>
+    <w:basedOn w:val="771"/>
     <w:uiPriority w:val="99"/>
     <w:pPr>
       <w:pBdr/>
@@ -28666,9 +28691,9 @@
       </w:tcPr>
     </w:tblStylePr>
   </w:style>
-  <w:style w:type="table" w:styleId="887">
+  <w:style w:type="table" w:styleId="891">
     <w:name w:val="Bordered"/>
-    <w:basedOn w:val="767"/>
+    <w:basedOn w:val="771"/>
     <w:uiPriority w:val="99"/>
     <w:pPr>
       <w:pBdr/>
@@ -28886,9 +28911,9 @@
       </w:tcPr>
     </w:tblStylePr>
   </w:style>
-  <w:style w:type="table" w:styleId="888">
+  <w:style w:type="table" w:styleId="892">
     <w:name w:val="Bordered - Accent 1"/>
-    <w:basedOn w:val="767"/>
+    <w:basedOn w:val="771"/>
     <w:uiPriority w:val="99"/>
     <w:pPr>
       <w:pBdr/>
@@ -29106,9 +29131,9 @@
       </w:tcPr>
     </w:tblStylePr>
   </w:style>
-  <w:style w:type="table" w:styleId="889">
+  <w:style w:type="table" w:styleId="893">
     <w:name w:val="Bordered - Accent 2"/>
-    <w:basedOn w:val="767"/>
+    <w:basedOn w:val="771"/>
     <w:uiPriority w:val="99"/>
     <w:pPr>
       <w:pBdr/>
@@ -29326,9 +29351,9 @@
       </w:tcPr>
     </w:tblStylePr>
   </w:style>
-  <w:style w:type="table" w:styleId="890">
+  <w:style w:type="table" w:styleId="894">
     <w:name w:val="Bordered - Accent 3"/>
-    <w:basedOn w:val="767"/>
+    <w:basedOn w:val="771"/>
     <w:uiPriority w:val="99"/>
     <w:pPr>
       <w:pBdr/>
@@ -29546,9 +29571,9 @@
       </w:tcPr>
     </w:tblStylePr>
   </w:style>
-  <w:style w:type="table" w:styleId="891">
+  <w:style w:type="table" w:styleId="895">
     <w:name w:val="Bordered - Accent 4"/>
-    <w:basedOn w:val="767"/>
+    <w:basedOn w:val="771"/>
     <w:uiPriority w:val="99"/>
     <w:pPr>
       <w:pBdr/>
@@ -29766,9 +29791,9 @@
       </w:tcPr>
     </w:tblStylePr>
   </w:style>
-  <w:style w:type="table" w:styleId="892">
+  <w:style w:type="table" w:styleId="896">
     <w:name w:val="Bordered - Accent 5"/>
-    <w:basedOn w:val="767"/>
+    <w:basedOn w:val="771"/>
     <w:uiPriority w:val="99"/>
     <w:pPr>
       <w:pBdr/>
@@ -29986,9 +30011,9 @@
       </w:tcPr>
     </w:tblStylePr>
   </w:style>
-  <w:style w:type="table" w:styleId="893">
+  <w:style w:type="table" w:styleId="897">
     <w:name w:val="Bordered - Accent 6"/>
-    <w:basedOn w:val="767"/>
+    <w:basedOn w:val="771"/>
     <w:uiPriority w:val="99"/>
     <w:pPr>
       <w:pBdr/>

</xml_diff>

<commit_message>
feat: add visual and audible alerts when CPM exceeds threshold
</commit_message>
<xml_diff>
--- a/Misc documents  and software/thanks for buying Zen rob.docx
+++ b/Misc documents  and software/thanks for buying Zen rob.docx
@@ -4,7 +4,7 @@
   <w:body>
     <w:p>
       <w:pPr>
-        <w:pStyle w:val="710"/>
+        <w:pStyle w:val="711"/>
         <w:pBdr/>
         <w:bidi w:val="false"/>
         <w:spacing/>
@@ -36,7 +36,7 @@
     </w:p>
     <w:p>
       <w:pPr>
-        <w:pStyle w:val="710"/>
+        <w:pStyle w:val="711"/>
         <w:pBdr/>
         <w:bidi w:val="false"/>
         <w:spacing/>
@@ -159,7 +159,7 @@
     </w:p>
     <w:p>
       <w:pPr>
-        <w:pStyle w:val="710"/>
+        <w:pStyle w:val="711"/>
         <w:pBdr/>
         <w:bidi w:val="false"/>
         <w:spacing/>
@@ -204,7 +204,7 @@
     </w:p>
     <w:p>
       <w:pPr>
-        <w:pStyle w:val="710"/>
+        <w:pStyle w:val="711"/>
         <w:pBdr/>
         <w:bidi w:val="false"/>
         <w:spacing/>
@@ -248,7 +248,7 @@
     </w:p>
     <w:p>
       <w:pPr>
-        <w:pStyle w:val="710"/>
+        <w:pStyle w:val="711"/>
         <w:pBdr/>
         <w:bidi w:val="false"/>
         <w:spacing/>
@@ -293,7 +293,7 @@
     </w:p>
     <w:p>
       <w:pPr>
-        <w:pStyle w:val="710"/>
+        <w:pStyle w:val="711"/>
         <w:widowControl w:val="true"/>
         <w:pBdr/>
         <w:bidi w:val="false"/>
@@ -339,7 +339,7 @@
     </w:p>
     <w:p>
       <w:pPr>
-        <w:pStyle w:val="710"/>
+        <w:pStyle w:val="711"/>
         <w:widowControl w:val="true"/>
         <w:pBdr/>
         <w:bidi w:val="false"/>
@@ -384,7 +384,7 @@
           <w:szCs w:val="15"/>
           <w:lang w:val="ja-JP"/>
         </w:rPr>
-        <w:t xml:space="preserve">7</w:t>
+        <w:t xml:space="preserve">8</w:t>
       </w:r>
       <w:r>
         <w:rPr>
@@ -405,7 +405,7 @@
           <w:szCs w:val="15"/>
           <w:lang w:val="ja-JP"/>
         </w:rPr>
-        <w:t xml:space="preserve">30</w:t>
+        <w:t xml:space="preserve">05</w:t>
       </w:r>
       <w:r>
         <w:rPr>
@@ -653,9 +653,9 @@
     <w:lsdException w:name="Bibliography" w:uiPriority="37"/>
     <w:lsdException w:name="TOC Heading" w:uiPriority="39" w:qFormat="1"/>
   </w:latentStyles>
-  <w:style w:type="character" w:styleId="197">
+  <w:style w:type="character" w:styleId="701">
     <w:name w:val="Placeholder Text"/>
-    <w:basedOn w:val="720"/>
+    <w:basedOn w:val="721"/>
     <w:uiPriority w:val="99"/>
     <w:semiHidden/>
     <w:pPr>
@@ -667,10 +667,10 @@
       <w:color w:val="666666"/>
     </w:rPr>
   </w:style>
-  <w:style w:type="paragraph" w:styleId="701">
+  <w:style w:type="paragraph" w:styleId="702">
     <w:name w:val="toc 1"/>
-    <w:basedOn w:val="710"/>
-    <w:next w:val="710"/>
+    <w:basedOn w:val="711"/>
+    <w:next w:val="711"/>
     <w:uiPriority w:val="39"/>
     <w:unhideWhenUsed/>
     <w:pPr>
@@ -679,10 +679,10 @@
       <w:ind/>
     </w:pPr>
   </w:style>
-  <w:style w:type="paragraph" w:styleId="702">
+  <w:style w:type="paragraph" w:styleId="703">
     <w:name w:val="toc 2"/>
-    <w:basedOn w:val="710"/>
-    <w:next w:val="710"/>
+    <w:basedOn w:val="711"/>
+    <w:next w:val="711"/>
     <w:uiPriority w:val="39"/>
     <w:unhideWhenUsed/>
     <w:pPr>
@@ -691,10 +691,10 @@
       <w:ind w:left="220"/>
     </w:pPr>
   </w:style>
-  <w:style w:type="paragraph" w:styleId="703">
+  <w:style w:type="paragraph" w:styleId="704">
     <w:name w:val="toc 3"/>
-    <w:basedOn w:val="710"/>
-    <w:next w:val="710"/>
+    <w:basedOn w:val="711"/>
+    <w:next w:val="711"/>
     <w:uiPriority w:val="39"/>
     <w:unhideWhenUsed/>
     <w:pPr>
@@ -703,10 +703,10 @@
       <w:ind w:left="440"/>
     </w:pPr>
   </w:style>
-  <w:style w:type="paragraph" w:styleId="704">
+  <w:style w:type="paragraph" w:styleId="705">
     <w:name w:val="toc 4"/>
-    <w:basedOn w:val="710"/>
-    <w:next w:val="710"/>
+    <w:basedOn w:val="711"/>
+    <w:next w:val="711"/>
     <w:uiPriority w:val="39"/>
     <w:unhideWhenUsed/>
     <w:pPr>
@@ -715,10 +715,10 @@
       <w:ind w:left="660"/>
     </w:pPr>
   </w:style>
-  <w:style w:type="paragraph" w:styleId="705">
+  <w:style w:type="paragraph" w:styleId="706">
     <w:name w:val="toc 5"/>
-    <w:basedOn w:val="710"/>
-    <w:next w:val="710"/>
+    <w:basedOn w:val="711"/>
+    <w:next w:val="711"/>
     <w:uiPriority w:val="39"/>
     <w:unhideWhenUsed/>
     <w:pPr>
@@ -727,10 +727,10 @@
       <w:ind w:left="880"/>
     </w:pPr>
   </w:style>
-  <w:style w:type="paragraph" w:styleId="706">
+  <w:style w:type="paragraph" w:styleId="707">
     <w:name w:val="toc 6"/>
-    <w:basedOn w:val="710"/>
-    <w:next w:val="710"/>
+    <w:basedOn w:val="711"/>
+    <w:next w:val="711"/>
     <w:uiPriority w:val="39"/>
     <w:unhideWhenUsed/>
     <w:pPr>
@@ -739,10 +739,10 @@
       <w:ind w:left="1100"/>
     </w:pPr>
   </w:style>
-  <w:style w:type="paragraph" w:styleId="707">
+  <w:style w:type="paragraph" w:styleId="708">
     <w:name w:val="toc 7"/>
-    <w:basedOn w:val="710"/>
-    <w:next w:val="710"/>
+    <w:basedOn w:val="711"/>
+    <w:next w:val="711"/>
     <w:uiPriority w:val="39"/>
     <w:unhideWhenUsed/>
     <w:pPr>
@@ -751,10 +751,10 @@
       <w:ind w:left="1320"/>
     </w:pPr>
   </w:style>
-  <w:style w:type="paragraph" w:styleId="708">
+  <w:style w:type="paragraph" w:styleId="709">
     <w:name w:val="toc 8"/>
-    <w:basedOn w:val="710"/>
-    <w:next w:val="710"/>
+    <w:basedOn w:val="711"/>
+    <w:next w:val="711"/>
     <w:uiPriority w:val="39"/>
     <w:unhideWhenUsed/>
     <w:pPr>
@@ -763,10 +763,10 @@
       <w:ind w:left="1540"/>
     </w:pPr>
   </w:style>
-  <w:style w:type="paragraph" w:styleId="709">
+  <w:style w:type="paragraph" w:styleId="710">
     <w:name w:val="toc 9"/>
-    <w:basedOn w:val="710"/>
-    <w:next w:val="710"/>
+    <w:basedOn w:val="711"/>
+    <w:next w:val="711"/>
     <w:uiPriority w:val="39"/>
     <w:unhideWhenUsed/>
     <w:pPr>
@@ -775,7 +775,7 @@
       <w:ind w:left="1760"/>
     </w:pPr>
   </w:style>
-  <w:style w:type="paragraph" w:styleId="710" w:default="1">
+  <w:style w:type="paragraph" w:styleId="711" w:default="1">
     <w:name w:val="Normal"/>
     <w:qFormat/>
     <w:pPr>
@@ -794,11 +794,11 @@
       <w:lang w:val="en-US" w:eastAsia="zh-CN" w:bidi="hi-IN"/>
     </w:rPr>
   </w:style>
-  <w:style w:type="paragraph" w:styleId="711">
+  <w:style w:type="paragraph" w:styleId="712">
     <w:name w:val="Heading 1"/>
-    <w:basedOn w:val="710"/>
-    <w:next w:val="710"/>
-    <w:link w:val="721"/>
+    <w:basedOn w:val="711"/>
+    <w:next w:val="711"/>
+    <w:link w:val="722"/>
     <w:uiPriority w:val="9"/>
     <w:qFormat/>
     <w:pPr>
@@ -816,11 +816,11 @@
       <w:szCs w:val="40"/>
     </w:rPr>
   </w:style>
-  <w:style w:type="paragraph" w:styleId="712">
+  <w:style w:type="paragraph" w:styleId="713">
     <w:name w:val="Heading 2"/>
-    <w:basedOn w:val="710"/>
-    <w:next w:val="710"/>
-    <w:link w:val="722"/>
+    <w:basedOn w:val="711"/>
+    <w:next w:val="711"/>
+    <w:link w:val="723"/>
     <w:uiPriority w:val="9"/>
     <w:unhideWhenUsed/>
     <w:qFormat/>
@@ -839,11 +839,11 @@
       <w:szCs w:val="32"/>
     </w:rPr>
   </w:style>
-  <w:style w:type="paragraph" w:styleId="713">
+  <w:style w:type="paragraph" w:styleId="714">
     <w:name w:val="Heading 3"/>
-    <w:basedOn w:val="710"/>
-    <w:next w:val="710"/>
-    <w:link w:val="723"/>
+    <w:basedOn w:val="711"/>
+    <w:next w:val="711"/>
+    <w:link w:val="724"/>
     <w:uiPriority w:val="9"/>
     <w:unhideWhenUsed/>
     <w:qFormat/>
@@ -862,11 +862,11 @@
       <w:szCs w:val="28"/>
     </w:rPr>
   </w:style>
-  <w:style w:type="paragraph" w:styleId="714">
+  <w:style w:type="paragraph" w:styleId="715">
     <w:name w:val="Heading 4"/>
-    <w:basedOn w:val="710"/>
-    <w:next w:val="710"/>
-    <w:link w:val="724"/>
+    <w:basedOn w:val="711"/>
+    <w:next w:val="711"/>
+    <w:link w:val="725"/>
     <w:uiPriority w:val="9"/>
     <w:unhideWhenUsed/>
     <w:qFormat/>
@@ -885,11 +885,11 @@
       <w:color w:val="0f4761" w:themeColor="accent1" w:themeShade="BF"/>
     </w:rPr>
   </w:style>
-  <w:style w:type="paragraph" w:styleId="715">
+  <w:style w:type="paragraph" w:styleId="716">
     <w:name w:val="Heading 5"/>
-    <w:basedOn w:val="710"/>
-    <w:next w:val="710"/>
-    <w:link w:val="725"/>
+    <w:basedOn w:val="711"/>
+    <w:next w:val="711"/>
+    <w:link w:val="726"/>
     <w:uiPriority w:val="9"/>
     <w:unhideWhenUsed/>
     <w:qFormat/>
@@ -906,11 +906,11 @@
       <w:color w:val="0f4761" w:themeColor="accent1" w:themeShade="BF"/>
     </w:rPr>
   </w:style>
-  <w:style w:type="paragraph" w:styleId="716">
+  <w:style w:type="paragraph" w:styleId="717">
     <w:name w:val="Heading 6"/>
-    <w:basedOn w:val="710"/>
-    <w:next w:val="710"/>
-    <w:link w:val="726"/>
+    <w:basedOn w:val="711"/>
+    <w:next w:val="711"/>
+    <w:link w:val="727"/>
     <w:uiPriority w:val="9"/>
     <w:unhideWhenUsed/>
     <w:qFormat/>
@@ -929,11 +929,11 @@
       <w:color w:val="595959" w:themeColor="text1" w:themeTint="A6"/>
     </w:rPr>
   </w:style>
-  <w:style w:type="paragraph" w:styleId="717">
+  <w:style w:type="paragraph" w:styleId="718">
     <w:name w:val="Heading 7"/>
-    <w:basedOn w:val="710"/>
-    <w:next w:val="710"/>
-    <w:link w:val="727"/>
+    <w:basedOn w:val="711"/>
+    <w:next w:val="711"/>
+    <w:link w:val="728"/>
     <w:uiPriority w:val="9"/>
     <w:unhideWhenUsed/>
     <w:qFormat/>
@@ -950,11 +950,11 @@
       <w:color w:val="595959" w:themeColor="text1" w:themeTint="A6"/>
     </w:rPr>
   </w:style>
-  <w:style w:type="paragraph" w:styleId="718">
+  <w:style w:type="paragraph" w:styleId="719">
     <w:name w:val="Heading 8"/>
-    <w:basedOn w:val="710"/>
-    <w:next w:val="710"/>
-    <w:link w:val="728"/>
+    <w:basedOn w:val="711"/>
+    <w:next w:val="711"/>
+    <w:link w:val="729"/>
     <w:uiPriority w:val="9"/>
     <w:unhideWhenUsed/>
     <w:qFormat/>
@@ -973,11 +973,11 @@
       <w:color w:val="272727" w:themeColor="text1" w:themeTint="D8"/>
     </w:rPr>
   </w:style>
-  <w:style w:type="paragraph" w:styleId="719">
+  <w:style w:type="paragraph" w:styleId="720">
     <w:name w:val="Heading 9"/>
-    <w:basedOn w:val="710"/>
-    <w:next w:val="710"/>
-    <w:link w:val="729"/>
+    <w:basedOn w:val="711"/>
+    <w:next w:val="711"/>
+    <w:link w:val="730"/>
     <w:uiPriority w:val="9"/>
     <w:unhideWhenUsed/>
     <w:qFormat/>
@@ -996,7 +996,7 @@
       <w:color w:val="272727" w:themeColor="text1" w:themeTint="D8"/>
     </w:rPr>
   </w:style>
-  <w:style w:type="character" w:styleId="720" w:default="1">
+  <w:style w:type="character" w:styleId="721" w:default="1">
     <w:name w:val="Default Paragraph Font"/>
     <w:uiPriority w:val="1"/>
     <w:semiHidden/>
@@ -1008,10 +1008,10 @@
       <w:ind/>
     </w:pPr>
   </w:style>
-  <w:style w:type="character" w:styleId="721">
+  <w:style w:type="character" w:styleId="722">
     <w:name w:val="Heading 1 Char"/>
-    <w:basedOn w:val="720"/>
-    <w:link w:val="711"/>
+    <w:basedOn w:val="721"/>
+    <w:link w:val="712"/>
     <w:uiPriority w:val="9"/>
     <w:qFormat/>
     <w:pPr>
@@ -1026,10 +1026,10 @@
       <w:szCs w:val="40"/>
     </w:rPr>
   </w:style>
-  <w:style w:type="character" w:styleId="722">
+  <w:style w:type="character" w:styleId="723">
     <w:name w:val="Heading 2 Char"/>
-    <w:basedOn w:val="720"/>
-    <w:link w:val="712"/>
+    <w:basedOn w:val="721"/>
+    <w:link w:val="713"/>
     <w:uiPriority w:val="9"/>
     <w:qFormat/>
     <w:pPr>
@@ -1044,10 +1044,10 @@
       <w:szCs w:val="32"/>
     </w:rPr>
   </w:style>
-  <w:style w:type="character" w:styleId="723">
+  <w:style w:type="character" w:styleId="724">
     <w:name w:val="Heading 3 Char"/>
-    <w:basedOn w:val="720"/>
-    <w:link w:val="713"/>
+    <w:basedOn w:val="721"/>
+    <w:link w:val="714"/>
     <w:uiPriority w:val="9"/>
     <w:qFormat/>
     <w:pPr>
@@ -1062,10 +1062,10 @@
       <w:szCs w:val="28"/>
     </w:rPr>
   </w:style>
-  <w:style w:type="character" w:styleId="724">
+  <w:style w:type="character" w:styleId="725">
     <w:name w:val="Heading 4 Char"/>
-    <w:basedOn w:val="720"/>
-    <w:link w:val="714"/>
+    <w:basedOn w:val="721"/>
+    <w:link w:val="715"/>
     <w:uiPriority w:val="9"/>
     <w:qFormat/>
     <w:pPr>
@@ -1080,10 +1080,10 @@
       <w:color w:val="0f4761" w:themeColor="accent1" w:themeShade="BF"/>
     </w:rPr>
   </w:style>
-  <w:style w:type="character" w:styleId="725">
+  <w:style w:type="character" w:styleId="726">
     <w:name w:val="Heading 5 Char"/>
-    <w:basedOn w:val="720"/>
-    <w:link w:val="715"/>
+    <w:basedOn w:val="721"/>
+    <w:link w:val="716"/>
     <w:uiPriority w:val="9"/>
     <w:qFormat/>
     <w:pPr>
@@ -1096,10 +1096,10 @@
       <w:color w:val="0f4761" w:themeColor="accent1" w:themeShade="BF"/>
     </w:rPr>
   </w:style>
-  <w:style w:type="character" w:styleId="726">
+  <w:style w:type="character" w:styleId="727">
     <w:name w:val="Heading 6 Char"/>
-    <w:basedOn w:val="720"/>
-    <w:link w:val="716"/>
+    <w:basedOn w:val="721"/>
+    <w:link w:val="717"/>
     <w:uiPriority w:val="9"/>
     <w:qFormat/>
     <w:pPr>
@@ -1114,10 +1114,10 @@
       <w:color w:val="595959" w:themeColor="text1" w:themeTint="A6"/>
     </w:rPr>
   </w:style>
-  <w:style w:type="character" w:styleId="727">
+  <w:style w:type="character" w:styleId="728">
     <w:name w:val="Heading 7 Char"/>
-    <w:basedOn w:val="720"/>
-    <w:link w:val="717"/>
+    <w:basedOn w:val="721"/>
+    <w:link w:val="718"/>
     <w:uiPriority w:val="9"/>
     <w:qFormat/>
     <w:pPr>
@@ -1130,27 +1130,9 @@
       <w:color w:val="595959" w:themeColor="text1" w:themeTint="A6"/>
     </w:rPr>
   </w:style>
-  <w:style w:type="character" w:styleId="728">
+  <w:style w:type="character" w:styleId="729">
     <w:name w:val="Heading 8 Char"/>
-    <w:basedOn w:val="720"/>
-    <w:link w:val="718"/>
-    <w:uiPriority w:val="9"/>
-    <w:qFormat/>
-    <w:pPr>
-      <w:pBdr/>
-      <w:spacing/>
-      <w:ind/>
-    </w:pPr>
-    <w:rPr>
-      <w:rFonts w:ascii="Arial" w:hAnsi="Arial" w:eastAsia="Arial" w:cs="Arial"/>
-      <w:i/>
-      <w:iCs/>
-      <w:color w:val="272727" w:themeColor="text1" w:themeTint="D8"/>
-    </w:rPr>
-  </w:style>
-  <w:style w:type="character" w:styleId="729">
-    <w:name w:val="Heading 9 Char"/>
-    <w:basedOn w:val="720"/>
+    <w:basedOn w:val="721"/>
     <w:link w:val="719"/>
     <w:uiPriority w:val="9"/>
     <w:qFormat/>
@@ -1167,9 +1149,27 @@
     </w:rPr>
   </w:style>
   <w:style w:type="character" w:styleId="730">
+    <w:name w:val="Heading 9 Char"/>
+    <w:basedOn w:val="721"/>
+    <w:link w:val="720"/>
+    <w:uiPriority w:val="9"/>
+    <w:qFormat/>
+    <w:pPr>
+      <w:pBdr/>
+      <w:spacing/>
+      <w:ind/>
+    </w:pPr>
+    <w:rPr>
+      <w:rFonts w:ascii="Arial" w:hAnsi="Arial" w:eastAsia="Arial" w:cs="Arial"/>
+      <w:i/>
+      <w:iCs/>
+      <w:color w:val="272727" w:themeColor="text1" w:themeTint="D8"/>
+    </w:rPr>
+  </w:style>
+  <w:style w:type="character" w:styleId="731">
     <w:name w:val="Title Char"/>
-    <w:basedOn w:val="720"/>
-    <w:link w:val="756"/>
+    <w:basedOn w:val="721"/>
+    <w:link w:val="757"/>
     <w:uiPriority w:val="10"/>
     <w:qFormat/>
     <w:pPr>
@@ -1184,10 +1184,10 @@
       <w:szCs w:val="56"/>
     </w:rPr>
   </w:style>
-  <w:style w:type="character" w:styleId="731">
+  <w:style w:type="character" w:styleId="732">
     <w:name w:val="Subtitle Char"/>
-    <w:basedOn w:val="720"/>
-    <w:link w:val="757"/>
+    <w:basedOn w:val="721"/>
+    <w:link w:val="758"/>
     <w:uiPriority w:val="11"/>
     <w:qFormat/>
     <w:pPr>
@@ -1202,10 +1202,10 @@
       <w:szCs w:val="28"/>
     </w:rPr>
   </w:style>
-  <w:style w:type="character" w:styleId="732">
+  <w:style w:type="character" w:styleId="733">
     <w:name w:val="Quote Char"/>
-    <w:basedOn w:val="720"/>
-    <w:link w:val="758"/>
+    <w:basedOn w:val="721"/>
+    <w:link w:val="759"/>
     <w:uiPriority w:val="29"/>
     <w:qFormat/>
     <w:pPr>
@@ -1219,9 +1219,9 @@
       <w:color w:val="404040" w:themeColor="text1" w:themeTint="BF"/>
     </w:rPr>
   </w:style>
-  <w:style w:type="character" w:styleId="733">
+  <w:style w:type="character" w:styleId="734">
     <w:name w:val="Intense Emphasis"/>
-    <w:basedOn w:val="720"/>
+    <w:basedOn w:val="721"/>
     <w:uiPriority w:val="21"/>
     <w:qFormat/>
     <w:pPr>
@@ -1235,10 +1235,10 @@
       <w:color w:val="0f4761" w:themeColor="accent1" w:themeShade="BF"/>
     </w:rPr>
   </w:style>
-  <w:style w:type="character" w:styleId="734">
+  <w:style w:type="character" w:styleId="735">
     <w:name w:val="Intense Quote Char"/>
-    <w:basedOn w:val="720"/>
-    <w:link w:val="760"/>
+    <w:basedOn w:val="721"/>
+    <w:link w:val="761"/>
     <w:uiPriority w:val="30"/>
     <w:qFormat/>
     <w:pPr>
@@ -1252,9 +1252,9 @@
       <w:color w:val="0f4761" w:themeColor="accent1" w:themeShade="BF"/>
     </w:rPr>
   </w:style>
-  <w:style w:type="character" w:styleId="735">
+  <w:style w:type="character" w:styleId="736">
     <w:name w:val="Intense Reference"/>
-    <w:basedOn w:val="720"/>
+    <w:basedOn w:val="721"/>
     <w:uiPriority w:val="32"/>
     <w:qFormat/>
     <w:pPr>
@@ -1270,9 +1270,9 @@
       <w:spacing w:val="5"/>
     </w:rPr>
   </w:style>
-  <w:style w:type="character" w:styleId="736">
+  <w:style w:type="character" w:styleId="737">
     <w:name w:val="Subtle Emphasis"/>
-    <w:basedOn w:val="720"/>
+    <w:basedOn w:val="721"/>
     <w:uiPriority w:val="19"/>
     <w:qFormat/>
     <w:pPr>
@@ -1286,9 +1286,9 @@
       <w:color w:val="404040" w:themeColor="text1" w:themeTint="BF"/>
     </w:rPr>
   </w:style>
-  <w:style w:type="character" w:styleId="737">
+  <w:style w:type="character" w:styleId="738">
     <w:name w:val="Emphasis"/>
-    <w:basedOn w:val="720"/>
+    <w:basedOn w:val="721"/>
     <w:uiPriority w:val="20"/>
     <w:qFormat/>
     <w:pPr>
@@ -1301,9 +1301,9 @@
       <w:iCs/>
     </w:rPr>
   </w:style>
-  <w:style w:type="character" w:styleId="738">
+  <w:style w:type="character" w:styleId="739">
     <w:name w:val="Strong"/>
-    <w:basedOn w:val="720"/>
+    <w:basedOn w:val="721"/>
     <w:uiPriority w:val="22"/>
     <w:qFormat/>
     <w:pPr>
@@ -1316,9 +1316,9 @@
       <w:bCs/>
     </w:rPr>
   </w:style>
-  <w:style w:type="character" w:styleId="739">
+  <w:style w:type="character" w:styleId="740">
     <w:name w:val="Subtle Reference"/>
-    <w:basedOn w:val="720"/>
+    <w:basedOn w:val="721"/>
     <w:uiPriority w:val="31"/>
     <w:qFormat/>
     <w:pPr>
@@ -1331,9 +1331,9 @@
       <w:color w:val="5a5a5a" w:themeColor="text1" w:themeTint="A5"/>
     </w:rPr>
   </w:style>
-  <w:style w:type="character" w:styleId="740">
+  <w:style w:type="character" w:styleId="741">
     <w:name w:val="Book Title"/>
-    <w:basedOn w:val="720"/>
+    <w:basedOn w:val="721"/>
     <w:uiPriority w:val="33"/>
     <w:qFormat/>
     <w:pPr>
@@ -1349,21 +1349,9 @@
       <w:spacing w:val="5"/>
     </w:rPr>
   </w:style>
-  <w:style w:type="character" w:styleId="741">
+  <w:style w:type="character" w:styleId="742">
     <w:name w:val="Header Char"/>
-    <w:basedOn w:val="720"/>
-    <w:link w:val="763"/>
-    <w:uiPriority w:val="99"/>
-    <w:qFormat/>
-    <w:pPr>
-      <w:pBdr/>
-      <w:spacing/>
-      <w:ind/>
-    </w:pPr>
-  </w:style>
-  <w:style w:type="character" w:styleId="742">
-    <w:name w:val="Footer Char"/>
-    <w:basedOn w:val="720"/>
+    <w:basedOn w:val="721"/>
     <w:link w:val="764"/>
     <w:uiPriority w:val="99"/>
     <w:qFormat/>
@@ -1374,52 +1362,20 @@
     </w:pPr>
   </w:style>
   <w:style w:type="character" w:styleId="743">
-    <w:name w:val="Footnote Text Char"/>
-    <w:basedOn w:val="720"/>
+    <w:name w:val="Footer Char"/>
+    <w:basedOn w:val="721"/>
     <w:link w:val="765"/>
     <w:uiPriority w:val="99"/>
-    <w:semiHidden/>
     <w:qFormat/>
     <w:pPr>
       <w:pBdr/>
       <w:spacing/>
       <w:ind/>
     </w:pPr>
-    <w:rPr>
-      <w:sz w:val="20"/>
-      <w:szCs w:val="20"/>
-    </w:rPr>
   </w:style>
   <w:style w:type="character" w:styleId="744">
-    <w:name w:val="Footnote Characters"/>
-    <w:basedOn w:val="720"/>
-    <w:uiPriority w:val="99"/>
-    <w:semiHidden/>
-    <w:unhideWhenUsed/>
-    <w:qFormat/>
-    <w:pPr>
-      <w:pBdr/>
-      <w:spacing/>
-      <w:ind/>
-    </w:pPr>
-    <w:rPr>
-      <w:vertAlign w:val="superscript"/>
-    </w:rPr>
-  </w:style>
-  <w:style w:type="character" w:styleId="745">
-    <w:name w:val="footnote reference"/>
-    <w:pPr>
-      <w:pBdr/>
-      <w:spacing/>
-      <w:ind/>
-    </w:pPr>
-    <w:rPr>
-      <w:vertAlign w:val="superscript"/>
-    </w:rPr>
-  </w:style>
-  <w:style w:type="character" w:styleId="746">
-    <w:name w:val="Endnote Text Char"/>
-    <w:basedOn w:val="720"/>
+    <w:name w:val="Footnote Text Char"/>
+    <w:basedOn w:val="721"/>
     <w:link w:val="766"/>
     <w:uiPriority w:val="99"/>
     <w:semiHidden/>
@@ -1434,9 +1390,9 @@
       <w:szCs w:val="20"/>
     </w:rPr>
   </w:style>
-  <w:style w:type="character" w:styleId="747">
-    <w:name w:val="Endnote Characters"/>
-    <w:basedOn w:val="720"/>
+  <w:style w:type="character" w:styleId="745">
+    <w:name w:val="Footnote Characters"/>
+    <w:basedOn w:val="721"/>
     <w:uiPriority w:val="99"/>
     <w:semiHidden/>
     <w:unhideWhenUsed/>
@@ -1450,7 +1406,51 @@
       <w:vertAlign w:val="superscript"/>
     </w:rPr>
   </w:style>
+  <w:style w:type="character" w:styleId="746">
+    <w:name w:val="footnote reference"/>
+    <w:pPr>
+      <w:pBdr/>
+      <w:spacing/>
+      <w:ind/>
+    </w:pPr>
+    <w:rPr>
+      <w:vertAlign w:val="superscript"/>
+    </w:rPr>
+  </w:style>
+  <w:style w:type="character" w:styleId="747">
+    <w:name w:val="Endnote Text Char"/>
+    <w:basedOn w:val="721"/>
+    <w:link w:val="767"/>
+    <w:uiPriority w:val="99"/>
+    <w:semiHidden/>
+    <w:qFormat/>
+    <w:pPr>
+      <w:pBdr/>
+      <w:spacing/>
+      <w:ind/>
+    </w:pPr>
+    <w:rPr>
+      <w:sz w:val="20"/>
+      <w:szCs w:val="20"/>
+    </w:rPr>
+  </w:style>
   <w:style w:type="character" w:styleId="748">
+    <w:name w:val="Endnote Characters"/>
+    <w:basedOn w:val="721"/>
+    <w:uiPriority w:val="99"/>
+    <w:semiHidden/>
+    <w:unhideWhenUsed/>
+    <w:qFormat/>
+    <w:pPr>
+      <w:pBdr/>
+      <w:spacing/>
+      <w:ind/>
+    </w:pPr>
+    <w:rPr>
+      <w:vertAlign w:val="superscript"/>
+    </w:rPr>
+  </w:style>
+  <w:style w:type="character" w:styleId="749">
     <w:name w:val="endnote reference"/>
     <w:pPr>
       <w:pBdr/>
@@ -1461,7 +1461,7 @@
       <w:vertAlign w:val="superscript"/>
     </w:rPr>
   </w:style>
-  <w:style w:type="character" w:styleId="749">
+  <w:style w:type="character" w:styleId="750">
     <w:name w:val="Hyperlink"/>
     <w:pPr>
       <w:pBdr/>
@@ -1473,7 +1473,7 @@
       <w:u w:val="single"/>
     </w:rPr>
   </w:style>
-  <w:style w:type="character" w:styleId="750">
+  <w:style w:type="character" w:styleId="751">
     <w:name w:val="FollowedHyperlink"/>
     <w:pPr>
       <w:pBdr/>
@@ -1485,10 +1485,10 @@
       <w:u w:val="single"/>
     </w:rPr>
   </w:style>
-  <w:style w:type="paragraph" w:styleId="751">
+  <w:style w:type="paragraph" w:styleId="752">
     <w:name w:val="Heading"/>
-    <w:basedOn w:val="710"/>
-    <w:next w:val="752"/>
+    <w:basedOn w:val="711"/>
+    <w:next w:val="753"/>
     <w:qFormat/>
     <w:pPr>
       <w:keepNext w:val="true"/>
@@ -1502,18 +1502,18 @@
       <w:szCs w:val="28"/>
     </w:rPr>
   </w:style>
-  <w:style w:type="paragraph" w:styleId="752">
+  <w:style w:type="paragraph" w:styleId="753">
     <w:name w:val="Body Text"/>
-    <w:basedOn w:val="710"/>
+    <w:basedOn w:val="711"/>
     <w:pPr>
       <w:pBdr/>
       <w:spacing w:after="140" w:before="0" w:line="276" w:lineRule="auto"/>
       <w:ind/>
     </w:pPr>
   </w:style>
-  <w:style w:type="paragraph" w:styleId="753">
+  <w:style w:type="paragraph" w:styleId="754">
     <w:name w:val="List"/>
-    <w:basedOn w:val="752"/>
+    <w:basedOn w:val="753"/>
     <w:pPr>
       <w:pBdr/>
       <w:spacing/>
@@ -1523,9 +1523,9 @@
       <w:rFonts w:cs="Lohit Devanagari"/>
     </w:rPr>
   </w:style>
-  <w:style w:type="paragraph" w:styleId="754">
+  <w:style w:type="paragraph" w:styleId="755">
     <w:name w:val="Caption"/>
-    <w:basedOn w:val="710"/>
+    <w:basedOn w:val="711"/>
     <w:qFormat/>
     <w:pPr>
       <w:suppressLineNumbers w:val="true"/>
@@ -1541,9 +1541,9 @@
       <w:szCs w:val="24"/>
     </w:rPr>
   </w:style>
-  <w:style w:type="paragraph" w:styleId="755">
+  <w:style w:type="paragraph" w:styleId="756">
     <w:name w:val="Index"/>
-    <w:basedOn w:val="710"/>
+    <w:basedOn w:val="711"/>
     <w:qFormat/>
     <w:pPr>
       <w:suppressLineNumbers w:val="true"/>
@@ -1555,11 +1555,11 @@
       <w:rFonts w:cs="Lohit Devanagari"/>
     </w:rPr>
   </w:style>
-  <w:style w:type="paragraph" w:styleId="756">
+  <w:style w:type="paragraph" w:styleId="757">
     <w:name w:val="Title"/>
-    <w:basedOn w:val="710"/>
-    <w:next w:val="710"/>
-    <w:link w:val="730"/>
+    <w:basedOn w:val="711"/>
+    <w:next w:val="711"/>
+    <w:link w:val="731"/>
     <w:uiPriority w:val="10"/>
     <w:qFormat/>
     <w:pPr>
@@ -1575,11 +1575,11 @@
       <w:szCs w:val="56"/>
     </w:rPr>
   </w:style>
-  <w:style w:type="paragraph" w:styleId="757">
+  <w:style w:type="paragraph" w:styleId="758">
     <w:name w:val="Subtitle"/>
-    <w:basedOn w:val="710"/>
-    <w:next w:val="710"/>
-    <w:link w:val="731"/>
+    <w:basedOn w:val="711"/>
+    <w:next w:val="711"/>
+    <w:link w:val="732"/>
     <w:uiPriority w:val="11"/>
     <w:qFormat/>
     <w:pPr>
@@ -1594,11 +1594,11 @@
       <w:szCs w:val="28"/>
     </w:rPr>
   </w:style>
-  <w:style w:type="paragraph" w:styleId="758">
+  <w:style w:type="paragraph" w:styleId="759">
     <w:name w:val="Quote"/>
-    <w:basedOn w:val="710"/>
-    <w:next w:val="710"/>
-    <w:link w:val="732"/>
+    <w:basedOn w:val="711"/>
+    <w:next w:val="711"/>
+    <w:link w:val="733"/>
     <w:uiPriority w:val="29"/>
     <w:qFormat/>
     <w:pPr>
@@ -1613,9 +1613,9 @@
       <w:color w:val="404040" w:themeColor="text1" w:themeTint="BF"/>
     </w:rPr>
   </w:style>
-  <w:style w:type="paragraph" w:styleId="759">
+  <w:style w:type="paragraph" w:styleId="760">
     <w:name w:val="List Paragraph"/>
-    <w:basedOn w:val="710"/>
+    <w:basedOn w:val="711"/>
     <w:uiPriority w:val="34"/>
     <w:qFormat/>
     <w:pPr>
@@ -1625,11 +1625,11 @@
       <w:contextualSpacing w:val="true"/>
     </w:pPr>
   </w:style>
-  <w:style w:type="paragraph" w:styleId="760">
+  <w:style w:type="paragraph" w:styleId="761">
     <w:name w:val="Intense Quote"/>
-    <w:basedOn w:val="710"/>
-    <w:next w:val="710"/>
-    <w:link w:val="734"/>
+    <w:basedOn w:val="711"/>
+    <w:next w:val="711"/>
+    <w:link w:val="735"/>
     <w:uiPriority w:val="30"/>
     <w:qFormat/>
     <w:pPr>
@@ -1647,9 +1647,9 @@
       <w:color w:val="0f4761" w:themeColor="accent1" w:themeShade="BF"/>
     </w:rPr>
   </w:style>
-  <w:style w:type="paragraph" w:styleId="761">
+  <w:style w:type="paragraph" w:styleId="762">
     <w:name w:val="No Spacing"/>
-    <w:basedOn w:val="710"/>
+    <w:basedOn w:val="711"/>
     <w:uiPriority w:val="1"/>
     <w:qFormat/>
     <w:pPr>
@@ -1658,9 +1658,9 @@
       <w:ind/>
     </w:pPr>
   </w:style>
-  <w:style w:type="paragraph" w:styleId="762">
+  <w:style w:type="paragraph" w:styleId="763">
     <w:name w:val="Header and Footer"/>
-    <w:basedOn w:val="710"/>
+    <w:basedOn w:val="711"/>
     <w:qFormat/>
     <w:pPr>
       <w:pBdr/>
@@ -1668,26 +1668,9 @@
       <w:ind/>
     </w:pPr>
   </w:style>
-  <w:style w:type="paragraph" w:styleId="763">
+  <w:style w:type="paragraph" w:styleId="764">
     <w:name w:val="Header"/>
-    <w:basedOn w:val="710"/>
-    <w:link w:val="741"/>
-    <w:uiPriority w:val="99"/>
-    <w:unhideWhenUsed/>
-    <w:pPr>
-      <w:pBdr/>
-      <w:tabs>
-        <w:tab w:val="clear" w:leader="none" w:pos="709"/>
-        <w:tab w:val="center" w:leader="none" w:pos="4844"/>
-        <w:tab w:val="right" w:leader="none" w:pos="9689"/>
-      </w:tabs>
-      <w:spacing w:after="0" w:before="0" w:line="240" w:lineRule="auto"/>
-      <w:ind/>
-    </w:pPr>
-  </w:style>
-  <w:style w:type="paragraph" w:styleId="764">
-    <w:name w:val="Footer"/>
-    <w:basedOn w:val="710"/>
+    <w:basedOn w:val="711"/>
     <w:link w:val="742"/>
     <w:uiPriority w:val="99"/>
     <w:unhideWhenUsed/>
@@ -1703,26 +1686,26 @@
     </w:pPr>
   </w:style>
   <w:style w:type="paragraph" w:styleId="765">
-    <w:name w:val="footnote text"/>
-    <w:basedOn w:val="710"/>
+    <w:name w:val="Footer"/>
+    <w:basedOn w:val="711"/>
     <w:link w:val="743"/>
     <w:uiPriority w:val="99"/>
-    <w:semiHidden/>
     <w:unhideWhenUsed/>
     <w:pPr>
       <w:pBdr/>
+      <w:tabs>
+        <w:tab w:val="clear" w:leader="none" w:pos="709"/>
+        <w:tab w:val="center" w:leader="none" w:pos="4844"/>
+        <w:tab w:val="right" w:leader="none" w:pos="9689"/>
+      </w:tabs>
       <w:spacing w:after="0" w:before="0" w:line="240" w:lineRule="auto"/>
       <w:ind/>
     </w:pPr>
-    <w:rPr>
-      <w:sz w:val="20"/>
-      <w:szCs w:val="20"/>
-    </w:rPr>
   </w:style>
   <w:style w:type="paragraph" w:styleId="766">
-    <w:name w:val="endnote text"/>
-    <w:basedOn w:val="710"/>
-    <w:link w:val="746"/>
+    <w:name w:val="footnote text"/>
+    <w:basedOn w:val="711"/>
+    <w:link w:val="744"/>
     <w:uiPriority w:val="99"/>
     <w:semiHidden/>
     <w:unhideWhenUsed/>
@@ -1737,15 +1720,32 @@
     </w:rPr>
   </w:style>
   <w:style w:type="paragraph" w:styleId="767">
+    <w:name w:val="endnote text"/>
+    <w:basedOn w:val="711"/>
+    <w:link w:val="747"/>
+    <w:uiPriority w:val="99"/>
+    <w:semiHidden/>
+    <w:unhideWhenUsed/>
+    <w:pPr>
+      <w:pBdr/>
+      <w:spacing w:after="0" w:before="0" w:line="240" w:lineRule="auto"/>
+      <w:ind/>
+    </w:pPr>
+    <w:rPr>
+      <w:sz w:val="20"/>
+      <w:szCs w:val="20"/>
+    </w:rPr>
+  </w:style>
+  <w:style w:type="paragraph" w:styleId="768">
     <w:name w:val="Index Heading"/>
-    <w:basedOn w:val="751"/>
+    <w:basedOn w:val="752"/>
     <w:pPr>
       <w:pBdr/>
       <w:spacing/>
       <w:ind/>
     </w:pPr>
   </w:style>
-  <w:style w:type="paragraph" w:styleId="768">
+  <w:style w:type="paragraph" w:styleId="769">
     <w:name w:val="TOC Heading"/>
     <w:uiPriority w:val="39"/>
     <w:unhideWhenUsed/>
@@ -1766,10 +1766,10 @@
       <w:lang w:val="en-US" w:eastAsia="zh-CN" w:bidi="hi-IN"/>
     </w:rPr>
   </w:style>
-  <w:style w:type="paragraph" w:styleId="769">
+  <w:style w:type="paragraph" w:styleId="770">
     <w:name w:val="table of figures"/>
-    <w:basedOn w:val="710"/>
-    <w:next w:val="710"/>
+    <w:basedOn w:val="711"/>
+    <w:next w:val="711"/>
     <w:uiPriority w:val="99"/>
     <w:unhideWhenUsed/>
     <w:pPr>
@@ -1778,7 +1778,7 @@
       <w:ind/>
     </w:pPr>
   </w:style>
-  <w:style w:type="numbering" w:styleId="770" w:default="1">
+  <w:style w:type="numbering" w:styleId="771" w:default="1">
     <w:name w:val="No List"/>
     <w:uiPriority w:val="99"/>
     <w:semiHidden/>
@@ -1790,7 +1790,7 @@
       <w:ind/>
     </w:pPr>
   </w:style>
-  <w:style w:type="table" w:styleId="771" w:default="1">
+  <w:style w:type="table" w:styleId="772" w:default="1">
     <w:name w:val="Normal Table"/>
     <w:uiPriority w:val="99"/>
     <w:semiHidden/>
@@ -1982,9 +1982,9 @@
       </w:tcPr>
     </w:tblStylePr>
   </w:style>
-  <w:style w:type="table" w:styleId="772">
+  <w:style w:type="table" w:styleId="773">
     <w:name w:val="Table Grid"/>
-    <w:basedOn w:val="771"/>
+    <w:basedOn w:val="772"/>
     <w:uiPriority w:val="59"/>
     <w:pPr>
       <w:pBdr/>
@@ -2180,9 +2180,9 @@
       </w:tcPr>
     </w:tblStylePr>
   </w:style>
-  <w:style w:type="table" w:styleId="773">
+  <w:style w:type="table" w:styleId="774">
     <w:name w:val="Table Grid Light"/>
-    <w:basedOn w:val="771"/>
+    <w:basedOn w:val="772"/>
     <w:uiPriority w:val="59"/>
     <w:pPr>
       <w:pBdr/>
@@ -2378,9 +2378,9 @@
       </w:tcPr>
     </w:tblStylePr>
   </w:style>
-  <w:style w:type="table" w:styleId="774">
+  <w:style w:type="table" w:styleId="775">
     <w:name w:val="Plain Table 1"/>
-    <w:basedOn w:val="771"/>
+    <w:basedOn w:val="772"/>
     <w:uiPriority w:val="59"/>
     <w:pPr>
       <w:pBdr/>
@@ -2594,9 +2594,9 @@
       </w:tcPr>
     </w:tblStylePr>
   </w:style>
-  <w:style w:type="table" w:styleId="775">
+  <w:style w:type="table" w:styleId="776">
     <w:name w:val="Plain Table 2"/>
-    <w:basedOn w:val="771"/>
+    <w:basedOn w:val="772"/>
     <w:uiPriority w:val="59"/>
     <w:pPr>
       <w:pBdr/>
@@ -2818,9 +2818,9 @@
       </w:tcPr>
     </w:tblStylePr>
   </w:style>
-  <w:style w:type="table" w:styleId="776">
+  <w:style w:type="table" w:styleId="777">
     <w:name w:val="Plain Table 3"/>
-    <w:basedOn w:val="771"/>
+    <w:basedOn w:val="772"/>
     <w:uiPriority w:val="99"/>
     <w:pPr>
       <w:pBdr/>
@@ -3039,9 +3039,9 @@
       </w:tcPr>
     </w:tblStylePr>
   </w:style>
-  <w:style w:type="table" w:styleId="777">
+  <w:style w:type="table" w:styleId="778">
     <w:name w:val="Plain Table 4"/>
-    <w:basedOn w:val="771"/>
+    <w:basedOn w:val="772"/>
     <w:uiPriority w:val="99"/>
     <w:pPr>
       <w:pBdr/>
@@ -3246,9 +3246,9 @@
       </w:tcPr>
     </w:tblStylePr>
   </w:style>
-  <w:style w:type="table" w:styleId="778">
+  <w:style w:type="table" w:styleId="779">
     <w:name w:val="Plain Table 5"/>
-    <w:basedOn w:val="771"/>
+    <w:basedOn w:val="772"/>
     <w:uiPriority w:val="99"/>
     <w:pPr>
       <w:pBdr/>
@@ -3470,9 +3470,9 @@
       </w:tcPr>
     </w:tblStylePr>
   </w:style>
-  <w:style w:type="table" w:styleId="779">
+  <w:style w:type="table" w:styleId="780">
     <w:name w:val="Grid Table 1 Light"/>
-    <w:basedOn w:val="771"/>
+    <w:basedOn w:val="772"/>
     <w:uiPriority w:val="99"/>
     <w:pPr>
       <w:pBdr/>
@@ -3686,9 +3686,9 @@
       </w:tcPr>
     </w:tblStylePr>
   </w:style>
-  <w:style w:type="table" w:styleId="780">
+  <w:style w:type="table" w:styleId="781">
     <w:name w:val="Grid Table 1 Light - Accent 1"/>
-    <w:basedOn w:val="771"/>
+    <w:basedOn w:val="772"/>
     <w:uiPriority w:val="99"/>
     <w:pPr>
       <w:pBdr/>
@@ -3902,9 +3902,9 @@
       </w:tcPr>
     </w:tblStylePr>
   </w:style>
-  <w:style w:type="table" w:styleId="781">
+  <w:style w:type="table" w:styleId="782">
     <w:name w:val="Grid Table 1 Light - Accent 2"/>
-    <w:basedOn w:val="771"/>
+    <w:basedOn w:val="772"/>
     <w:uiPriority w:val="99"/>
     <w:pPr>
       <w:pBdr/>
@@ -4118,9 +4118,9 @@
       </w:tcPr>
     </w:tblStylePr>
   </w:style>
-  <w:style w:type="table" w:styleId="782">
+  <w:style w:type="table" w:styleId="783">
     <w:name w:val="Grid Table 1 Light - Accent 3"/>
-    <w:basedOn w:val="771"/>
+    <w:basedOn w:val="772"/>
     <w:uiPriority w:val="99"/>
     <w:pPr>
       <w:pBdr/>
@@ -4334,9 +4334,9 @@
       </w:tcPr>
     </w:tblStylePr>
   </w:style>
-  <w:style w:type="table" w:styleId="783">
+  <w:style w:type="table" w:styleId="784">
     <w:name w:val="Grid Table 1 Light - Accent 4"/>
-    <w:basedOn w:val="771"/>
+    <w:basedOn w:val="772"/>
     <w:uiPriority w:val="99"/>
     <w:pPr>
       <w:pBdr/>
@@ -4550,9 +4550,9 @@
       </w:tcPr>
     </w:tblStylePr>
   </w:style>
-  <w:style w:type="table" w:styleId="784">
+  <w:style w:type="table" w:styleId="785">
     <w:name w:val="Grid Table 1 Light - Accent 5"/>
-    <w:basedOn w:val="771"/>
+    <w:basedOn w:val="772"/>
     <w:uiPriority w:val="99"/>
     <w:pPr>
       <w:pBdr/>
@@ -4766,9 +4766,9 @@
       </w:tcPr>
     </w:tblStylePr>
   </w:style>
-  <w:style w:type="table" w:styleId="785">
+  <w:style w:type="table" w:styleId="786">
     <w:name w:val="Grid Table 1 Light - Accent 6"/>
-    <w:basedOn w:val="771"/>
+    <w:basedOn w:val="772"/>
     <w:uiPriority w:val="99"/>
     <w:pPr>
       <w:pBdr/>
@@ -4982,9 +4982,9 @@
       </w:tcPr>
     </w:tblStylePr>
   </w:style>
-  <w:style w:type="table" w:styleId="786">
+  <w:style w:type="table" w:styleId="787">
     <w:name w:val="Grid Table 2"/>
-    <w:basedOn w:val="771"/>
+    <w:basedOn w:val="772"/>
     <w:uiPriority w:val="99"/>
     <w:pPr>
       <w:pBdr/>
@@ -5205,9 +5205,9 @@
       </w:tcPr>
     </w:tblStylePr>
   </w:style>
-  <w:style w:type="table" w:styleId="787">
+  <w:style w:type="table" w:styleId="788">
     <w:name w:val="Grid Table 2 - Accent 1"/>
-    <w:basedOn w:val="771"/>
+    <w:basedOn w:val="772"/>
     <w:uiPriority w:val="99"/>
     <w:pPr>
       <w:pBdr/>
@@ -5428,9 +5428,9 @@
       </w:tcPr>
     </w:tblStylePr>
   </w:style>
-  <w:style w:type="table" w:styleId="788">
+  <w:style w:type="table" w:styleId="789">
     <w:name w:val="Grid Table 2 - Accent 2"/>
-    <w:basedOn w:val="771"/>
+    <w:basedOn w:val="772"/>
     <w:uiPriority w:val="99"/>
     <w:pPr>
       <w:pBdr/>
@@ -5651,9 +5651,9 @@
       </w:tcPr>
     </w:tblStylePr>
   </w:style>
-  <w:style w:type="table" w:styleId="789">
+  <w:style w:type="table" w:styleId="790">
     <w:name w:val="Grid Table 2 - Accent 3"/>
-    <w:basedOn w:val="771"/>
+    <w:basedOn w:val="772"/>
     <w:uiPriority w:val="99"/>
     <w:pPr>
       <w:pBdr/>
@@ -5874,9 +5874,9 @@
       </w:tcPr>
     </w:tblStylePr>
   </w:style>
-  <w:style w:type="table" w:styleId="790">
+  <w:style w:type="table" w:styleId="791">
     <w:name w:val="Grid Table 2 - Accent 4"/>
-    <w:basedOn w:val="771"/>
+    <w:basedOn w:val="772"/>
     <w:uiPriority w:val="99"/>
     <w:pPr>
       <w:pBdr/>
@@ -6097,9 +6097,9 @@
       </w:tcPr>
     </w:tblStylePr>
   </w:style>
-  <w:style w:type="table" w:styleId="791">
+  <w:style w:type="table" w:styleId="792">
     <w:name w:val="Grid Table 2 - Accent 5"/>
-    <w:basedOn w:val="771"/>
+    <w:basedOn w:val="772"/>
     <w:uiPriority w:val="99"/>
     <w:pPr>
       <w:pBdr/>
@@ -6320,9 +6320,9 @@
       </w:tcPr>
     </w:tblStylePr>
   </w:style>
-  <w:style w:type="table" w:styleId="792">
+  <w:style w:type="table" w:styleId="793">
     <w:name w:val="Grid Table 2 - Accent 6"/>
-    <w:basedOn w:val="771"/>
+    <w:basedOn w:val="772"/>
     <w:uiPriority w:val="99"/>
     <w:pPr>
       <w:pBdr/>
@@ -6543,9 +6543,9 @@
       </w:tcPr>
     </w:tblStylePr>
   </w:style>
-  <w:style w:type="table" w:styleId="793">
+  <w:style w:type="table" w:styleId="794">
     <w:name w:val="Grid Table 3"/>
-    <w:basedOn w:val="771"/>
+    <w:basedOn w:val="772"/>
     <w:uiPriority w:val="99"/>
     <w:pPr>
       <w:pBdr/>
@@ -6779,9 +6779,9 @@
       </w:tcPr>
     </w:tblStylePr>
   </w:style>
-  <w:style w:type="table" w:styleId="794">
+  <w:style w:type="table" w:styleId="795">
     <w:name w:val="Grid Table 3 - Accent 1"/>
-    <w:basedOn w:val="771"/>
+    <w:basedOn w:val="772"/>
     <w:uiPriority w:val="99"/>
     <w:pPr>
       <w:pBdr/>
@@ -7015,9 +7015,9 @@
       </w:tcPr>
     </w:tblStylePr>
   </w:style>
-  <w:style w:type="table" w:styleId="795">
+  <w:style w:type="table" w:styleId="796">
     <w:name w:val="Grid Table 3 - Accent 2"/>
-    <w:basedOn w:val="771"/>
+    <w:basedOn w:val="772"/>
     <w:uiPriority w:val="99"/>
     <w:pPr>
       <w:pBdr/>
@@ -7251,9 +7251,9 @@
       </w:tcPr>
     </w:tblStylePr>
   </w:style>
-  <w:style w:type="table" w:styleId="796">
+  <w:style w:type="table" w:styleId="797">
     <w:name w:val="Grid Table 3 - Accent 3"/>
-    <w:basedOn w:val="771"/>
+    <w:basedOn w:val="772"/>
     <w:uiPriority w:val="99"/>
     <w:pPr>
       <w:pBdr/>
@@ -7487,9 +7487,9 @@
       </w:tcPr>
     </w:tblStylePr>
   </w:style>
-  <w:style w:type="table" w:styleId="797">
+  <w:style w:type="table" w:styleId="798">
     <w:name w:val="Grid Table 3 - Accent 4"/>
-    <w:basedOn w:val="771"/>
+    <w:basedOn w:val="772"/>
     <w:uiPriority w:val="99"/>
     <w:pPr>
       <w:pBdr/>
@@ -7723,9 +7723,9 @@
       </w:tcPr>
     </w:tblStylePr>
   </w:style>
-  <w:style w:type="table" w:styleId="798">
+  <w:style w:type="table" w:styleId="799">
     <w:name w:val="Grid Table 3 - Accent 5"/>
-    <w:basedOn w:val="771"/>
+    <w:basedOn w:val="772"/>
     <w:uiPriority w:val="99"/>
     <w:pPr>
       <w:pBdr/>
@@ -7959,9 +7959,9 @@
       </w:tcPr>
     </w:tblStylePr>
   </w:style>
-  <w:style w:type="table" w:styleId="799">
+  <w:style w:type="table" w:styleId="800">
     <w:name w:val="Grid Table 3 - Accent 6"/>
-    <w:basedOn w:val="771"/>
+    <w:basedOn w:val="772"/>
     <w:uiPriority w:val="99"/>
     <w:pPr>
       <w:pBdr/>
@@ -8195,9 +8195,9 @@
       </w:tcPr>
     </w:tblStylePr>
   </w:style>
-  <w:style w:type="table" w:styleId="800">
+  <w:style w:type="table" w:styleId="801">
     <w:name w:val="Grid Table 4"/>
-    <w:basedOn w:val="771"/>
+    <w:basedOn w:val="772"/>
     <w:uiPriority w:val="59"/>
     <w:pPr>
       <w:pBdr/>
@@ -8418,9 +8418,9 @@
       </w:tcPr>
     </w:tblStylePr>
   </w:style>
-  <w:style w:type="table" w:styleId="801">
+  <w:style w:type="table" w:styleId="802">
     <w:name w:val="Grid Table 4 - Accent 1"/>
-    <w:basedOn w:val="771"/>
+    <w:basedOn w:val="772"/>
     <w:uiPriority w:val="59"/>
     <w:pPr>
       <w:pBdr/>
@@ -8641,9 +8641,9 @@
       </w:tcPr>
     </w:tblStylePr>
   </w:style>
-  <w:style w:type="table" w:styleId="802">
+  <w:style w:type="table" w:styleId="803">
     <w:name w:val="Grid Table 4 - Accent 2"/>
-    <w:basedOn w:val="771"/>
+    <w:basedOn w:val="772"/>
     <w:uiPriority w:val="59"/>
     <w:pPr>
       <w:pBdr/>
@@ -8864,9 +8864,9 @@
       </w:tcPr>
     </w:tblStylePr>
   </w:style>
-  <w:style w:type="table" w:styleId="803">
+  <w:style w:type="table" w:styleId="804">
     <w:name w:val="Grid Table 4 - Accent 3"/>
-    <w:basedOn w:val="771"/>
+    <w:basedOn w:val="772"/>
     <w:uiPriority w:val="59"/>
     <w:pPr>
       <w:pBdr/>
@@ -9087,9 +9087,9 @@
       </w:tcPr>
     </w:tblStylePr>
   </w:style>
-  <w:style w:type="table" w:styleId="804">
+  <w:style w:type="table" w:styleId="805">
     <w:name w:val="Grid Table 4 - Accent 4"/>
-    <w:basedOn w:val="771"/>
+    <w:basedOn w:val="772"/>
     <w:uiPriority w:val="59"/>
     <w:pPr>
       <w:pBdr/>
@@ -9310,9 +9310,9 @@
       </w:tcPr>
     </w:tblStylePr>
   </w:style>
-  <w:style w:type="table" w:styleId="805">
+  <w:style w:type="table" w:styleId="806">
     <w:name w:val="Grid Table 4 - Accent 5"/>
-    <w:basedOn w:val="771"/>
+    <w:basedOn w:val="772"/>
     <w:uiPriority w:val="59"/>
     <w:pPr>
       <w:pBdr/>
@@ -9533,9 +9533,9 @@
       </w:tcPr>
     </w:tblStylePr>
   </w:style>
-  <w:style w:type="table" w:styleId="806">
+  <w:style w:type="table" w:styleId="807">
     <w:name w:val="Grid Table 4 - Accent 6"/>
-    <w:basedOn w:val="771"/>
+    <w:basedOn w:val="772"/>
     <w:uiPriority w:val="59"/>
     <w:pPr>
       <w:pBdr/>
@@ -9756,9 +9756,9 @@
       </w:tcPr>
     </w:tblStylePr>
   </w:style>
-  <w:style w:type="table" w:styleId="807">
+  <w:style w:type="table" w:styleId="808">
     <w:name w:val="Grid Table 5 Dark"/>
-    <w:basedOn w:val="771"/>
+    <w:basedOn w:val="772"/>
     <w:uiPriority w:val="99"/>
     <w:pPr>
       <w:pBdr/>
@@ -9974,9 +9974,9 @@
       </w:tcPr>
     </w:tblStylePr>
   </w:style>
-  <w:style w:type="table" w:styleId="808">
+  <w:style w:type="table" w:styleId="809">
     <w:name w:val="Grid Table 5 Dark- Accent 1"/>
-    <w:basedOn w:val="771"/>
+    <w:basedOn w:val="772"/>
     <w:uiPriority w:val="99"/>
     <w:pPr>
       <w:pBdr/>
@@ -10192,9 +10192,9 @@
       </w:tcPr>
     </w:tblStylePr>
   </w:style>
-  <w:style w:type="table" w:styleId="809">
+  <w:style w:type="table" w:styleId="810">
     <w:name w:val="Grid Table 5 Dark - Accent 2"/>
-    <w:basedOn w:val="771"/>
+    <w:basedOn w:val="772"/>
     <w:uiPriority w:val="99"/>
     <w:pPr>
       <w:pBdr/>
@@ -10410,9 +10410,9 @@
       </w:tcPr>
     </w:tblStylePr>
   </w:style>
-  <w:style w:type="table" w:styleId="810">
+  <w:style w:type="table" w:styleId="811">
     <w:name w:val="Grid Table 5 Dark - Accent 3"/>
-    <w:basedOn w:val="771"/>
+    <w:basedOn w:val="772"/>
     <w:uiPriority w:val="99"/>
     <w:pPr>
       <w:pBdr/>
@@ -10628,9 +10628,9 @@
       </w:tcPr>
     </w:tblStylePr>
   </w:style>
-  <w:style w:type="table" w:styleId="811">
+  <w:style w:type="table" w:styleId="812">
     <w:name w:val="Grid Table 5 Dark- Accent 4"/>
-    <w:basedOn w:val="771"/>
+    <w:basedOn w:val="772"/>
     <w:uiPriority w:val="99"/>
     <w:pPr>
       <w:pBdr/>
@@ -10846,9 +10846,9 @@
       </w:tcPr>
     </w:tblStylePr>
   </w:style>
-  <w:style w:type="table" w:styleId="812">
+  <w:style w:type="table" w:styleId="813">
     <w:name w:val="Grid Table 5 Dark - Accent 5"/>
-    <w:basedOn w:val="771"/>
+    <w:basedOn w:val="772"/>
     <w:uiPriority w:val="99"/>
     <w:pPr>
       <w:pBdr/>
@@ -11064,9 +11064,9 @@
       </w:tcPr>
     </w:tblStylePr>
   </w:style>
-  <w:style w:type="table" w:styleId="813">
+  <w:style w:type="table" w:styleId="814">
     <w:name w:val="Grid Table 5 Dark - Accent 6"/>
-    <w:basedOn w:val="771"/>
+    <w:basedOn w:val="772"/>
     <w:uiPriority w:val="99"/>
     <w:pPr>
       <w:pBdr/>
@@ -11282,9 +11282,9 @@
       </w:tcPr>
     </w:tblStylePr>
   </w:style>
-  <w:style w:type="table" w:styleId="814">
+  <w:style w:type="table" w:styleId="815">
     <w:name w:val="Grid Table 6 Colorful"/>
-    <w:basedOn w:val="771"/>
+    <w:basedOn w:val="772"/>
     <w:uiPriority w:val="99"/>
     <w:pPr>
       <w:pBdr/>
@@ -11508,9 +11508,9 @@
       </w:tcPr>
     </w:tblStylePr>
   </w:style>
-  <w:style w:type="table" w:styleId="815">
+  <w:style w:type="table" w:styleId="816">
     <w:name w:val="Grid Table 6 Colorful - Accent 1"/>
-    <w:basedOn w:val="771"/>
+    <w:basedOn w:val="772"/>
     <w:uiPriority w:val="99"/>
     <w:pPr>
       <w:pBdr/>
@@ -11734,9 +11734,9 @@
       </w:tcPr>
     </w:tblStylePr>
   </w:style>
-  <w:style w:type="table" w:styleId="816">
+  <w:style w:type="table" w:styleId="817">
     <w:name w:val="Grid Table 6 Colorful - Accent 2"/>
-    <w:basedOn w:val="771"/>
+    <w:basedOn w:val="772"/>
     <w:uiPriority w:val="99"/>
     <w:pPr>
       <w:pBdr/>
@@ -11960,9 +11960,9 @@
       </w:tcPr>
     </w:tblStylePr>
   </w:style>
-  <w:style w:type="table" w:styleId="817">
+  <w:style w:type="table" w:styleId="818">
     <w:name w:val="Grid Table 6 Colorful - Accent 3"/>
-    <w:basedOn w:val="771"/>
+    <w:basedOn w:val="772"/>
     <w:uiPriority w:val="99"/>
     <w:pPr>
       <w:pBdr/>
@@ -12186,9 +12186,9 @@
       </w:tcPr>
     </w:tblStylePr>
   </w:style>
-  <w:style w:type="table" w:styleId="818">
+  <w:style w:type="table" w:styleId="819">
     <w:name w:val="Grid Table 6 Colorful - Accent 4"/>
-    <w:basedOn w:val="771"/>
+    <w:basedOn w:val="772"/>
     <w:uiPriority w:val="99"/>
     <w:pPr>
       <w:pBdr/>
@@ -12412,9 +12412,9 @@
       </w:tcPr>
     </w:tblStylePr>
   </w:style>
-  <w:style w:type="table" w:styleId="819">
+  <w:style w:type="table" w:styleId="820">
     <w:name w:val="Grid Table 6 Colorful - Accent 5"/>
-    <w:basedOn w:val="771"/>
+    <w:basedOn w:val="772"/>
     <w:uiPriority w:val="99"/>
     <w:pPr>
       <w:pBdr/>
@@ -12638,9 +12638,9 @@
       </w:tcPr>
     </w:tblStylePr>
   </w:style>
-  <w:style w:type="table" w:styleId="820">
+  <w:style w:type="table" w:styleId="821">
     <w:name w:val="Grid Table 6 Colorful - Accent 6"/>
-    <w:basedOn w:val="771"/>
+    <w:basedOn w:val="772"/>
     <w:uiPriority w:val="99"/>
     <w:pPr>
       <w:pBdr/>
@@ -12864,9 +12864,9 @@
       </w:tcPr>
     </w:tblStylePr>
   </w:style>
-  <w:style w:type="table" w:styleId="821">
+  <w:style w:type="table" w:styleId="822">
     <w:name w:val="Grid Table 7 Colorful"/>
-    <w:basedOn w:val="771"/>
+    <w:basedOn w:val="772"/>
     <w:uiPriority w:val="99"/>
     <w:pPr>
       <w:pBdr/>
@@ -13111,9 +13111,9 @@
       </w:tcPr>
     </w:tblStylePr>
   </w:style>
-  <w:style w:type="table" w:styleId="822">
+  <w:style w:type="table" w:styleId="823">
     <w:name w:val="Grid Table 7 Colorful - Accent 1"/>
-    <w:basedOn w:val="771"/>
+    <w:basedOn w:val="772"/>
     <w:uiPriority w:val="99"/>
     <w:pPr>
       <w:pBdr/>
@@ -13358,9 +13358,9 @@
       </w:tcPr>
     </w:tblStylePr>
   </w:style>
-  <w:style w:type="table" w:styleId="823">
+  <w:style w:type="table" w:styleId="824">
     <w:name w:val="Grid Table 7 Colorful - Accent 2"/>
-    <w:basedOn w:val="771"/>
+    <w:basedOn w:val="772"/>
     <w:uiPriority w:val="99"/>
     <w:pPr>
       <w:pBdr/>
@@ -13605,9 +13605,9 @@
       </w:tcPr>
     </w:tblStylePr>
   </w:style>
-  <w:style w:type="table" w:styleId="824">
+  <w:style w:type="table" w:styleId="825">
     <w:name w:val="Grid Table 7 Colorful - Accent 3"/>
-    <w:basedOn w:val="771"/>
+    <w:basedOn w:val="772"/>
     <w:uiPriority w:val="99"/>
     <w:pPr>
       <w:pBdr/>
@@ -13852,9 +13852,9 @@
       </w:tcPr>
     </w:tblStylePr>
   </w:style>
-  <w:style w:type="table" w:styleId="825">
+  <w:style w:type="table" w:styleId="826">
     <w:name w:val="Grid Table 7 Colorful - Accent 4"/>
-    <w:basedOn w:val="771"/>
+    <w:basedOn w:val="772"/>
     <w:uiPriority w:val="99"/>
     <w:pPr>
       <w:pBdr/>
@@ -14099,9 +14099,9 @@
       </w:tcPr>
     </w:tblStylePr>
   </w:style>
-  <w:style w:type="table" w:styleId="826">
+  <w:style w:type="table" w:styleId="827">
     <w:name w:val="Grid Table 7 Colorful - Accent 5"/>
-    <w:basedOn w:val="771"/>
+    <w:basedOn w:val="772"/>
     <w:uiPriority w:val="99"/>
     <w:pPr>
       <w:pBdr/>
@@ -14346,9 +14346,9 @@
       </w:tcPr>
     </w:tblStylePr>
   </w:style>
-  <w:style w:type="table" w:styleId="827">
+  <w:style w:type="table" w:styleId="828">
     <w:name w:val="Grid Table 7 Colorful - Accent 6"/>
-    <w:basedOn w:val="771"/>
+    <w:basedOn w:val="772"/>
     <w:uiPriority w:val="99"/>
     <w:pPr>
       <w:pBdr/>
@@ -14593,9 +14593,9 @@
       </w:tcPr>
     </w:tblStylePr>
   </w:style>
-  <w:style w:type="table" w:styleId="828">
+  <w:style w:type="table" w:styleId="829">
     <w:name w:val="List Table 1 Light"/>
-    <w:basedOn w:val="771"/>
+    <w:basedOn w:val="772"/>
     <w:uiPriority w:val="99"/>
     <w:pPr>
       <w:pBdr/>
@@ -14804,9 +14804,9 @@
       </w:tcPr>
     </w:tblStylePr>
   </w:style>
-  <w:style w:type="table" w:styleId="829">
+  <w:style w:type="table" w:styleId="830">
     <w:name w:val="List Table 1 Light - Accent 1"/>
-    <w:basedOn w:val="771"/>
+    <w:basedOn w:val="772"/>
     <w:uiPriority w:val="99"/>
     <w:pPr>
       <w:pBdr/>
@@ -15015,9 +15015,9 @@
       </w:tcPr>
     </w:tblStylePr>
   </w:style>
-  <w:style w:type="table" w:styleId="830">
+  <w:style w:type="table" w:styleId="831">
     <w:name w:val="List Table 1 Light - Accent 2"/>
-    <w:basedOn w:val="771"/>
+    <w:basedOn w:val="772"/>
     <w:uiPriority w:val="99"/>
     <w:pPr>
       <w:pBdr/>
@@ -15226,9 +15226,9 @@
       </w:tcPr>
     </w:tblStylePr>
   </w:style>
-  <w:style w:type="table" w:styleId="831">
+  <w:style w:type="table" w:styleId="832">
     <w:name w:val="List Table 1 Light - Accent 3"/>
-    <w:basedOn w:val="771"/>
+    <w:basedOn w:val="772"/>
     <w:uiPriority w:val="99"/>
     <w:pPr>
       <w:pBdr/>
@@ -15437,9 +15437,9 @@
       </w:tcPr>
     </w:tblStylePr>
   </w:style>
-  <w:style w:type="table" w:styleId="832">
+  <w:style w:type="table" w:styleId="833">
     <w:name w:val="List Table 1 Light - Accent 4"/>
-    <w:basedOn w:val="771"/>
+    <w:basedOn w:val="772"/>
     <w:uiPriority w:val="99"/>
     <w:pPr>
       <w:pBdr/>
@@ -15648,9 +15648,9 @@
       </w:tcPr>
     </w:tblStylePr>
   </w:style>
-  <w:style w:type="table" w:styleId="833">
+  <w:style w:type="table" w:styleId="834">
     <w:name w:val="List Table 1 Light - Accent 5"/>
-    <w:basedOn w:val="771"/>
+    <w:basedOn w:val="772"/>
     <w:uiPriority w:val="99"/>
     <w:pPr>
       <w:pBdr/>
@@ -15859,9 +15859,9 @@
       </w:tcPr>
     </w:tblStylePr>
   </w:style>
-  <w:style w:type="table" w:styleId="834">
+  <w:style w:type="table" w:styleId="835">
     <w:name w:val="List Table 1 Light - Accent 6"/>
-    <w:basedOn w:val="771"/>
+    <w:basedOn w:val="772"/>
     <w:uiPriority w:val="99"/>
     <w:pPr>
       <w:pBdr/>
@@ -16070,9 +16070,9 @@
       </w:tcPr>
     </w:tblStylePr>
   </w:style>
-  <w:style w:type="table" w:styleId="835">
+  <w:style w:type="table" w:styleId="836">
     <w:name w:val="List Table 2"/>
-    <w:basedOn w:val="771"/>
+    <w:basedOn w:val="772"/>
     <w:uiPriority w:val="99"/>
     <w:pPr>
       <w:pBdr/>
@@ -16295,9 +16295,9 @@
       </w:tcPr>
     </w:tblStylePr>
   </w:style>
-  <w:style w:type="table" w:styleId="836">
+  <w:style w:type="table" w:styleId="837">
     <w:name w:val="List Table 2 - Accent 1"/>
-    <w:basedOn w:val="771"/>
+    <w:basedOn w:val="772"/>
     <w:uiPriority w:val="99"/>
     <w:pPr>
       <w:pBdr/>
@@ -16520,9 +16520,9 @@
       </w:tcPr>
     </w:tblStylePr>
   </w:style>
-  <w:style w:type="table" w:styleId="837">
+  <w:style w:type="table" w:styleId="838">
     <w:name w:val="List Table 2 - Accent 2"/>
-    <w:basedOn w:val="771"/>
+    <w:basedOn w:val="772"/>
     <w:uiPriority w:val="99"/>
     <w:pPr>
       <w:pBdr/>
@@ -16745,9 +16745,9 @@
       </w:tcPr>
     </w:tblStylePr>
   </w:style>
-  <w:style w:type="table" w:styleId="838">
+  <w:style w:type="table" w:styleId="839">
     <w:name w:val="List Table 2 - Accent 3"/>
-    <w:basedOn w:val="771"/>
+    <w:basedOn w:val="772"/>
     <w:uiPriority w:val="99"/>
     <w:pPr>
       <w:pBdr/>
@@ -16970,9 +16970,9 @@
       </w:tcPr>
     </w:tblStylePr>
   </w:style>
-  <w:style w:type="table" w:styleId="839">
+  <w:style w:type="table" w:styleId="840">
     <w:name w:val="List Table 2 - Accent 4"/>
-    <w:basedOn w:val="771"/>
+    <w:basedOn w:val="772"/>
     <w:uiPriority w:val="99"/>
     <w:pPr>
       <w:pBdr/>
@@ -17195,9 +17195,9 @@
       </w:tcPr>
     </w:tblStylePr>
   </w:style>
-  <w:style w:type="table" w:styleId="840">
+  <w:style w:type="table" w:styleId="841">
     <w:name w:val="List Table 2 - Accent 5"/>
-    <w:basedOn w:val="771"/>
+    <w:basedOn w:val="772"/>
     <w:uiPriority w:val="99"/>
     <w:pPr>
       <w:pBdr/>
@@ -17420,9 +17420,9 @@
       </w:tcPr>
     </w:tblStylePr>
   </w:style>
-  <w:style w:type="table" w:styleId="841">
+  <w:style w:type="table" w:styleId="842">
     <w:name w:val="List Table 2 - Accent 6"/>
-    <w:basedOn w:val="771"/>
+    <w:basedOn w:val="772"/>
     <w:uiPriority w:val="99"/>
     <w:pPr>
       <w:pBdr/>
@@ -17645,9 +17645,9 @@
       </w:tcPr>
     </w:tblStylePr>
   </w:style>
-  <w:style w:type="table" w:styleId="842">
+  <w:style w:type="table" w:styleId="843">
     <w:name w:val="List Table 3"/>
-    <w:basedOn w:val="771"/>
+    <w:basedOn w:val="772"/>
     <w:uiPriority w:val="99"/>
     <w:pPr>
       <w:pBdr/>
@@ -17863,9 +17863,9 @@
       </w:tcPr>
     </w:tblStylePr>
   </w:style>
-  <w:style w:type="table" w:styleId="843">
+  <w:style w:type="table" w:styleId="844">
     <w:name w:val="List Table 3 - Accent 1"/>
-    <w:basedOn w:val="771"/>
+    <w:basedOn w:val="772"/>
     <w:uiPriority w:val="99"/>
     <w:pPr>
       <w:pBdr/>
@@ -18081,9 +18081,9 @@
       </w:tcPr>
     </w:tblStylePr>
   </w:style>
-  <w:style w:type="table" w:styleId="844">
+  <w:style w:type="table" w:styleId="845">
     <w:name w:val="List Table 3 - Accent 2"/>
-    <w:basedOn w:val="771"/>
+    <w:basedOn w:val="772"/>
     <w:uiPriority w:val="99"/>
     <w:pPr>
       <w:pBdr/>
@@ -18299,9 +18299,9 @@
       </w:tcPr>
     </w:tblStylePr>
   </w:style>
-  <w:style w:type="table" w:styleId="845">
+  <w:style w:type="table" w:styleId="846">
     <w:name w:val="List Table 3 - Accent 3"/>
-    <w:basedOn w:val="771"/>
+    <w:basedOn w:val="772"/>
     <w:uiPriority w:val="99"/>
     <w:pPr>
       <w:pBdr/>
@@ -18517,9 +18517,9 @@
       </w:tcPr>
     </w:tblStylePr>
   </w:style>
-  <w:style w:type="table" w:styleId="846">
+  <w:style w:type="table" w:styleId="847">
     <w:name w:val="List Table 3 - Accent 4"/>
-    <w:basedOn w:val="771"/>
+    <w:basedOn w:val="772"/>
     <w:uiPriority w:val="99"/>
     <w:pPr>
       <w:pBdr/>
@@ -18735,9 +18735,9 @@
       </w:tcPr>
     </w:tblStylePr>
   </w:style>
-  <w:style w:type="table" w:styleId="847">
+  <w:style w:type="table" w:styleId="848">
     <w:name w:val="List Table 3 - Accent 5"/>
-    <w:basedOn w:val="771"/>
+    <w:basedOn w:val="772"/>
     <w:uiPriority w:val="99"/>
     <w:pPr>
       <w:pBdr/>
@@ -18953,9 +18953,9 @@
       </w:tcPr>
     </w:tblStylePr>
   </w:style>
-  <w:style w:type="table" w:styleId="848">
+  <w:style w:type="table" w:styleId="849">
     <w:name w:val="List Table 3 - Accent 6"/>
-    <w:basedOn w:val="771"/>
+    <w:basedOn w:val="772"/>
     <w:uiPriority w:val="99"/>
     <w:pPr>
       <w:pBdr/>
@@ -19171,9 +19171,9 @@
       </w:tcPr>
     </w:tblStylePr>
   </w:style>
-  <w:style w:type="table" w:styleId="849">
+  <w:style w:type="table" w:styleId="850">
     <w:name w:val="List Table 4"/>
-    <w:basedOn w:val="771"/>
+    <w:basedOn w:val="772"/>
     <w:uiPriority w:val="99"/>
     <w:pPr>
       <w:pBdr/>
@@ -19386,9 +19386,9 @@
       </w:tcPr>
     </w:tblStylePr>
   </w:style>
-  <w:style w:type="table" w:styleId="850">
+  <w:style w:type="table" w:styleId="851">
     <w:name w:val="List Table 4 - Accent 1"/>
-    <w:basedOn w:val="771"/>
+    <w:basedOn w:val="772"/>
     <w:uiPriority w:val="99"/>
     <w:pPr>
       <w:pBdr/>
@@ -19601,9 +19601,9 @@
       </w:tcPr>
     </w:tblStylePr>
   </w:style>
-  <w:style w:type="table" w:styleId="851">
+  <w:style w:type="table" w:styleId="852">
     <w:name w:val="List Table 4 - Accent 2"/>
-    <w:basedOn w:val="771"/>
+    <w:basedOn w:val="772"/>
     <w:uiPriority w:val="99"/>
     <w:pPr>
       <w:pBdr/>
@@ -19816,9 +19816,9 @@
       </w:tcPr>
     </w:tblStylePr>
   </w:style>
-  <w:style w:type="table" w:styleId="852">
+  <w:style w:type="table" w:styleId="853">
     <w:name w:val="List Table 4 - Accent 3"/>
-    <w:basedOn w:val="771"/>
+    <w:basedOn w:val="772"/>
     <w:uiPriority w:val="99"/>
     <w:pPr>
       <w:pBdr/>
@@ -20031,9 +20031,9 @@
       </w:tcPr>
     </w:tblStylePr>
   </w:style>
-  <w:style w:type="table" w:styleId="853">
+  <w:style w:type="table" w:styleId="854">
     <w:name w:val="List Table 4 - Accent 4"/>
-    <w:basedOn w:val="771"/>
+    <w:basedOn w:val="772"/>
     <w:uiPriority w:val="99"/>
     <w:pPr>
       <w:pBdr/>
@@ -20246,9 +20246,9 @@
       </w:tcPr>
     </w:tblStylePr>
   </w:style>
-  <w:style w:type="table" w:styleId="854">
+  <w:style w:type="table" w:styleId="855">
     <w:name w:val="List Table 4 - Accent 5"/>
-    <w:basedOn w:val="771"/>
+    <w:basedOn w:val="772"/>
     <w:uiPriority w:val="99"/>
     <w:pPr>
       <w:pBdr/>
@@ -20461,9 +20461,9 @@
       </w:tcPr>
     </w:tblStylePr>
   </w:style>
-  <w:style w:type="table" w:styleId="855">
+  <w:style w:type="table" w:styleId="856">
     <w:name w:val="List Table 4 - Accent 6"/>
-    <w:basedOn w:val="771"/>
+    <w:basedOn w:val="772"/>
     <w:uiPriority w:val="99"/>
     <w:pPr>
       <w:pBdr/>
@@ -20676,9 +20676,9 @@
       </w:tcPr>
     </w:tblStylePr>
   </w:style>
-  <w:style w:type="table" w:styleId="856">
+  <w:style w:type="table" w:styleId="857">
     <w:name w:val="List Table 5 Dark"/>
-    <w:basedOn w:val="771"/>
+    <w:basedOn w:val="772"/>
     <w:uiPriority w:val="99"/>
     <w:pPr>
       <w:pBdr/>
@@ -20912,9 +20912,9 @@
       </w:tcPr>
     </w:tblStylePr>
   </w:style>
-  <w:style w:type="table" w:styleId="857">
+  <w:style w:type="table" w:styleId="858">
     <w:name w:val="List Table 5 Dark - Accent 1"/>
-    <w:basedOn w:val="771"/>
+    <w:basedOn w:val="772"/>
     <w:uiPriority w:val="99"/>
     <w:pPr>
       <w:pBdr/>
@@ -21148,9 +21148,9 @@
       </w:tcPr>
     </w:tblStylePr>
   </w:style>
-  <w:style w:type="table" w:styleId="858">
+  <w:style w:type="table" w:styleId="859">
     <w:name w:val="List Table 5 Dark - Accent 2"/>
-    <w:basedOn w:val="771"/>
+    <w:basedOn w:val="772"/>
     <w:uiPriority w:val="99"/>
     <w:pPr>
       <w:pBdr/>
@@ -21384,9 +21384,9 @@
       </w:tcPr>
     </w:tblStylePr>
   </w:style>
-  <w:style w:type="table" w:styleId="859">
+  <w:style w:type="table" w:styleId="860">
     <w:name w:val="List Table 5 Dark - Accent 3"/>
-    <w:basedOn w:val="771"/>
+    <w:basedOn w:val="772"/>
     <w:uiPriority w:val="99"/>
     <w:pPr>
       <w:pBdr/>
@@ -21620,9 +21620,9 @@
       </w:tcPr>
     </w:tblStylePr>
   </w:style>
-  <w:style w:type="table" w:styleId="860">
+  <w:style w:type="table" w:styleId="861">
     <w:name w:val="List Table 5 Dark - Accent 4"/>
-    <w:basedOn w:val="771"/>
+    <w:basedOn w:val="772"/>
     <w:uiPriority w:val="99"/>
     <w:pPr>
       <w:pBdr/>
@@ -21856,9 +21856,9 @@
       </w:tcPr>
     </w:tblStylePr>
   </w:style>
-  <w:style w:type="table" w:styleId="861">
+  <w:style w:type="table" w:styleId="862">
     <w:name w:val="List Table 5 Dark - Accent 5"/>
-    <w:basedOn w:val="771"/>
+    <w:basedOn w:val="772"/>
     <w:uiPriority w:val="99"/>
     <w:pPr>
       <w:pBdr/>
@@ -22092,9 +22092,9 @@
       </w:tcPr>
     </w:tblStylePr>
   </w:style>
-  <w:style w:type="table" w:styleId="862">
+  <w:style w:type="table" w:styleId="863">
     <w:name w:val="List Table 5 Dark - Accent 6"/>
-    <w:basedOn w:val="771"/>
+    <w:basedOn w:val="772"/>
     <w:uiPriority w:val="99"/>
     <w:pPr>
       <w:pBdr/>
@@ -22328,9 +22328,9 @@
       </w:tcPr>
     </w:tblStylePr>
   </w:style>
-  <w:style w:type="table" w:styleId="863">
+  <w:style w:type="table" w:styleId="864">
     <w:name w:val="List Table 6 Colorful"/>
-    <w:basedOn w:val="771"/>
+    <w:basedOn w:val="772"/>
     <w:uiPriority w:val="99"/>
     <w:pPr>
       <w:pBdr/>
@@ -22548,9 +22548,9 @@
       </w:tcPr>
     </w:tblStylePr>
   </w:style>
-  <w:style w:type="table" w:styleId="864">
+  <w:style w:type="table" w:styleId="865">
     <w:name w:val="List Table 6 Colorful - Accent 1"/>
-    <w:basedOn w:val="771"/>
+    <w:basedOn w:val="772"/>
     <w:uiPriority w:val="99"/>
     <w:pPr>
       <w:pBdr/>
@@ -22768,9 +22768,9 @@
       </w:tcPr>
     </w:tblStylePr>
   </w:style>
-  <w:style w:type="table" w:styleId="865">
+  <w:style w:type="table" w:styleId="866">
     <w:name w:val="List Table 6 Colorful - Accent 2"/>
-    <w:basedOn w:val="771"/>
+    <w:basedOn w:val="772"/>
     <w:uiPriority w:val="99"/>
     <w:pPr>
       <w:pBdr/>
@@ -22988,9 +22988,9 @@
       </w:tcPr>
     </w:tblStylePr>
   </w:style>
-  <w:style w:type="table" w:styleId="866">
+  <w:style w:type="table" w:styleId="867">
     <w:name w:val="List Table 6 Colorful - Accent 3"/>
-    <w:basedOn w:val="771"/>
+    <w:basedOn w:val="772"/>
     <w:uiPriority w:val="99"/>
     <w:pPr>
       <w:pBdr/>
@@ -23208,9 +23208,9 @@
       </w:tcPr>
     </w:tblStylePr>
   </w:style>
-  <w:style w:type="table" w:styleId="867">
+  <w:style w:type="table" w:styleId="868">
     <w:name w:val="List Table 6 Colorful - Accent 4"/>
-    <w:basedOn w:val="771"/>
+    <w:basedOn w:val="772"/>
     <w:uiPriority w:val="99"/>
     <w:pPr>
       <w:pBdr/>
@@ -23428,9 +23428,9 @@
       </w:tcPr>
     </w:tblStylePr>
   </w:style>
-  <w:style w:type="table" w:styleId="868">
+  <w:style w:type="table" w:styleId="869">
     <w:name w:val="List Table 6 Colorful - Accent 5"/>
-    <w:basedOn w:val="771"/>
+    <w:basedOn w:val="772"/>
     <w:uiPriority w:val="99"/>
     <w:pPr>
       <w:pBdr/>
@@ -23648,9 +23648,9 @@
       </w:tcPr>
     </w:tblStylePr>
   </w:style>
-  <w:style w:type="table" w:styleId="869">
+  <w:style w:type="table" w:styleId="870">
     <w:name w:val="List Table 6 Colorful - Accent 6"/>
-    <w:basedOn w:val="771"/>
+    <w:basedOn w:val="772"/>
     <w:uiPriority w:val="99"/>
     <w:pPr>
       <w:pBdr/>
@@ -23868,9 +23868,9 @@
       </w:tcPr>
     </w:tblStylePr>
   </w:style>
-  <w:style w:type="table" w:styleId="870">
+  <w:style w:type="table" w:styleId="871">
     <w:name w:val="List Table 7 Colorful"/>
-    <w:basedOn w:val="771"/>
+    <w:basedOn w:val="772"/>
     <w:uiPriority w:val="99"/>
     <w:pPr>
       <w:pBdr/>
@@ -24116,9 +24116,9 @@
       </w:tcPr>
     </w:tblStylePr>
   </w:style>
-  <w:style w:type="table" w:styleId="871">
+  <w:style w:type="table" w:styleId="872">
     <w:name w:val="List Table 7 Colorful - Accent 1"/>
-    <w:basedOn w:val="771"/>
+    <w:basedOn w:val="772"/>
     <w:uiPriority w:val="99"/>
     <w:pPr>
       <w:pBdr/>
@@ -24364,9 +24364,9 @@
       </w:tcPr>
     </w:tblStylePr>
   </w:style>
-  <w:style w:type="table" w:styleId="872">
+  <w:style w:type="table" w:styleId="873">
     <w:name w:val="List Table 7 Colorful - Accent 2"/>
-    <w:basedOn w:val="771"/>
+    <w:basedOn w:val="772"/>
     <w:uiPriority w:val="99"/>
     <w:pPr>
       <w:pBdr/>
@@ -24612,9 +24612,9 @@
       </w:tcPr>
     </w:tblStylePr>
   </w:style>
-  <w:style w:type="table" w:styleId="873">
+  <w:style w:type="table" w:styleId="874">
     <w:name w:val="List Table 7 Colorful - Accent 3"/>
-    <w:basedOn w:val="771"/>
+    <w:basedOn w:val="772"/>
     <w:uiPriority w:val="99"/>
     <w:pPr>
       <w:pBdr/>
@@ -24860,9 +24860,9 @@
       </w:tcPr>
     </w:tblStylePr>
   </w:style>
-  <w:style w:type="table" w:styleId="874">
+  <w:style w:type="table" w:styleId="875">
     <w:name w:val="List Table 7 Colorful - Accent 4"/>
-    <w:basedOn w:val="771"/>
+    <w:basedOn w:val="772"/>
     <w:uiPriority w:val="99"/>
     <w:pPr>
       <w:pBdr/>
@@ -25108,9 +25108,9 @@
       </w:tcPr>
     </w:tblStylePr>
   </w:style>
-  <w:style w:type="table" w:styleId="875">
+  <w:style w:type="table" w:styleId="876">
     <w:name w:val="List Table 7 Colorful - Accent 5"/>
-    <w:basedOn w:val="771"/>
+    <w:basedOn w:val="772"/>
     <w:uiPriority w:val="99"/>
     <w:pPr>
       <w:pBdr/>
@@ -25356,9 +25356,9 @@
       </w:tcPr>
     </w:tblStylePr>
   </w:style>
-  <w:style w:type="table" w:styleId="876">
+  <w:style w:type="table" w:styleId="877">
     <w:name w:val="List Table 7 Colorful - Accent 6"/>
-    <w:basedOn w:val="771"/>
+    <w:basedOn w:val="772"/>
     <w:uiPriority w:val="99"/>
     <w:pPr>
       <w:pBdr/>
@@ -25604,9 +25604,9 @@
       </w:tcPr>
     </w:tblStylePr>
   </w:style>
-  <w:style w:type="table" w:styleId="877">
+  <w:style w:type="table" w:styleId="878">
     <w:name w:val="Lined - Accent"/>
-    <w:basedOn w:val="771"/>
+    <w:basedOn w:val="772"/>
     <w:uiPriority w:val="99"/>
     <w:pPr>
       <w:pBdr/>
@@ -25821,9 +25821,9 @@
       </w:tcPr>
     </w:tblStylePr>
   </w:style>
-  <w:style w:type="table" w:styleId="878">
+  <w:style w:type="table" w:styleId="879">
     <w:name w:val="Lined - Accent 1"/>
-    <w:basedOn w:val="771"/>
+    <w:basedOn w:val="772"/>
     <w:uiPriority w:val="99"/>
     <w:pPr>
       <w:pBdr/>
@@ -26038,9 +26038,9 @@
       </w:tcPr>
     </w:tblStylePr>
   </w:style>
-  <w:style w:type="table" w:styleId="879">
+  <w:style w:type="table" w:styleId="880">
     <w:name w:val="Lined - Accent 2"/>
-    <w:basedOn w:val="771"/>
+    <w:basedOn w:val="772"/>
     <w:uiPriority w:val="99"/>
     <w:pPr>
       <w:pBdr/>
@@ -26255,9 +26255,9 @@
       </w:tcPr>
     </w:tblStylePr>
   </w:style>
-  <w:style w:type="table" w:styleId="880">
+  <w:style w:type="table" w:styleId="881">
     <w:name w:val="Lined - Accent 3"/>
-    <w:basedOn w:val="771"/>
+    <w:basedOn w:val="772"/>
     <w:uiPriority w:val="99"/>
     <w:pPr>
       <w:pBdr/>
@@ -26472,9 +26472,9 @@
       </w:tcPr>
     </w:tblStylePr>
   </w:style>
-  <w:style w:type="table" w:styleId="881">
+  <w:style w:type="table" w:styleId="882">
     <w:name w:val="Lined - Accent 4"/>
-    <w:basedOn w:val="771"/>
+    <w:basedOn w:val="772"/>
     <w:uiPriority w:val="99"/>
     <w:pPr>
       <w:pBdr/>
@@ -26689,9 +26689,9 @@
       </w:tcPr>
     </w:tblStylePr>
   </w:style>
-  <w:style w:type="table" w:styleId="882">
+  <w:style w:type="table" w:styleId="883">
     <w:name w:val="Lined - Accent 5"/>
-    <w:basedOn w:val="771"/>
+    <w:basedOn w:val="772"/>
     <w:uiPriority w:val="99"/>
     <w:pPr>
       <w:pBdr/>
@@ -26906,9 +26906,9 @@
       </w:tcPr>
     </w:tblStylePr>
   </w:style>
-  <w:style w:type="table" w:styleId="883">
+  <w:style w:type="table" w:styleId="884">
     <w:name w:val="Lined - Accent 6"/>
-    <w:basedOn w:val="771"/>
+    <w:basedOn w:val="772"/>
     <w:uiPriority w:val="99"/>
     <w:pPr>
       <w:pBdr/>
@@ -27123,9 +27123,9 @@
       </w:tcPr>
     </w:tblStylePr>
   </w:style>
-  <w:style w:type="table" w:styleId="884">
+  <w:style w:type="table" w:styleId="885">
     <w:name w:val="Bordered &amp; Lined - Accent"/>
-    <w:basedOn w:val="771"/>
+    <w:basedOn w:val="772"/>
     <w:uiPriority w:val="99"/>
     <w:pPr>
       <w:pBdr/>
@@ -27347,9 +27347,9 @@
       </w:tcPr>
     </w:tblStylePr>
   </w:style>
-  <w:style w:type="table" w:styleId="885">
+  <w:style w:type="table" w:styleId="886">
     <w:name w:val="Bordered &amp; Lined - Accent 1"/>
-    <w:basedOn w:val="771"/>
+    <w:basedOn w:val="772"/>
     <w:uiPriority w:val="99"/>
     <w:pPr>
       <w:pBdr/>
@@ -27571,9 +27571,9 @@
       </w:tcPr>
     </w:tblStylePr>
   </w:style>
-  <w:style w:type="table" w:styleId="886">
+  <w:style w:type="table" w:styleId="887">
     <w:name w:val="Bordered &amp; Lined - Accent 2"/>
-    <w:basedOn w:val="771"/>
+    <w:basedOn w:val="772"/>
     <w:uiPriority w:val="99"/>
     <w:pPr>
       <w:pBdr/>
@@ -27795,9 +27795,9 @@
       </w:tcPr>
     </w:tblStylePr>
   </w:style>
-  <w:style w:type="table" w:styleId="887">
+  <w:style w:type="table" w:styleId="888">
     <w:name w:val="Bordered &amp; Lined - Accent 3"/>
-    <w:basedOn w:val="771"/>
+    <w:basedOn w:val="772"/>
     <w:uiPriority w:val="99"/>
     <w:pPr>
       <w:pBdr/>
@@ -28019,9 +28019,9 @@
       </w:tcPr>
     </w:tblStylePr>
   </w:style>
-  <w:style w:type="table" w:styleId="888">
+  <w:style w:type="table" w:styleId="889">
     <w:name w:val="Bordered &amp; Lined - Accent 4"/>
-    <w:basedOn w:val="771"/>
+    <w:basedOn w:val="772"/>
     <w:uiPriority w:val="99"/>
     <w:pPr>
       <w:pBdr/>
@@ -28243,9 +28243,9 @@
       </w:tcPr>
     </w:tblStylePr>
   </w:style>
-  <w:style w:type="table" w:styleId="889">
+  <w:style w:type="table" w:styleId="890">
     <w:name w:val="Bordered &amp; Lined - Accent 5"/>
-    <w:basedOn w:val="771"/>
+    <w:basedOn w:val="772"/>
     <w:uiPriority w:val="99"/>
     <w:pPr>
       <w:pBdr/>
@@ -28467,9 +28467,9 @@
       </w:tcPr>
     </w:tblStylePr>
   </w:style>
-  <w:style w:type="table" w:styleId="890">
+  <w:style w:type="table" w:styleId="891">
     <w:name w:val="Bordered &amp; Lined - Accent 6"/>
-    <w:basedOn w:val="771"/>
+    <w:basedOn w:val="772"/>
     <w:uiPriority w:val="99"/>
     <w:pPr>
       <w:pBdr/>
@@ -28691,9 +28691,9 @@
       </w:tcPr>
     </w:tblStylePr>
   </w:style>
-  <w:style w:type="table" w:styleId="891">
+  <w:style w:type="table" w:styleId="892">
     <w:name w:val="Bordered"/>
-    <w:basedOn w:val="771"/>
+    <w:basedOn w:val="772"/>
     <w:uiPriority w:val="99"/>
     <w:pPr>
       <w:pBdr/>
@@ -28911,9 +28911,9 @@
       </w:tcPr>
     </w:tblStylePr>
   </w:style>
-  <w:style w:type="table" w:styleId="892">
+  <w:style w:type="table" w:styleId="893">
     <w:name w:val="Bordered - Accent 1"/>
-    <w:basedOn w:val="771"/>
+    <w:basedOn w:val="772"/>
     <w:uiPriority w:val="99"/>
     <w:pPr>
       <w:pBdr/>
@@ -29131,9 +29131,9 @@
       </w:tcPr>
     </w:tblStylePr>
   </w:style>
-  <w:style w:type="table" w:styleId="893">
+  <w:style w:type="table" w:styleId="894">
     <w:name w:val="Bordered - Accent 2"/>
-    <w:basedOn w:val="771"/>
+    <w:basedOn w:val="772"/>
     <w:uiPriority w:val="99"/>
     <w:pPr>
       <w:pBdr/>
@@ -29351,9 +29351,9 @@
       </w:tcPr>
     </w:tblStylePr>
   </w:style>
-  <w:style w:type="table" w:styleId="894">
+  <w:style w:type="table" w:styleId="895">
     <w:name w:val="Bordered - Accent 3"/>
-    <w:basedOn w:val="771"/>
+    <w:basedOn w:val="772"/>
     <w:uiPriority w:val="99"/>
     <w:pPr>
       <w:pBdr/>
@@ -29571,9 +29571,9 @@
       </w:tcPr>
     </w:tblStylePr>
   </w:style>
-  <w:style w:type="table" w:styleId="895">
+  <w:style w:type="table" w:styleId="896">
     <w:name w:val="Bordered - Accent 4"/>
-    <w:basedOn w:val="771"/>
+    <w:basedOn w:val="772"/>
     <w:uiPriority w:val="99"/>
     <w:pPr>
       <w:pBdr/>
@@ -29791,9 +29791,9 @@
       </w:tcPr>
     </w:tblStylePr>
   </w:style>
-  <w:style w:type="table" w:styleId="896">
+  <w:style w:type="table" w:styleId="897">
     <w:name w:val="Bordered - Accent 5"/>
-    <w:basedOn w:val="771"/>
+    <w:basedOn w:val="772"/>
     <w:uiPriority w:val="99"/>
     <w:pPr>
       <w:pBdr/>
@@ -30011,9 +30011,9 @@
       </w:tcPr>
     </w:tblStylePr>
   </w:style>
-  <w:style w:type="table" w:styleId="897">
+  <w:style w:type="table" w:styleId="898">
     <w:name w:val="Bordered - Accent 6"/>
-    <w:basedOn w:val="771"/>
+    <w:basedOn w:val="772"/>
     <w:uiPriority w:val="99"/>
     <w:pPr>
       <w:pBdr/>

</xml_diff>

<commit_message>
refactor: improve SD card logging reliability and remove unused battery logger
</commit_message>
<xml_diff>
--- a/Misc documents  and software/thanks for buying Zen rob.docx
+++ b/Misc documents  and software/thanks for buying Zen rob.docx
@@ -384,7 +384,7 @@
           <w:szCs w:val="15"/>
           <w:lang w:val="ja-JP"/>
         </w:rPr>
-        <w:t xml:space="preserve">8</w:t>
+        <w:t xml:space="preserve">9</w:t>
       </w:r>
       <w:r>
         <w:rPr>
@@ -405,7 +405,7 @@
           <w:szCs w:val="15"/>
           <w:lang w:val="ja-JP"/>
         </w:rPr>
-        <w:t xml:space="preserve">28</w:t>
+        <w:t xml:space="preserve">29</w:t>
       </w:r>
       <w:r>
         <w:rPr>

</xml_diff>

<commit_message>
fix: update device information in SAFEZEN_333.txt
</commit_message>
<xml_diff>
--- a/Misc documents  and software/thanks for buying Zen rob.docx
+++ b/Misc documents  and software/thanks for buying Zen rob.docx
@@ -111,12 +111,6 @@
           <w:szCs w:val="14"/>
         </w:rPr>
       </w:r>
-      <w:r>
-        <w:rPr>
-          <w:sz w:val="14"/>
-          <w:szCs w:val="14"/>
-        </w:rPr>
-      </w:r>
     </w:p>
     <w:p>
       <w:pPr>
@@ -174,91 +168,9 @@
       </w:r>
       <w:r>
         <w:rPr>
-          <w:rFonts w:ascii="Noto Sans" w:hAnsi="Noto Sans" w:eastAsia="Noto Sans" w:cs="Noto Sans"/>
+          <w:rFonts w:ascii="Noto Sans" w:hAnsi="Noto Sans" w:cs="Noto Sans"/>
           <w:b/>
           <w:bCs/>
-          <w:sz w:val="14"/>
-          <w:szCs w:val="14"/>
-        </w:rPr>
-      </w:r>
-      <w:r>
-        <w:rPr>
-          <w:rFonts w:ascii="Noto Sans" w:hAnsi="Noto Sans" w:eastAsia="Noto Sans" w:cs="Noto Sans"/>
-          <w:b/>
-          <w:bCs/>
-          <w:sz w:val="14"/>
-          <w:szCs w:val="14"/>
-        </w:rPr>
-      </w:r>
-    </w:p>
-    <w:p>
-      <w:pPr>
-        <w:pStyle w:val="711"/>
-        <w:pBdr/>
-        <w:bidi w:val="false"/>
-        <w:spacing/>
-        <w:ind/>
-        <w:jc w:val="left"/>
-        <w:rPr>
-          <w:rFonts w:ascii="Noto Sans" w:hAnsi="Noto Sans" w:eastAsia="Noto Sans" w:cs="Noto Sans"/>
-          <w:b w:val="0"/>
-          <w:bCs w:val="0"/>
-          <w:sz w:val="14"/>
-          <w:szCs w:val="14"/>
-          <w:highlight w:val="none"/>
-        </w:rPr>
-      </w:pPr>
-      <w:r>
-        <w:rPr>
-          <w:rFonts w:ascii="Noto Sans" w:hAnsi="Noto Sans" w:eastAsia="Noto Sans" w:cs="Noto Sans"/>
-          <w:b/>
-          <w:bCs/>
-          <w:sz w:val="14"/>
-          <w:szCs w:val="14"/>
-        </w:rPr>
-        <w:t xml:space="preserve">bGeigieZen from Safecast.</w:t>
-      </w:r>
-      <w:r>
-        <w:rPr>
-          <w:rFonts w:ascii="Noto Sans" w:hAnsi="Noto Sans" w:eastAsia="Noto Sans" w:cs="Noto Sans"/>
-          <w:b/>
-          <w:bCs/>
-          <w:sz w:val="14"/>
-          <w:szCs w:val="14"/>
-        </w:rPr>
-      </w:r>
-      <w:r>
-        <w:rPr>
-          <w:rFonts w:ascii="Noto Sans" w:hAnsi="Noto Sans" w:eastAsia="Noto Sans" w:cs="Noto Sans"/>
-          <w:b/>
-          <w:bCs/>
-          <w:sz w:val="14"/>
-          <w:szCs w:val="14"/>
-        </w:rPr>
-      </w:r>
-      <w:r>
-        <w:rPr>
-          <w:rFonts w:ascii="Noto Sans" w:hAnsi="Noto Sans" w:eastAsia="Noto Sans" w:cs="Noto Sans"/>
-          <w:b w:val="0"/>
-          <w:bCs w:val="0"/>
-          <w:sz w:val="14"/>
-          <w:szCs w:val="14"/>
-        </w:rPr>
-      </w:r>
-      <w:r>
-        <w:rPr>
-          <w:rFonts w:ascii="Noto Sans" w:hAnsi="Noto Sans" w:eastAsia="Noto Sans" w:cs="Noto Sans"/>
-          <w:b w:val="0"/>
-          <w:bCs w:val="0"/>
-          <w:sz w:val="14"/>
-          <w:szCs w:val="14"/>
-        </w:rPr>
-      </w:r>
-      <w:r>
-        <w:rPr>
-          <w:rFonts w:ascii="Noto Sans" w:hAnsi="Noto Sans" w:eastAsia="Noto Sans" w:cs="Noto Sans"/>
-          <w:b w:val="0"/>
-          <w:bCs w:val="0"/>
           <w:sz w:val="14"/>
           <w:szCs w:val="14"/>
         </w:rPr>
@@ -282,15 +194,6 @@
         <w:ind/>
         <w:jc w:val="left"/>
         <w:rPr>
-          <w:rFonts w:ascii="Noto Sans" w:hAnsi="Noto Sans" w:cs="Noto Sans"/>
-          <w:b/>
-          <w:bCs/>
-          <w:sz w:val="14"/>
-          <w:szCs w:val="14"/>
-        </w:rPr>
-      </w:pPr>
-      <w:r>
-        <w:rPr>
           <w:rFonts w:ascii="Noto Sans" w:hAnsi="Noto Sans" w:eastAsia="Noto Sans" w:cs="Noto Sans"/>
           <w:b w:val="0"/>
           <w:bCs w:val="0"/>
@@ -298,6 +201,16 @@
           <w:szCs w:val="14"/>
           <w:highlight w:val="none"/>
         </w:rPr>
+      </w:pPr>
+      <w:r>
+        <w:rPr>
+          <w:rFonts w:ascii="Noto Sans" w:hAnsi="Noto Sans" w:eastAsia="Noto Sans" w:cs="Noto Sans"/>
+          <w:b/>
+          <w:bCs/>
+          <w:sz w:val="14"/>
+          <w:szCs w:val="14"/>
+        </w:rPr>
+        <w:t xml:space="preserve">bGeigieZen from Safecast.</w:t>
       </w:r>
       <w:r>
         <w:rPr>
@@ -330,6 +243,51 @@
         <w:jc w:val="left"/>
         <w:rPr>
           <w:rFonts w:ascii="Noto Sans" w:hAnsi="Noto Sans" w:cs="Noto Sans"/>
+          <w:b/>
+          <w:bCs/>
+          <w:sz w:val="14"/>
+          <w:szCs w:val="14"/>
+        </w:rPr>
+      </w:pPr>
+      <w:r>
+        <w:rPr>
+          <w:rFonts w:ascii="Noto Sans" w:hAnsi="Noto Sans" w:eastAsia="Noto Sans" w:cs="Noto Sans"/>
+          <w:b w:val="0"/>
+          <w:bCs w:val="0"/>
+          <w:sz w:val="14"/>
+          <w:szCs w:val="14"/>
+          <w:highlight w:val="none"/>
+        </w:rPr>
+      </w:r>
+      <w:r>
+        <w:rPr>
+          <w:rFonts w:ascii="Noto Sans" w:hAnsi="Noto Sans" w:cs="Noto Sans"/>
+          <w:b/>
+          <w:bCs/>
+          <w:sz w:val="14"/>
+          <w:szCs w:val="14"/>
+        </w:rPr>
+      </w:r>
+      <w:r>
+        <w:rPr>
+          <w:rFonts w:ascii="Noto Sans" w:hAnsi="Noto Sans" w:cs="Noto Sans"/>
+          <w:b/>
+          <w:bCs/>
+          <w:sz w:val="14"/>
+          <w:szCs w:val="14"/>
+        </w:rPr>
+      </w:r>
+    </w:p>
+    <w:p>
+      <w:pPr>
+        <w:pStyle w:val="711"/>
+        <w:pBdr/>
+        <w:bidi w:val="false"/>
+        <w:spacing/>
+        <w:ind/>
+        <w:jc w:val="left"/>
+        <w:rPr>
+          <w:rFonts w:ascii="Noto Sans" w:hAnsi="Noto Sans" w:cs="Noto Sans"/>
           <w:b w:val="0"/>
           <w:bCs w:val="0"/>
           <w:sz w:val="14"/>
@@ -348,7 +306,7 @@
       </w:r>
       <w:r>
         <w:rPr>
-          <w:rFonts w:ascii="Noto Sans" w:hAnsi="Noto Sans" w:eastAsia="Noto Sans" w:cs="Noto Sans"/>
+          <w:rFonts w:ascii="Noto Sans" w:hAnsi="Noto Sans" w:cs="Noto Sans"/>
           <w:b w:val="0"/>
           <w:bCs w:val="0"/>
           <w:sz w:val="14"/>
@@ -357,7 +315,7 @@
       </w:r>
       <w:r>
         <w:rPr>
-          <w:rFonts w:ascii="Noto Sans" w:hAnsi="Noto Sans" w:eastAsia="Noto Sans" w:cs="Noto Sans"/>
+          <w:rFonts w:ascii="Noto Sans" w:hAnsi="Noto Sans" w:cs="Noto Sans"/>
           <w:b w:val="0"/>
           <w:bCs w:val="0"/>
           <w:sz w:val="14"/>
@@ -394,7 +352,7 @@
       </w:r>
       <w:r>
         <w:rPr>
-          <w:rFonts w:ascii="Noto Sans" w:hAnsi="Noto Sans" w:eastAsia="Noto Sans" w:cs="Noto Sans"/>
+          <w:rFonts w:ascii="Noto Sans" w:hAnsi="Noto Sans" w:cs="Noto Sans"/>
           <w:b w:val="0"/>
           <w:bCs w:val="0"/>
           <w:sz w:val="14"/>
@@ -403,7 +361,7 @@
       </w:r>
       <w:r>
         <w:rPr>
-          <w:rFonts w:ascii="Noto Sans" w:hAnsi="Noto Sans" w:eastAsia="Noto Sans" w:cs="Noto Sans"/>
+          <w:rFonts w:ascii="Noto Sans" w:hAnsi="Noto Sans" w:cs="Noto Sans"/>
           <w:b w:val="0"/>
           <w:bCs w:val="0"/>
           <w:sz w:val="14"/>
@@ -436,7 +394,7 @@
           <w:sz w:val="14"/>
           <w:szCs w:val="14"/>
         </w:rPr>
-        <w:t xml:space="preserve">Date   :2025-</w:t>
+        <w:t xml:space="preserve">Date   :202</w:t>
       </w:r>
       <w:r>
         <w:rPr>
@@ -447,7 +405,7 @@
           <w:szCs w:val="14"/>
           <w:lang w:val="ja-JP"/>
         </w:rPr>
-        <w:t xml:space="preserve">11</w:t>
+        <w:t xml:space="preserve">6</w:t>
       </w:r>
       <w:r>
         <w:rPr>
@@ -468,11 +426,32 @@
           <w:szCs w:val="14"/>
           <w:lang w:val="ja-JP"/>
         </w:rPr>
-        <w:t xml:space="preserve">30</w:t>
+        <w:t xml:space="preserve">01</w:t>
       </w:r>
       <w:r>
         <w:rPr>
           <w:rFonts w:ascii="Noto Sans" w:hAnsi="Noto Sans" w:eastAsia="Noto Sans" w:cs="Noto Sans"/>
+          <w:b w:val="0"/>
+          <w:bCs w:val="0"/>
+          <w:sz w:val="14"/>
+          <w:szCs w:val="14"/>
+        </w:rPr>
+        <w:t xml:space="preserve">-</w:t>
+      </w:r>
+      <w:r>
+        <w:rPr>
+          <w:rFonts w:ascii="Noto Sans" w:hAnsi="Noto Sans" w:cs="Noto Sans"/>
+          <w:b w:val="0"/>
+          <w:bCs w:val="0"/>
+          <w:sz w:val="14"/>
+          <w:szCs w:val="14"/>
+          <w:lang w:val="ja-JP"/>
+        </w:rPr>
+        <w:t xml:space="preserve">19</w:t>
+      </w:r>
+      <w:r>
+        <w:rPr>
+          <w:rFonts w:ascii="Noto Sans" w:hAnsi="Noto Sans" w:cs="Noto Sans"/>
           <w:b w:val="0"/>
           <w:bCs w:val="0"/>
           <w:sz w:val="14"/>

</xml_diff>

<commit_message>
feat: implement modular settings screens and update V4.2.x PCB hardware files
Entire-Checkpoint: cacbc7b16f53
</commit_message>
<xml_diff>
--- a/Misc documents  and software/thanks for buying Zen rob.docx
+++ b/Misc documents  and software/thanks for buying Zen rob.docx
@@ -330,7 +330,7 @@
         <w:pBdr/>
         <w:bidi w:val="false"/>
         <w:spacing w:after="0" w:before="0"/>
-        <w:ind w:right="0" w:firstLine="0" w:left="198"/>
+        <w:ind w:right="0" w:firstLine="0" w:left="0"/>
         <w:jc w:val="left"/>
         <w:rPr>
           <w:rFonts w:ascii="Noto Sans" w:hAnsi="Noto Sans" w:cs="Noto Sans"/>
@@ -376,7 +376,7 @@
         <w:pBdr/>
         <w:bidi w:val="false"/>
         <w:spacing w:after="0" w:before="0"/>
-        <w:ind w:right="0" w:firstLine="0" w:left="198"/>
+        <w:ind w:right="0" w:firstLine="0" w:left="0"/>
         <w:jc w:val="left"/>
         <w:rPr>
           <w:rFonts w:ascii="Noto Sans" w:hAnsi="Noto Sans" w:cs="Noto Sans"/>
@@ -426,7 +426,18 @@
           <w:szCs w:val="14"/>
           <w:lang w:val="ja-JP"/>
         </w:rPr>
-        <w:t xml:space="preserve">01</w:t>
+        <w:t xml:space="preserve">0</w:t>
+      </w:r>
+      <w:r>
+        <w:rPr>
+          <w:rFonts w:ascii="Noto Sans" w:hAnsi="Noto Sans" w:eastAsia="Noto Sans" w:cs="Noto Sans"/>
+          <w:b w:val="0"/>
+          <w:bCs w:val="0"/>
+          <w:sz w:val="14"/>
+          <w:szCs w:val="14"/>
+          <w:lang w:val="ja-JP"/>
+        </w:rPr>
+        <w:t xml:space="preserve">4</w:t>
       </w:r>
       <w:r>
         <w:rPr>
@@ -447,7 +458,7 @@
           <w:szCs w:val="14"/>
           <w:lang w:val="ja-JP"/>
         </w:rPr>
-        <w:t xml:space="preserve">19</w:t>
+        <w:t xml:space="preserve">30</w:t>
       </w:r>
       <w:r>
         <w:rPr>

</xml_diff>

<commit_message>
chore: update thanks for buying Zen document
Co-Authored-By: Claude Sonnet 5 <noreply@anthropic.com>
Entire-Checkpoint: a38044213073
</commit_message>
<xml_diff>
--- a/Misc documents  and software/thanks for buying Zen rob.docx
+++ b/Misc documents  and software/thanks for buying Zen rob.docx
@@ -437,7 +437,7 @@
           <w:szCs w:val="14"/>
           <w:lang w:val="ja-JP"/>
         </w:rPr>
-        <w:t xml:space="preserve">4</w:t>
+        <w:t xml:space="preserve">6</w:t>
       </w:r>
       <w:r>
         <w:rPr>
@@ -458,7 +458,16 @@
           <w:szCs w:val="14"/>
           <w:lang w:val="ja-JP"/>
         </w:rPr>
-        <w:t xml:space="preserve">30</w:t>
+        <w:t xml:space="preserve">29</w:t>
+      </w:r>
+      <w:r>
+        <w:rPr>
+          <w:rFonts w:ascii="Noto Sans" w:hAnsi="Noto Sans" w:cs="Noto Sans"/>
+          <w:b w:val="0"/>
+          <w:bCs w:val="0"/>
+          <w:sz w:val="14"/>
+          <w:szCs w:val="14"/>
+        </w:rPr>
       </w:r>
       <w:r>
         <w:rPr>

</xml_diff>